<commit_message>
Refactor: Eliminación integral del concepto cuántico, corrección SEO y reporte de auditoría
</commit_message>
<xml_diff>
--- a/Auditoria_Codigo_Completo.docx
+++ b/Auditoria_Codigo_Completo.docx
@@ -589,14 +589,9 @@
         <w:t xml:space="preserve">    const intervalId = window.setInterval(sendHeartbeat, 5 * 60 * 1000); // 5 minutos</w:t>
         <w:br/>
         <w:br/>
-        <w:t xml:space="preserve">    document.addEventListener("visibilitychange", sendHeartbeat);</w:t>
-        <w:br/>
-        <w:br/>
         <w:t xml:space="preserve">    return () =&gt; {</w:t>
         <w:br/>
         <w:t xml:space="preserve">      window.clearInterval(intervalId);</w:t>
-        <w:br/>
-        <w:t xml:space="preserve">      document.removeEventListener("visibilitychange", sendHeartbeat);</w:t>
         <w:br/>
         <w:t xml:space="preserve">    };</w:t>
         <w:br/>
@@ -1870,7 +1865,7 @@
         <w:br/>
         <w:t xml:space="preserve">            &lt;NavLink </w:t>
         <w:br/>
-        <w:t xml:space="preserve">              to="/modulo/fundamentos"</w:t>
+        <w:t xml:space="preserve">              to="/modulo/modulo1"</w:t>
         <w:br/>
         <w:t xml:space="preserve">              className={({ isActive }) =&gt; isActive ? "active" : ""}</w:t>
         <w:br/>
@@ -9056,10 +9051,12 @@
         <w:br/>
         <w:t>import { generarDiagnosticoAlumno } from '../services/ai';</w:t>
         <w:br/>
+        <w:t>import DOMPurify from 'dompurify';</w:t>
+        <w:br/>
         <w:br/>
         <w:t>export default function AdminDashboard() {</w:t>
         <w:br/>
-        <w:t xml:space="preserve">  const { user } = useAuth();</w:t>
+        <w:t xml:space="preserve">  const { user, isAdmin } = useAuth();</w:t>
         <w:br/>
         <w:t xml:space="preserve">  const [users, setUsers] = useState([]);</w:t>
         <w:br/>
@@ -9105,11 +9102,7 @@
         <w:t xml:space="preserve">  };</w:t>
         <w:br/>
         <w:br/>
-        <w:t xml:space="preserve">  // Hardcoded check using Env Var or direct fallback</w:t>
-        <w:br/>
-        <w:t xml:space="preserve">  const adminEmail = import.meta.env.VITE_ADMIN_EMAIL || 'jose.sanchez@crearpsl.net';</w:t>
-        <w:br/>
-        <w:t xml:space="preserve">  const isAdmin = user &amp;&amp; user.email === adminEmail;</w:t>
+        <w:t xml:space="preserve">  // isAdmin ya viene de AuthContext, que valida por Custom Claim y un fallback configurado</w:t>
         <w:br/>
         <w:br/>
         <w:t xml:space="preserve">  useEffect(() =&gt; {</w:t>
@@ -9443,7 +9436,7 @@
         <w:br/>
         <w:t xml:space="preserve">                  style={{ color: 'var(--text-main)', fontSize: '1rem', lineHeight: '1.6', whiteSpace: 'pre-wrap' }}</w:t>
         <w:br/>
-        <w:t xml:space="preserve">                  dangerouslySetInnerHTML={{ __html: aiReport.replace(/\*\*(.*?)\*\*/g, '&lt;strong style="color: var(--crear-gold);"&gt;$1&lt;/strong&gt;') }}</w:t>
+        <w:t xml:space="preserve">                  dangerouslySetInnerHTML={{ __html: DOMPurify.sanitize(aiReport.replace(/\*\*(.*?)\*\*/g, '&lt;strong style="color: var(--crear-gold);"&gt;$1&lt;/strong&gt;')) }}</w:t>
         <w:br/>
         <w:t xml:space="preserve">                /&gt;</w:t>
         <w:br/>
@@ -10137,7 +10130,7 @@
         <w:br/>
         <w:t xml:space="preserve">            &lt;h3 className="text-gold uppercase" style={{fontSize: '0.9rem', marginBottom: '1rem'}}&gt;Última Actividad&lt;/h3&gt;</w:t>
         <w:br/>
-        <w:t xml:space="preserve">            &lt;h4 style={{fontSize: '1.5rem', margin: '0 0 0.5rem 0'}}&gt;{progress?.lastVisitedModule === '/modulo/fundamentos' ? 'Fundamentos Teóricos' : </w:t>
+        <w:t xml:space="preserve">            &lt;h4 style={{fontSize: '1.5rem', margin: '0 0 0.5rem 0'}}&gt;{progress?.lastVisitedModule === '/modulo/modulo1' ? 'Fundamentos Teóricos' : </w:t>
         <w:br/>
         <w:t xml:space="preserve">                 progress?.lastVisitedModule?.includes('evaluacion') ? 'Evaluación Completada' : </w:t>
         <w:br/>
@@ -10171,7 +10164,7 @@
         <w:br/>
         <w:t xml:space="preserve">              } else {</w:t>
         <w:br/>
-        <w:t xml:space="preserve">                navigate(route &amp;&amp; route !== '/dashboard' ? route : '/modulo/fundamentos');</w:t>
+        <w:t xml:space="preserve">                navigate(route &amp;&amp; route !== '/dashboard' ? route : '/modulo/modulo1');</w:t>
         <w:br/>
         <w:t xml:space="preserve">              }</w:t>
         <w:br/>
@@ -10559,6 +10552,10 @@
         <w:br/>
         <w:t>import DOMPurify from 'dompurify';</w:t>
         <w:br/>
+        <w:t>import { curriculum } from '../data/curriculum';</w:t>
+        <w:br/>
+        <w:t>import { getUserProgress } from '../services/db';</w:t>
+        <w:br/>
         <w:br/>
         <w:t>export default function EvaluacionContainer() {</w:t>
         <w:br/>
@@ -10592,9 +10589,39 @@
         <w:br/>
         <w:t xml:space="preserve">      updateLastVisited(user.uid, `/evaluacion/${id}`);</w:t>
         <w:br/>
+        <w:t xml:space="preserve">      </w:t>
+        <w:br/>
+        <w:t xml:space="preserve">      getUserProgress(user.uid).then(progress =&gt; {</w:t>
+        <w:br/>
+        <w:t xml:space="preserve">        const prog = progress || {};</w:t>
+        <w:br/>
+        <w:t xml:space="preserve">        const moduleIndex = curriculum.findIndex(m =&gt; m.id === id);</w:t>
+        <w:br/>
+        <w:t xml:space="preserve">        if (moduleIndex &gt; 0) {</w:t>
+        <w:br/>
+        <w:t xml:space="preserve">          const prevMod = curriculum[moduleIndex - 1];</w:t>
+        <w:br/>
+        <w:t xml:space="preserve">          const isPrevCompleted = prevMod.tieneEvaluacion </w:t>
+        <w:br/>
+        <w:t xml:space="preserve">            ? prog.evaluationsPassed?.includes(prevMod.id)</w:t>
+        <w:br/>
+        <w:t xml:space="preserve">            : prevMod.lecciones?.every(l =&gt; prog.completedLessons?.includes(l.id));</w:t>
+        <w:br/>
+        <w:t xml:space="preserve">            </w:t>
+        <w:br/>
+        <w:t xml:space="preserve">          if (!isPrevCompleted) {</w:t>
+        <w:br/>
+        <w:t xml:space="preserve">            navigate('/ruta');</w:t>
+        <w:br/>
+        <w:t xml:space="preserve">          }</w:t>
+        <w:br/>
+        <w:t xml:space="preserve">        }</w:t>
+        <w:br/>
+        <w:t xml:space="preserve">      });</w:t>
+        <w:br/>
         <w:t xml:space="preserve">    }</w:t>
         <w:br/>
-        <w:t xml:space="preserve">  }, [user, id]);</w:t>
+        <w:t xml:space="preserve">  }, [user, id, navigate]);</w:t>
         <w:br/>
         <w:br/>
         <w:t xml:space="preserve">  if (!evalData) {</w:t>
@@ -11330,8 +11357,6 @@
         <w:br/>
         <w:t xml:space="preserve">              setPhase('Inhala');</w:t>
         <w:br/>
-        <w:t xml:space="preserve">              setCycle(c =&gt; c + 1);</w:t>
-        <w:br/>
         <w:t xml:space="preserve">              return 4;</w:t>
         <w:br/>
         <w:t xml:space="preserve">            }</w:t>
@@ -11351,8 +11376,6 @@
         <w:t xml:space="preserve">      setPhase('Inhala');</w:t>
         <w:br/>
         <w:t xml:space="preserve">      setTimeLeft(4);</w:t>
-        <w:br/>
-        <w:t xml:space="preserve">      setCycle(0);</w:t>
         <w:br/>
         <w:t xml:space="preserve">    }</w:t>
         <w:br/>
@@ -12053,6 +12076,8 @@
         <w:br/>
         <w:t xml:space="preserve">  useEffect(() =&gt; {</w:t>
         <w:br/>
+        <w:t xml:space="preserve">    setCurrentLessonIndex(0);</w:t>
+        <w:br/>
         <w:t xml:space="preserve">    if (user) {</w:t>
         <w:br/>
         <w:t xml:space="preserve">      updateLastVisited(user.uid, `/modulo/${id}`);</w:t>
@@ -12135,9 +12160,19 @@
         <w:br/>
         <w:t xml:space="preserve">    } else {</w:t>
         <w:br/>
-        <w:t xml:space="preserve">      // Modulo terminado, ir a evaluación</w:t>
-        <w:br/>
-        <w:t xml:space="preserve">      navigate(`/evaluacion/${id}`);</w:t>
+        <w:t xml:space="preserve">      // Modulo terminado, ir a evaluación o ruta</w:t>
+        <w:br/>
+        <w:t xml:space="preserve">      const currentModInfo = curriculum.find(m =&gt; m.id === id);</w:t>
+        <w:br/>
+        <w:t xml:space="preserve">      if (currentModInfo &amp;&amp; !currentModInfo.tieneEvaluacion) {</w:t>
+        <w:br/>
+        <w:t xml:space="preserve">        navigate('/ruta');</w:t>
+        <w:br/>
+        <w:t xml:space="preserve">      } else {</w:t>
+        <w:br/>
+        <w:t xml:space="preserve">        navigate(`/evaluacion/${id}`);</w:t>
+        <w:br/>
+        <w:t xml:space="preserve">      }</w:t>
         <w:br/>
         <w:t xml:space="preserve">    }</w:t>
         <w:br/>
@@ -13572,7 +13607,7 @@
         <w:br/>
         <w:t xml:space="preserve">        globalPercentage: 0,</w:t>
         <w:br/>
-        <w:t xml:space="preserve">        lastVisitedModule: '/modulo/fundamentos',</w:t>
+        <w:t xml:space="preserve">        lastVisitedModule: '/modulo/modulo1',</w:t>
         <w:br/>
         <w:t xml:space="preserve">        completedModules: [],</w:t>
         <w:br/>

</xml_diff>

<commit_message>
docs: Actualizar Auditoria_Codigo_Completo.docx con el código refactorizado libre de terminología cuántica
</commit_message>
<xml_diff>
--- a/Auditoria_Codigo_Completo.docx
+++ b/Auditoria_Codigo_Completo.docx
@@ -1064,14 +1064,48 @@
         <w:br/>
         <w:t xml:space="preserve">  transition: all 0.2s ease;</w:t>
         <w:br/>
+        <w:t xml:space="preserve">} </w:t>
+        <w:br/>
+        <w:t xml:space="preserve">  </w:t>
+        <w:br/>
+        <w:t>.btn-secondary:hover {</w:t>
+        <w:br/>
+        <w:t xml:space="preserve">  background: rgba(255, 255, 255, 0.05);</w:t>
+        <w:br/>
+        <w:t xml:space="preserve">  border-color: rgba(255, 255, 255, 0.4);</w:t>
+        <w:br/>
         <w:t>}</w:t>
         <w:br/>
         <w:br/>
-        <w:t>.btn-secondary:hover {</w:t>
-        <w:br/>
-        <w:t xml:space="preserve">  background: rgba(255, 255, 255, 0.05);</w:t>
-        <w:br/>
-        <w:t xml:space="preserve">  border-color: rgba(255, 255, 255, 0.4);</w:t>
+        <w:t>/* High-contrast logout button */</w:t>
+        <w:br/>
+        <w:t>.btn-logout {</w:t>
+        <w:br/>
+        <w:t xml:space="preserve">  background: var(--crear-gold);</w:t>
+        <w:br/>
+        <w:t xml:space="preserve">  color: #000000;</w:t>
+        <w:br/>
+        <w:t xml:space="preserve">  border: none;</w:t>
+        <w:br/>
+        <w:t xml:space="preserve">  border-radius: var(--radius-xl);</w:t>
+        <w:br/>
+        <w:t xml:space="preserve">  padding: 12px 28px;</w:t>
+        <w:br/>
+        <w:t xml:space="preserve">  font-family: var(--font-heading);</w:t>
+        <w:br/>
+        <w:t xml:space="preserve">  font-weight: 600;</w:t>
+        <w:br/>
+        <w:t xml:space="preserve">  font-size: 1rem;</w:t>
+        <w:br/>
+        <w:t xml:space="preserve">  cursor: pointer;</w:t>
+        <w:br/>
+        <w:t xml:space="preserve">  transition: background 0.2s ease;</w:t>
+        <w:br/>
+        <w:t>}</w:t>
+        <w:br/>
+        <w:t>.btn-logout:hover {</w:t>
+        <w:br/>
+        <w:t xml:space="preserve">  background: var(--crear-gold-hover);</w:t>
         <w:br/>
         <w:t>}</w:t>
         <w:br/>
@@ -2929,7 +2963,7 @@
         <w:br/>
         <w:t xml:space="preserve">    titulo: 'Módulo 1: Fundamentos Teóricos',</w:t>
         <w:br/>
-        <w:t xml:space="preserve">    descripcion: 'Bases conceptuales del Coaching de Alto Rendimiento y Transformación Cuántica.',</w:t>
+        <w:t xml:space="preserve">    descripcion: 'Bases conceptuales del Coaching de Alto Rendimiento y Transformación Profunda.',</w:t>
         <w:br/>
         <w:t xml:space="preserve">    estado: 'disponible',</w:t>
         <w:br/>
@@ -3035,9 +3069,9 @@
         <w:br/>
         <w:t xml:space="preserve">    id: 'modulo7',</w:t>
         <w:br/>
-        <w:t xml:space="preserve">    titulo: 'Módulo 7: Liderazgo de Transformación Cuántica',</w:t>
-        <w:br/>
-        <w:t xml:space="preserve">    descripcion: 'Salto cuántico del líder, quiebres ontológicos y el mapa de enrolamiento.',</w:t>
+        <w:t xml:space="preserve">    titulo: 'Módulo 7: Liderazgo de Transformación Profunda',</w:t>
+        <w:br/>
+        <w:t xml:space="preserve">    descripcion: 'Salto de posibilidad del líder, quiebres ontológicos y el mapa de enrolamiento.',</w:t>
         <w:br/>
         <w:t xml:space="preserve">    estado: 'disponible',</w:t>
         <w:br/>
@@ -3055,7 +3089,7 @@
         <w:br/>
         <w:t xml:space="preserve">    titulo: 'Módulo 8: Integración y Legado Existencial',</w:t>
         <w:br/>
-        <w:t xml:space="preserve">    descripcion: 'El Manifiesto del Líder Cuántico-Existencial y el Plan de Expansión.',</w:t>
+        <w:t xml:space="preserve">    descripcion: 'El Manifiesto del Líder de Alto Rendimiento y el Plan de Expansión.',</w:t>
         <w:br/>
         <w:t xml:space="preserve">    estado: 'disponible',</w:t>
         <w:br/>
@@ -4347,7 +4381,7 @@
         <w:br/>
         <w:t xml:space="preserve">    id: 10,</w:t>
         <w:br/>
-        <w:t xml:space="preserve">    nombre: "Salto Cuántico",</w:t>
+        <w:t xml:space="preserve">    nombre: "Salto de Posibilidad",</w:t>
         <w:br/>
         <w:t xml:space="preserve">    escenario: "Atrapados en pensamiento lineal ('paso a paso'), sin permiso para lo imposible.",</w:t>
         <w:br/>
@@ -4361,7 +4395,7 @@
         <w:br/>
         <w:t xml:space="preserve">      "Anclaje: 'Dobla ligeramente las rodillas. Siente la energía en tus piernas. No saltes todavía. Solo siente la posibilidad.'",</w:t>
         <w:br/>
-        <w:t xml:space="preserve">      "Expansión: 'Imagina que estás a punto de dar un salto cuántico: no un paso pequeño, un SALTO. De quien eres a quien puedes ser.'",</w:t>
+        <w:t xml:space="preserve">      "Expansión: 'Imagina que estás a punto de dar un salto de posibilidad: no un paso pequeño, un SALTO. De quien eres a quien puedes ser.'",</w:t>
         <w:br/>
         <w:t xml:space="preserve">      "Declaración: '¿Qué salto estás evitando dar? ¿Qué te espera al otro lado?'",</w:t>
         <w:br/>
@@ -4844,7 +4878,7 @@
         <w:br/>
         <w:t xml:space="preserve">        fase: "1. Interrupción",</w:t>
         <w:br/>
-        <w:t xml:space="preserve">        herramienta: "Grounding: 'Salto Cuántico'",</w:t>
+        <w:t xml:space="preserve">        herramienta: "Grounding: 'Salto de Posibilidad'",</w:t>
         <w:br/>
         <w:t xml:space="preserve">        instrucciones: "3 minutos. Párate, prepara el salto, siente la posibilidad."</w:t>
         <w:br/>
@@ -5187,7 +5221,7 @@
         <w:br/>
         <w:t xml:space="preserve">      &lt;div class="alert-info"&gt;</w:t>
         <w:br/>
-        <w:t xml:space="preserve">        &lt;p&gt;&lt;strong&gt;Este documento constituye el manual académico y metodológico&lt;/strong&gt; diseñado para la estandarización de competencias en el ámbito del coaching de alto rendimiento, la transformación cuántica y la regulación emocional.&lt;/p&gt;</w:t>
+        <w:t xml:space="preserve">        &lt;p&gt;&lt;strong&gt;Este documento constituye el manual académico y metodológico&lt;/strong&gt; diseñado para la estandarización de competencias en el ámbito del coaching de alto rendimiento, la transformación profunda y la regulación emocional.&lt;/p&gt;</w:t>
         <w:br/>
         <w:t xml:space="preserve">      &lt;/div&gt;</w:t>
         <w:br/>
@@ -5270,17 +5304,17 @@
         <w:br/>
         <w:t xml:space="preserve">    id: "m1_l3",</w:t>
         <w:br/>
-        <w:t xml:space="preserve">    title: "1.3 Transformación Cuántica Aplicada al Coaching",</w:t>
+        <w:t xml:space="preserve">    title: "1.3 Transformación Profunda Aplicada al Coaching",</w:t>
         <w:br/>
         <w:t xml:space="preserve">    content: `</w:t>
         <w:br/>
         <w:t xml:space="preserve">      &lt;div class="alert-info"&gt;</w:t>
         <w:br/>
-        <w:t xml:space="preserve">        &lt;p&gt;&lt;strong&gt;Uso metafórico:&lt;/strong&gt; En este programa usamos "cuántico" como metáfora de cambio discontinuo, posibilidad y revisión de perspectivas. Nos inspiramos en ciertas ideas de la física cuántica como analogías, no como demostración científica de que el pensamiento crea la realidad física. No se trata de aplicar mecánica cuántica a la psicología, sino de usar estas imágenes para ampliar el repertorio de lectura del liderazgo.&lt;/p&gt;</w:t>
+        <w:t xml:space="preserve">        &lt;p&gt;&lt;strong&gt;Principios de Posibilidad:&lt;/strong&gt; En este programa nos enfocamos en el cambio discontinuo, la creación de posibilidad y la revisión de perspectivas. Usamos estos principios para ampliar el repertorio de lectura y acción del liderazgo.&lt;/p&gt;</w:t>
         <w:br/>
         <w:t xml:space="preserve">      &lt;/div&gt;</w:t>
         <w:br/>
-        <w:t xml:space="preserve">      &lt;p&gt;El modelo de &lt;strong&gt;"Coaching Cuántico"&lt;/strong&gt; es un marco heurístico innovador que transpone, de manera analógica y metafórica, algunas ideas al campo del desarrollo humano y la ontología del lenguaje.&lt;/p&gt;</w:t>
+        <w:t xml:space="preserve">      &lt;p&gt;El modelo de &lt;strong&gt;"Coaching de Alto Rendimiento"&lt;/strong&gt; es un marco heurístico innovador que transpone, de manera analógica y metafórica, algunas ideas al campo del desarrollo humano y la ontología del lenguaje.&lt;/p&gt;</w:t>
         <w:br/>
         <w:t xml:space="preserve">      &lt;div class="glass-panel" style="padding: 1.5rem; margin-top: 1.5rem;"&gt;</w:t>
         <w:br/>
@@ -5292,7 +5326,7 @@
         <w:br/>
         <w:t xml:space="preserve">      </w:t>
         <w:br/>
-        <w:t xml:space="preserve">      &lt;h3&gt;1.3.2 Principios de la Transformación Cuántica&lt;/h3&gt;</w:t>
+        <w:t xml:space="preserve">      &lt;h3&gt;1.3.2 Principios de la Transformación Profunda&lt;/h3&gt;</w:t>
         <w:br/>
         <w:t xml:space="preserve">      &lt;p&gt;Este modelo postula que el principal impedimento para la evolución humana es la externalización del locus de control: delegar la agencia creativa a las circunstancias empíricas o a narrativas históricas deterministas.&lt;/p&gt;</w:t>
         <w:br/>
@@ -5302,7 +5336,7 @@
         <w:br/>
         <w:t xml:space="preserve">        &lt;li&gt;&lt;span class="highlight-text"&gt;El postulado del Observador generativo:&lt;/span&gt; Inspirado metafóricamente en la interpretación de Copenhague, sostiene que la perspectiva adoptada por el sujeto altera materialmente su espectro de elecciones y realidades posibles.&lt;/li&gt;</w:t>
         <w:br/>
-        <w:t xml:space="preserve">        &lt;li&gt;&lt;span class="highlight-text"&gt;El Salto Cuántico frente a la linealidad:&lt;/span&gt; Habilita transiciones de estado disruptivas y exponenciales, cuestionando la necesidad de progresiones causales estrictamente ligadas a condicionamientos pasados.&lt;/li&gt;</w:t>
+        <w:t xml:space="preserve">        &lt;li&gt;&lt;span class="highlight-text"&gt;El Salto de Posibilidad frente a la linealidad:&lt;/span&gt; Habilita transiciones de estado disruptivas y exponenciales, cuestionando la necesidad de progresiones causales estrictamente ligadas a condicionamientos pasados.&lt;/li&gt;</w:t>
         <w:br/>
         <w:t xml:space="preserve">        &lt;li&gt;&lt;span class="highlight-text"&gt;Sincronización integral:&lt;/span&gt; Consolidación de la coherencia sistémica entre los dominios cognitivo (pensamiento), afectivo (emoción) y conativo (acción ejecutiva).&lt;/li&gt;</w:t>
         <w:br/>
@@ -5325,7 +5359,7 @@
         <w:br/>
         <w:t xml:space="preserve">              &lt;th&gt;Coaching Tradicional&lt;/th&gt;</w:t>
         <w:br/>
-        <w:t xml:space="preserve">              &lt;th&gt;Coaching Cuántico&lt;/th&gt;</w:t>
+        <w:t xml:space="preserve">              &lt;th&gt;Coaching de Alto Rendimiento&lt;/th&gt;</w:t>
         <w:br/>
         <w:t xml:space="preserve">            &lt;/tr&gt;</w:t>
         <w:br/>
@@ -5349,7 +5383,7 @@
         <w:br/>
         <w:t xml:space="preserve">              &lt;td&gt;Lineal, progresiva y sujeta a causalidad histórica.&lt;/td&gt;</w:t>
         <w:br/>
-        <w:t xml:space="preserve">              &lt;td&gt;&lt;span class="highlight-blue"&gt;Saltos cuánticos: disruptiva, exponencial y no lineal.&lt;/span&gt;&lt;/td&gt;</w:t>
+        <w:t xml:space="preserve">              &lt;td&gt;&lt;span class="highlight-blue"&gt;Saltos de posibilidad: disruptiva, exponencial y no lineal.&lt;/span&gt;&lt;/td&gt;</w:t>
         <w:br/>
         <w:t xml:space="preserve">            &lt;/tr&gt;</w:t>
         <w:br/>
@@ -5609,7 +5643,7 @@
         <w:br/>
         <w:t xml:space="preserve">            &lt;li&gt;Prometer resultados absolutos ignorando las barreras sistémicas, económicas o biológicas del individuo.&lt;/li&gt;</w:t>
         <w:br/>
-        <w:t xml:space="preserve">            &lt;li&gt;Usar las metáforas de "física cuántica" como justificación clínica o médica.&lt;/li&gt;</w:t>
+        <w:t xml:space="preserve">            &lt;li&gt;Usar los principios de posibilidad como justificación clínica o médica.&lt;/li&gt;</w:t>
         <w:br/>
         <w:t xml:space="preserve">            &lt;li&gt;Asumir que "todo está en la mente" y que "el cliente lo elige todo".&lt;/li&gt;</w:t>
         <w:br/>
@@ -6404,9 +6438,9 @@
         <w:br/>
         <w:t xml:space="preserve">    content: `</w:t>
         <w:br/>
-        <w:t xml:space="preserve">      &lt;h3&gt;Técnicas Clave del Coach Cuántico&lt;/h3&gt;</w:t>
-        <w:br/>
-        <w:t xml:space="preserve">      &lt;p&gt;El coach de alto rendimiento integra 11 técnicas conversacionales clave durante el proceso para romper resistencias y generar saltos cuánticos.&lt;/p&gt;</w:t>
+        <w:t xml:space="preserve">      &lt;h3&gt;Técnicas Clave del Coach de Alto Rendimiento&lt;/h3&gt;</w:t>
+        <w:br/>
+        <w:t xml:space="preserve">      &lt;p&gt;El coach de alto rendimiento integra 11 técnicas conversacionales clave durante el proceso para romper resistencias y generar saltos de posibilidad.&lt;/p&gt;</w:t>
         <w:br/>
         <w:t xml:space="preserve">      </w:t>
         <w:br/>
@@ -6496,7 +6530,7 @@
         <w:br/>
         <w:t xml:space="preserve">      &lt;div class="alert-info" style="margin-top: 2rem;"&gt;</w:t>
         <w:br/>
-        <w:t xml:space="preserve">        &lt;p&gt;&lt;strong&gt;Nota del Experto:&lt;/strong&gt; Las técnicas 10 y 11 son el núcleo de la transformación cuántica. Sin responsabilidad total y sin un plan ejecutivo, el "darse cuenta" se convierte simplemente en entretenimiento intelectual, sin impacto en la realidad tangible.&lt;/p&gt;</w:t>
+        <w:t xml:space="preserve">        &lt;p&gt;&lt;strong&gt;Nota del Experto:&lt;/strong&gt; Las técnicas 10 y 11 son el núcleo de la transformación profunda. Sin responsabilidad total y sin un plan ejecutivo, el "darse cuenta" se convierte simplemente en entretenimiento intelectual, sin impacto en la realidad tangible.&lt;/p&gt;</w:t>
         <w:br/>
         <w:t xml:space="preserve">      &lt;/div&gt;</w:t>
         <w:br/>
@@ -7015,7 +7049,7 @@
         <w:br/>
         <w:t xml:space="preserve">      &lt;h3&gt;Desvíos Comunes del Participante o Coachee&lt;/h3&gt;</w:t>
         <w:br/>
-        <w:t xml:space="preserve">      &lt;p&gt;Así como el facilitador enfrenta retos, el cliente exhibirá resistencias naturales al proceso de salto cuántico.&lt;/p&gt;</w:t>
+        <w:t xml:space="preserve">      &lt;p&gt;Así como el facilitador enfrenta retos, el cliente exhibirá resistencias naturales al proceso de salto de posibilidad.&lt;/p&gt;</w:t>
         <w:br/>
         <w:t xml:space="preserve">      </w:t>
         <w:br/>
@@ -7262,7 +7296,7 @@
         <w:br/>
         <w:t xml:space="preserve">        &lt;li&gt;&lt;strong&gt;El Mapa de la Angustia (Herramienta 5):&lt;/strong&gt; Identifica una situación angustiante y pregúntate: "¿Qué libertad estoy evitando ejercer?". Declara que esa angustia te está diciendo que eres libre de elegir distinto.&lt;/li&gt;</w:t>
         <w:br/>
-        <w:t xml:space="preserve">        &lt;li&gt;&lt;strong&gt;El Salto Cuántico Existencial (Herramienta 6):&lt;/strong&gt; Define un futuro imposible sin garantías. Da un paso HOY sabiendo que podrías fracasar. Aprende a vivir con la incertidumbre, ese es el "Caballero de la Fe" de Kierkegaard.&lt;/li&gt;</w:t>
+        <w:t xml:space="preserve">        &lt;li&gt;&lt;strong&gt;El Salto de Posibilidad Existencial (Herramienta 6):&lt;/strong&gt; Define un futuro imposible sin garantías. Da un paso HOY sabiendo que podrías fracasar. Aprende a vivir con la incertidumbre, ese es el "Caballero de la Fe" de Kierkegaard.&lt;/li&gt;</w:t>
         <w:br/>
         <w:t xml:space="preserve">      &lt;/ul&gt;</w:t>
         <w:br/>
@@ -7447,7 +7481,7 @@
         <w:br/>
         <w:t xml:space="preserve">    id: "m7_l1",</w:t>
         <w:br/>
-        <w:t xml:space="preserve">    title: "M7: Liderazgo de Transformación Cuántica",</w:t>
+        <w:t xml:space="preserve">    title: "M7: Liderazgo de Transformación Profunda",</w:t>
         <w:br/>
         <w:t xml:space="preserve">    content: `</w:t>
         <w:br/>
@@ -7462,14 +7496,14 @@
         <w:br/>
         <w:t xml:space="preserve">      &lt;div class="alert-info"&gt;</w:t>
         <w:br/>
-        <w:t xml:space="preserve">        &lt;p&gt;&lt;strong&gt;Uso metafórico:&lt;/strong&gt; En este programa usamos "cuántico" como metáfora de cambio discontinuo, posibilidad y revisión de perspectivas. Nos inspiramos en ciertas ideas como analogías, no como demostración científica. No se trata de aplicar mecánica cuántica a la dinámica organizacional, sino de usar estas imágenes para ampliar el repertorio de lectura del liderazgo.&lt;/p&gt;</w:t>
+        <w:t xml:space="preserve">        &lt;p&gt;&lt;strong&gt;Principios de Posibilidad:&lt;/strong&gt; El líder de alto rendimiento no predice el futuro, crea posibilidades que antes no existían. Los 3 principios del líder de posibilidad son: 1) El observador crea posibilidades, 2) La transformación es discontinua, 3) El lenguaje crea realidad.&lt;/p&gt;</w:t>
         <w:br/>
         <w:t xml:space="preserve">      &lt;/div&gt;</w:t>
         <w:br/>
         <w:br/>
         <w:t xml:space="preserve">      &lt;h3&gt;El Observador Crea la Realidad&lt;/h3&gt;</w:t>
         <w:br/>
-        <w:t xml:space="preserve">      &lt;p&gt;El líder cuántico entiende que los resultados no son lineales. Se logran a través de saltos discontinuos alterando al "observador" interno.&lt;/p&gt;</w:t>
+        <w:t xml:space="preserve">      &lt;p&gt;El líder de alto rendimiento entiende que los resultados no son lineales. Se logran a través de saltos discontinuos alterando al "observador" interno.&lt;/p&gt;</w:t>
         <w:br/>
         <w:t xml:space="preserve">      </w:t>
         <w:br/>
@@ -7477,7 +7511,7 @@
         <w:br/>
         <w:t xml:space="preserve">        &lt;li&gt;&lt;strong&gt;H11: El Observador del Líder:&lt;/strong&gt; Identifica un problema. Obsérvalo desde 3 perspectivas distintas (como coach externo, como cliente, como tu yo del futuro). Elige la que te otorgue agencia.&lt;/li&gt;</w:t>
         <w:br/>
-        <w:t xml:space="preserve">        &lt;li&gt;&lt;strong&gt;H12: El Salto Cuántico del Líder:&lt;/strong&gt; ¿Qué creencia tendrías que SOLTAR y qué identidad ADOPTAR para llegar a ese futuro imposible de un solo paso? Actúa desde esa identidad HOY.&lt;/li&gt;</w:t>
+        <w:t xml:space="preserve">        &lt;li&gt;&lt;strong&gt;H12: El Salto de Posibilidad del Líder:&lt;/strong&gt; ¿Qué creencia tendrías que SOLTAR y qué identidad ADOPTAR para llegar a ese futuro imposible de un solo paso? Actúa desde esa identidad HOY.&lt;/li&gt;</w:t>
         <w:br/>
         <w:t xml:space="preserve">      &lt;/ul&gt;</w:t>
         <w:br/>
@@ -7954,7 +7988,7 @@
         <w:br/>
         <w:t xml:space="preserve">        &lt;h3 style="margin-top: 0; color: var(--crear-gold);"&gt;Semana 12: Integración y Legado&lt;/h3&gt;</w:t>
         <w:br/>
-        <w:t xml:space="preserve">        &lt;p&gt;Has completado el viaje filosófico y cuántico. Ahora debes declarar el legado que dejas en tu equipo, tu organización y en el mundo.&lt;/p&gt;</w:t>
+        <w:t xml:space="preserve">        &lt;p&gt;Has completado el viaje filosófico y de alto rendimiento. Ahora debes declarar el legado que dejas en tu equipo, tu organización y en el mundo.&lt;/p&gt;</w:t>
         <w:br/>
         <w:t xml:space="preserve">      &lt;/div&gt;</w:t>
         <w:br/>
@@ -8381,9 +8415,9 @@
         <w:br/>
         <w:t xml:space="preserve">        { fuente: "Heidegger", concepto: "El ser-en-el-mundo como creador de significado", aplicacion: "El líder no describe la realidad, la crea con su presencia y lenguaje" },</w:t>
         <w:br/>
-        <w:t xml:space="preserve">        { fuente: "Física Cuántica", concepto: "El observador crea la realidad que observa", aplicacion: "El líder observa posibilidades, no limitaciones, y eso crea realidad" },</w:t>
-        <w:br/>
-        <w:t xml:space="preserve">        { fuente: "Coaching Cuántico", concepto: "La transformación no es lineal, es un salto desde el futuro", aplicacion: "El líder diseña desde el futuro imposible, no desde el problema actual" }</w:t>
+        <w:t xml:space="preserve">        { fuente: "Principios de Posibilidad", concepto: "El observador crea la realidad que observa", aplicacion: "El líder observa posibilidades, no limitaciones, y eso crea realidad" },</w:t>
+        <w:br/>
+        <w:t xml:space="preserve">        { fuente: "Coaching de Alto Rendimiento", concepto: "La transformación no es lineal, es un salto desde el futuro", aplicacion: "El líder diseña desde el futuro imposible, no desde el problema actual" }</w:t>
         <w:br/>
         <w:t xml:space="preserve">      ]</w:t>
         <w:br/>
@@ -8463,7 +8497,7 @@
         <w:br/>
         <w:t xml:space="preserve">      titulo: "El Propósito: Vivir Futuros Imposibles",</w:t>
         <w:br/>
-        <w:t xml:space="preserve">      definicion: "Una aspiración que hoy parece inalcanzable, pero que se declara como posible de crear. No es una meta SMART ni un objetivo 'realista'. Es una declaración audaz, un salto cuántico, un compromiso con lo extraordinario.",</w:t>
+        <w:t xml:space="preserve">      definicion: "Una aspiración que hoy parece inalcanzable, pero que se declara como posible de crear. No es una meta SMART ni un objetivo 'realista'. Es una declaración audaz, un salto de posibilidad, un compromiso con lo extraordinario.",</w:t>
         <w:br/>
         <w:t xml:space="preserve">      ejemplos: [</w:t>
         <w:br/>
@@ -8894,7 +8928,7 @@
         <w:br/>
         <w:t xml:space="preserve">    { titulo: "Soul (2020)", tema: "Propósito, vivir plenamente.", dinamica: "¿Cuál es tu 'chispa'?", link: "https://www.youtube.com/watch?v=xOsLIiOB_SQ" },</w:t>
         <w:br/>
-        <w:t xml:space="preserve">    { titulo: "La Vida Secreta de Walter Mitty (2013)", tema: "Salto cuántico, vivir el futuro.", dinamica: "¿Qué salto estás evitando?", link: "https://www.youtube.com/watch?v=HddkucqSzSM" },</w:t>
+        <w:t xml:space="preserve">    { titulo: "La Vida Secreta de Walter Mitty (2013)", tema: "Salto de posibilidad, vivir el futuro.", dinamica: "¿Qué salto estás evitando?", link: "https://www.youtube.com/watch?v=HddkucqSzSM" },</w:t>
         <w:br/>
         <w:t xml:space="preserve">    { titulo: "Coach Carter (2005)", tema: "Alto rendimiento, disciplina.", dinamica: "¿Qué estándar declaras?", link: "https://www.youtube.com/watch?v=0KzUuI9o0eA" }</w:t>
         <w:br/>
@@ -9415,7 +9449,7 @@
         <w:br/>
         <w:t xml:space="preserve">              &gt;</w:t>
         <w:br/>
-        <w:t xml:space="preserve">                {generatingAi ? '⏳ Procesando...' : '🧠 Generar Diagnóstico Cuántico'}</w:t>
+        <w:t xml:space="preserve">                {generatingAi ? '⏳ Procesando...' : '🧠 Generar Diagnóstico de Alto Rendimiento'}</w:t>
         <w:br/>
         <w:t xml:space="preserve">              &lt;/button&gt;</w:t>
         <w:br/>
@@ -10053,7 +10087,7 @@
         <w:br/>
         <w:t xml:space="preserve">        &lt;/div&gt;</w:t>
         <w:br/>
-        <w:t xml:space="preserve">        &lt;button className="btn-secondary" onClick={logout} aria-label="Cerrar sesión de tu cuenta"&gt;Cerrar sesión&lt;/button&gt;</w:t>
+        <w:t xml:space="preserve">        &lt;button className="btn-logout" onClick={logout} aria-label="Cerrar sesión de tu cuenta"&gt;Cerrar sesión&lt;/button&gt;</w:t>
         <w:br/>
         <w:t xml:space="preserve">      &lt;/header&gt;</w:t>
         <w:br/>
@@ -10142,7 +10176,7 @@
         <w:br/>
         <w:t xml:space="preserve">                ? 'Elige tu siguiente paso en la Ruta de Formación.' </w:t>
         <w:br/>
-        <w:t xml:space="preserve">                : 'Bases del Coaching, Física Cuántica y Ontología.'}</w:t>
+        <w:t xml:space="preserve">                : 'Bases del Coaching, Principios de Posibilidad y Ontología.'}</w:t>
         <w:br/>
         <w:t xml:space="preserve">            &lt;/p&gt;</w:t>
         <w:br/>
@@ -11168,9 +11202,9 @@
         <w:br/>
         <w:t xml:space="preserve">    {</w:t>
         <w:br/>
-        <w:t xml:space="preserve">      termino: "Coaching Cuántico (Uso Metafórico)",</w:t>
-        <w:br/>
-        <w:t xml:space="preserve">      definicion: "Marco heurístico del programa que utiliza conceptos de la física cuántica (salto discontinuo, efecto observador) como analogías para explicar cambios no-lineales en el comportamiento humano. No representa una validación clínica ni científica basada en la física de partículas."</w:t>
+        <w:t xml:space="preserve">      termino: "Coaching de Alto Rendimiento",</w:t>
+        <w:br/>
+        <w:t xml:space="preserve">      definicion: "Marco heurístico del programa que utiliza los Principios de Posibilidad (salto discontinuo, observador generativo) para explicar cambios no-lineales en el comportamiento humano."</w:t>
         <w:br/>
         <w:t xml:space="preserve">    }</w:t>
         <w:br/>
@@ -13344,11 +13378,11 @@
         <w:t xml:space="preserve">  }).join('\n');</w:t>
         <w:br/>
         <w:br/>
-        <w:t xml:space="preserve">  const systemPrompt = `Eres un Master Coach Cuántico y Analista de Comportamiento Humano de Alto Nivel.</w:t>
+        <w:t xml:space="preserve">  const systemPrompt = `Eres un Master Coach de Alto Rendimiento y Analista de Comportamiento Humano de Alto Nivel.</w:t>
         <w:br/>
         <w:t>Tu tarea es auditar la data biométrica y de conexión de un alumno en una plataforma e-learning y dar un diagnóstico de su nivel de compromiso.</w:t>
         <w:br/>
-        <w:t>Tienes que detectar si el alumno procrastina, si tiene un progreso congruente, o si "intelectualiza" (pasa horas conectándose sin completar tareas).</w:t>
+        <w:t>Tienen que detectar si el alumno procrastina, si tiene un progreso congruente, o si "intelectualiza" (pasa horas conectándose sin completar tareas).</w:t>
         <w:br/>
         <w:br/>
         <w:t>REGLAS DE FORMATO:</w:t>

</xml_diff>

<commit_message>
feat: Add Global HUD, background music and fix UI icons
</commit_message>
<xml_diff>
--- a/Auditoria_Codigo_Completo.docx
+++ b/Auditoria_Codigo_Completo.docx
@@ -488,6 +488,8 @@
         <w:br/>
         <w:t>import Sidebar from './components/Sidebar'</w:t>
         <w:br/>
+        <w:t>import GlobalHUDWidget from './components/GlobalHUDWidget'</w:t>
+        <w:br/>
         <w:t>import ProtectedRoute from './components/ProtectedRoute'</w:t>
         <w:br/>
         <w:t>import Dashboard from './pages/Dashboard'</w:t>
@@ -707,6 +709,9 @@
         <w:t xml:space="preserve">        &lt;/&gt;</w:t>
         <w:br/>
         <w:t xml:space="preserve">      )}</w:t>
+        <w:br/>
+        <w:br/>
+        <w:t xml:space="preserve">      {user &amp;&amp; &lt;GlobalHUDWidget /&gt;}</w:t>
         <w:br/>
         <w:br/>
         <w:t xml:space="preserve">      &lt;main className="main-content animate-fade-in"&gt;</w:t>
@@ -1603,6 +1608,274 @@
         <w:br/>
         <w:t>}</w:t>
         <w:br/>
+        <w:t>/* Global HUD Widget */</w:t>
+        <w:br/>
+        <w:t>.global-hud-widget {</w:t>
+        <w:br/>
+        <w:t xml:space="preserve">  position: fixed;</w:t>
+        <w:br/>
+        <w:t xml:space="preserve">  top: 1.5rem;</w:t>
+        <w:br/>
+        <w:t xml:space="preserve">  right: 1.5rem;</w:t>
+        <w:br/>
+        <w:t xml:space="preserve">  z-index: 9999;</w:t>
+        <w:br/>
+        <w:t xml:space="preserve">  display: flex;</w:t>
+        <w:br/>
+        <w:t xml:space="preserve">  align-items: center;</w:t>
+        <w:br/>
+        <w:t xml:space="preserve">  gap: 0.8rem;</w:t>
+        <w:br/>
+        <w:t xml:space="preserve">  background: rgba(10, 20, 35, 0.6);</w:t>
+        <w:br/>
+        <w:t xml:space="preserve">  backdrop-filter: blur(12px);</w:t>
+        <w:br/>
+        <w:t xml:space="preserve">  -webkit-backdrop-filter: blur(12px);</w:t>
+        <w:br/>
+        <w:t xml:space="preserve">  padding: 0.4rem 1rem;</w:t>
+        <w:br/>
+        <w:t xml:space="preserve">  border-radius: 40px;</w:t>
+        <w:br/>
+        <w:t xml:space="preserve">  border: 1px solid rgba(255, 215, 0, 0.2);</w:t>
+        <w:br/>
+        <w:t xml:space="preserve">  box-shadow: 0 4px 15px rgba(0, 0, 0, 0.3), 0 0 10px rgba(255, 215, 0, 0.05);</w:t>
+        <w:br/>
+        <w:t xml:space="preserve">  transition: all 0.3s ease;</w:t>
+        <w:br/>
+        <w:t>}</w:t>
+        <w:br/>
+        <w:br/>
+        <w:t>.global-hud-widget:hover {</w:t>
+        <w:br/>
+        <w:t xml:space="preserve">  border-color: rgba(255, 215, 0, 0.5);</w:t>
+        <w:br/>
+        <w:t xml:space="preserve">  box-shadow: 0 4px 20px rgba(0, 0, 0, 0.5), 0 0 15px rgba(255, 215, 0, 0.2);</w:t>
+        <w:br/>
+        <w:t>}</w:t>
+        <w:br/>
+        <w:br/>
+        <w:t>.hud-music-btn {</w:t>
+        <w:br/>
+        <w:t xml:space="preserve">  background: rgba(255, 255, 255, 0.05);</w:t>
+        <w:br/>
+        <w:t xml:space="preserve">  border: 1px solid rgba(255, 255, 255, 0.1);</w:t>
+        <w:br/>
+        <w:t xml:space="preserve">  color: var(--text-main);</w:t>
+        <w:br/>
+        <w:t xml:space="preserve">  width: 36px;</w:t>
+        <w:br/>
+        <w:t xml:space="preserve">  height: 36px;</w:t>
+        <w:br/>
+        <w:t xml:space="preserve">  border-radius: 50%;</w:t>
+        <w:br/>
+        <w:t xml:space="preserve">  display: flex;</w:t>
+        <w:br/>
+        <w:t xml:space="preserve">  align-items: center;</w:t>
+        <w:br/>
+        <w:t xml:space="preserve">  justify-content: center;</w:t>
+        <w:br/>
+        <w:t xml:space="preserve">  cursor: pointer;</w:t>
+        <w:br/>
+        <w:t xml:space="preserve">  transition: all 0.2s ease;</w:t>
+        <w:br/>
+        <w:t>}</w:t>
+        <w:br/>
+        <w:br/>
+        <w:t>.hud-music-btn:hover {</w:t>
+        <w:br/>
+        <w:t xml:space="preserve">  background: rgba(255, 255, 255, 0.1);</w:t>
+        <w:br/>
+        <w:t xml:space="preserve">  color: var(--crear-gold);</w:t>
+        <w:br/>
+        <w:t>}</w:t>
+        <w:br/>
+        <w:br/>
+        <w:t>.hud-music-btn.playing {</w:t>
+        <w:br/>
+        <w:t xml:space="preserve">  color: var(--crear-blue);</w:t>
+        <w:br/>
+        <w:t xml:space="preserve">  border-color: var(--crear-blue);</w:t>
+        <w:br/>
+        <w:t xml:space="preserve">  box-shadow: 0 0 10px rgba(0, 230, 118, 0.2);</w:t>
+        <w:br/>
+        <w:t>}</w:t>
+        <w:br/>
+        <w:br/>
+        <w:t>.hud-avatar-container {</w:t>
+        <w:br/>
+        <w:t xml:space="preserve">  position: relative;</w:t>
+        <w:br/>
+        <w:t xml:space="preserve">  width: 60px;</w:t>
+        <w:br/>
+        <w:t xml:space="preserve">  height: 60px;</w:t>
+        <w:br/>
+        <w:t xml:space="preserve">  cursor: pointer;</w:t>
+        <w:br/>
+        <w:t xml:space="preserve">  display: flex;</w:t>
+        <w:br/>
+        <w:t xml:space="preserve">  align-items: center;</w:t>
+        <w:br/>
+        <w:t xml:space="preserve">  justify-content: center;</w:t>
+        <w:br/>
+        <w:t xml:space="preserve">  border-radius: 50%;</w:t>
+        <w:br/>
+        <w:t>}</w:t>
+        <w:br/>
+        <w:br/>
+        <w:t>.hud-progress-ring {</w:t>
+        <w:br/>
+        <w:t xml:space="preserve">  position: absolute;</w:t>
+        <w:br/>
+        <w:t xml:space="preserve">  top: 0;</w:t>
+        <w:br/>
+        <w:t xml:space="preserve">  left: 0;</w:t>
+        <w:br/>
+        <w:t xml:space="preserve">  transform: rotate(-90deg);</w:t>
+        <w:br/>
+        <w:t>}</w:t>
+        <w:br/>
+        <w:br/>
+        <w:t>.hud-progress-ring-fill {</w:t>
+        <w:br/>
+        <w:t xml:space="preserve">  transition: stroke-dashoffset 0.8s ease-in-out;</w:t>
+        <w:br/>
+        <w:t>}</w:t>
+        <w:br/>
+        <w:br/>
+        <w:t>.hud-avatar-img {</w:t>
+        <w:br/>
+        <w:t xml:space="preserve">  width: 48px;</w:t>
+        <w:br/>
+        <w:t xml:space="preserve">  height: 48px;</w:t>
+        <w:br/>
+        <w:t xml:space="preserve">  border-radius: 50%;</w:t>
+        <w:br/>
+        <w:t xml:space="preserve">  object-fit: cover;</w:t>
+        <w:br/>
+        <w:t xml:space="preserve">  border: 2px solid transparent;</w:t>
+        <w:br/>
+        <w:t xml:space="preserve">  transition: all 0.3s ease;</w:t>
+        <w:br/>
+        <w:t>}</w:t>
+        <w:br/>
+        <w:br/>
+        <w:t>.hud-avatar-placeholder {</w:t>
+        <w:br/>
+        <w:t xml:space="preserve">  width: 48px;</w:t>
+        <w:br/>
+        <w:t xml:space="preserve">  height: 48px;</w:t>
+        <w:br/>
+        <w:t xml:space="preserve">  border-radius: 50%;</w:t>
+        <w:br/>
+        <w:t xml:space="preserve">  background: var(--crear-blue);</w:t>
+        <w:br/>
+        <w:t xml:space="preserve">  color: white;</w:t>
+        <w:br/>
+        <w:t xml:space="preserve">  display: flex;</w:t>
+        <w:br/>
+        <w:t xml:space="preserve">  align-items: center;</w:t>
+        <w:br/>
+        <w:t xml:space="preserve">  justify-content: center;</w:t>
+        <w:br/>
+        <w:t xml:space="preserve">  font-size: 1.5rem;</w:t>
+        <w:br/>
+        <w:t xml:space="preserve">  font-weight: bold;</w:t>
+        <w:br/>
+        <w:t>}</w:t>
+        <w:br/>
+        <w:br/>
+        <w:t>.hud-avatar-container:hover .hud-avatar-img {</w:t>
+        <w:br/>
+        <w:t xml:space="preserve">  transform: scale(1.05);</w:t>
+        <w:br/>
+        <w:t xml:space="preserve">  box-shadow: 0 0 10px rgba(255, 215, 0, 0.5);</w:t>
+        <w:br/>
+        <w:t>}</w:t>
+        <w:br/>
+        <w:br/>
+        <w:t>.gods-grid {</w:t>
+        <w:br/>
+        <w:t xml:space="preserve">  display: grid;</w:t>
+        <w:br/>
+        <w:t xml:space="preserve">  grid-template-columns: repeat(auto-fit, minmax(120px, 1fr));</w:t>
+        <w:br/>
+        <w:t xml:space="preserve">  gap: 1.5rem;</w:t>
+        <w:br/>
+        <w:t xml:space="preserve">  margin-top: 1.5rem;</w:t>
+        <w:br/>
+        <w:t>}</w:t>
+        <w:br/>
+        <w:br/>
+        <w:t>.god-card {</w:t>
+        <w:br/>
+        <w:t xml:space="preserve">  background: rgba(255, 255, 255, 0.05);</w:t>
+        <w:br/>
+        <w:t xml:space="preserve">  border-radius: 16px;</w:t>
+        <w:br/>
+        <w:t xml:space="preserve">  padding: 1rem;</w:t>
+        <w:br/>
+        <w:t xml:space="preserve">  text-align: center;</w:t>
+        <w:br/>
+        <w:t xml:space="preserve">  cursor: pointer;</w:t>
+        <w:br/>
+        <w:t xml:space="preserve">  border: 1px solid rgba(255, 255, 255, 0.1);</w:t>
+        <w:br/>
+        <w:t xml:space="preserve">  transition: all 0.3s cubic-bezier(0.25, 0.8, 0.25, 1);</w:t>
+        <w:br/>
+        <w:t>}</w:t>
+        <w:br/>
+        <w:br/>
+        <w:t>.god-card:hover {</w:t>
+        <w:br/>
+        <w:t xml:space="preserve">  background: rgba(255, 215, 0, 0.1);</w:t>
+        <w:br/>
+        <w:t xml:space="preserve">  border-color: var(--crear-gold);</w:t>
+        <w:br/>
+        <w:t xml:space="preserve">  transform: translateY(-5px);</w:t>
+        <w:br/>
+        <w:t xml:space="preserve">  box-shadow: 0 10px 20px rgba(0,0,0,0.3), 0 0 15px rgba(255,215,0,0.2);</w:t>
+        <w:br/>
+        <w:t>}</w:t>
+        <w:br/>
+        <w:br/>
+        <w:t>.god-card img {</w:t>
+        <w:br/>
+        <w:t xml:space="preserve">  width: 90px;</w:t>
+        <w:br/>
+        <w:t xml:space="preserve">  height: 90px;</w:t>
+        <w:br/>
+        <w:t xml:space="preserve">  border-radius: 50%;</w:t>
+        <w:br/>
+        <w:t xml:space="preserve">  object-fit: cover;</w:t>
+        <w:br/>
+        <w:t xml:space="preserve">  margin-bottom: 0.8rem;</w:t>
+        <w:br/>
+        <w:t xml:space="preserve">  border: 2px solid transparent;</w:t>
+        <w:br/>
+        <w:t xml:space="preserve">  transition: all 0.3s ease;</w:t>
+        <w:br/>
+        <w:t>}</w:t>
+        <w:br/>
+        <w:br/>
+        <w:t>.god-card:hover img {</w:t>
+        <w:br/>
+        <w:t xml:space="preserve">  border-color: var(--crear-gold);</w:t>
+        <w:br/>
+        <w:t>}</w:t>
+        <w:br/>
+        <w:br/>
+        <w:t>.god-card p {</w:t>
+        <w:br/>
+        <w:t xml:space="preserve">  font-size: 0.9rem;</w:t>
+        <w:br/>
+        <w:t xml:space="preserve">  margin: 0;</w:t>
+        <w:br/>
+        <w:t xml:space="preserve">  color: var(--text-main);</w:t>
+        <w:br/>
+        <w:t xml:space="preserve">  font-weight: 500;</w:t>
+        <w:br/>
+        <w:t>}</w:t>
+        <w:br/>
       </w:r>
     </w:p>
     <w:p>
@@ -1731,6 +2004,274 @@
           <w:b/>
           <w:sz w:val="28"/>
         </w:rPr>
+        <w:t>Archivo: src/components/GlobalHUDWidget.jsx</w:t>
+      </w:r>
+    </w:p>
+    <w:p>
+      <w:r>
+        <w:rPr>
+          <w:rFonts w:ascii="Consolas" w:hAnsi="Consolas"/>
+          <w:sz w:val="18"/>
+        </w:rPr>
+        <w:t>import { useState, useEffect, useRef } from 'react';</w:t>
+        <w:br/>
+        <w:t>import { useAuth } from '../context/AuthContext';</w:t>
+        <w:br/>
+        <w:t>import { getUserProgress } from '../services/db';</w:t>
+        <w:br/>
+        <w:br/>
+        <w:t>export default function GlobalHUDWidget() {</w:t>
+        <w:br/>
+        <w:t xml:space="preserve">  const { user } = useAuth();</w:t>
+        <w:br/>
+        <w:t xml:space="preserve">  const [progress, setProgress] = useState(0);</w:t>
+        <w:br/>
+        <w:t xml:space="preserve">  const [isPlaying, setIsPlaying] = useState(false);</w:t>
+        <w:br/>
+        <w:t xml:space="preserve">  const [showAvatarModal, setShowAvatarModal] = useState(false);</w:t>
+        <w:br/>
+        <w:t xml:space="preserve">  const [selectedAvatar, setSelectedAvatar] = useState(null);</w:t>
+        <w:br/>
+        <w:t xml:space="preserve">  const audioRef = useRef(null);</w:t>
+        <w:br/>
+        <w:br/>
+        <w:t xml:space="preserve">  useEffect(() =&gt; {</w:t>
+        <w:br/>
+        <w:t xml:space="preserve">    const savedAvatar = localStorage.getItem('selectedGodAvatar');</w:t>
+        <w:br/>
+        <w:t xml:space="preserve">    if (savedAvatar) {</w:t>
+        <w:br/>
+        <w:t xml:space="preserve">      setSelectedAvatar(savedAvatar);</w:t>
+        <w:br/>
+        <w:t xml:space="preserve">    } else if (user?.photoURL) {</w:t>
+        <w:br/>
+        <w:t xml:space="preserve">      setSelectedAvatar(user.photoURL);</w:t>
+        <w:br/>
+        <w:t xml:space="preserve">    }</w:t>
+        <w:br/>
+        <w:br/>
+        <w:t xml:space="preserve">    if (user) {</w:t>
+        <w:br/>
+        <w:t xml:space="preserve">      getUserProgress(user.uid).then((data) =&gt; {</w:t>
+        <w:br/>
+        <w:t xml:space="preserve">        if (data) setProgress(data.globalPercentage || 0);</w:t>
+        <w:br/>
+        <w:t xml:space="preserve">      });</w:t>
+        <w:br/>
+        <w:t xml:space="preserve">    }</w:t>
+        <w:br/>
+        <w:t xml:space="preserve">  }, [user]);</w:t>
+        <w:br/>
+        <w:br/>
+        <w:t xml:space="preserve">  const toggleMusic = () =&gt; {</w:t>
+        <w:br/>
+        <w:t xml:space="preserve">    if (audioRef.current) {</w:t>
+        <w:br/>
+        <w:t xml:space="preserve">      if (isPlaying) {</w:t>
+        <w:br/>
+        <w:t xml:space="preserve">        audioRef.current.pause();</w:t>
+        <w:br/>
+        <w:t xml:space="preserve">      } else {</w:t>
+        <w:br/>
+        <w:t xml:space="preserve">        audioRef.current.play().catch(e =&gt; console.log('Autoplay blocked:', e));</w:t>
+        <w:br/>
+        <w:t xml:space="preserve">      }</w:t>
+        <w:br/>
+        <w:t xml:space="preserve">      setIsPlaying(!isPlaying);</w:t>
+        <w:br/>
+        <w:t xml:space="preserve">    }</w:t>
+        <w:br/>
+        <w:t xml:space="preserve">  };</w:t>
+        <w:br/>
+        <w:br/>
+        <w:t xml:space="preserve">  const selectAvatar = (path) =&gt; {</w:t>
+        <w:br/>
+        <w:t xml:space="preserve">    setSelectedAvatar(path);</w:t>
+        <w:br/>
+        <w:t xml:space="preserve">    localStorage.setItem('selectedGodAvatar', path);</w:t>
+        <w:br/>
+        <w:t xml:space="preserve">    setShowAvatarModal(false);</w:t>
+        <w:br/>
+        <w:t xml:space="preserve">  };</w:t>
+        <w:br/>
+        <w:br/>
+        <w:t xml:space="preserve">  const gods = [</w:t>
+        <w:br/>
+        <w:t xml:space="preserve">    { id: 'prometeo', name: 'Prometeo (Robó el fuego)', path: '/avatars/prometeo.jpg' },</w:t>
+        <w:br/>
+        <w:t xml:space="preserve">    { id: 'wukong', name: 'Sun Wukong (Desafió al cielo)', path: '/avatars/sun_wukong.jpg' },</w:t>
+        <w:br/>
+        <w:t xml:space="preserve">    { id: 'loki', name: 'Loki (Dios del Caos)', path: '/avatars/loki.jpg' }</w:t>
+        <w:br/>
+        <w:t xml:space="preserve">  ];</w:t>
+        <w:br/>
+        <w:br/>
+        <w:t xml:space="preserve">  if (!user) return null;</w:t>
+        <w:br/>
+        <w:br/>
+        <w:t xml:space="preserve">  const radius = 26;</w:t>
+        <w:br/>
+        <w:t xml:space="preserve">  const circumference = 2 * Math.PI * radius;</w:t>
+        <w:br/>
+        <w:t xml:space="preserve">  const strokeDashoffset = circumference - (progress / 100) * circumference;</w:t>
+        <w:br/>
+        <w:br/>
+        <w:t xml:space="preserve">  return (</w:t>
+        <w:br/>
+        <w:t xml:space="preserve">    &lt;&gt;</w:t>
+        <w:br/>
+        <w:t xml:space="preserve">      &lt;div className="global-hud-widget animate-fade-in"&gt;</w:t>
+        <w:br/>
+        <w:t xml:space="preserve">        &lt;audio ref={audioRef} src="/Magic.mp3" loop /&gt;</w:t>
+        <w:br/>
+        <w:t xml:space="preserve">        </w:t>
+        <w:br/>
+        <w:t xml:space="preserve">        &lt;button </w:t>
+        <w:br/>
+        <w:t xml:space="preserve">          className={`hud-music-btn ${isPlaying ? 'playing' : ''}`}</w:t>
+        <w:br/>
+        <w:t xml:space="preserve">          onClick={toggleMusic}</w:t>
+        <w:br/>
+        <w:t xml:space="preserve">          title={isPlaying ? "Pausar música" : "Reproducir música"}</w:t>
+        <w:br/>
+        <w:t xml:space="preserve">        &gt;</w:t>
+        <w:br/>
+        <w:t xml:space="preserve">          {isPlaying ? (</w:t>
+        <w:br/>
+        <w:t xml:space="preserve">            &lt;svg xmlns="http://www.w3.org/2000/svg" width="16" height="16" viewBox="0 0 24 24" fill="currentColor"&gt;&lt;path d="M6 4h4v16H6zm8 0h4v16h-4z"/&gt;&lt;/svg&gt;</w:t>
+        <w:br/>
+        <w:t xml:space="preserve">          ) : (</w:t>
+        <w:br/>
+        <w:t xml:space="preserve">            &lt;svg xmlns="http://www.w3.org/2000/svg" width="16" height="16" viewBox="0 0 24 24" fill="currentColor"&gt;&lt;path d="M8 5v14l11-7z"/&gt;&lt;/svg&gt;</w:t>
+        <w:br/>
+        <w:t xml:space="preserve">          )}</w:t>
+        <w:br/>
+        <w:t xml:space="preserve">        &lt;/button&gt;</w:t>
+        <w:br/>
+        <w:br/>
+        <w:t xml:space="preserve">        &lt;div className="hud-avatar-container" onClick={() =&gt; setShowAvatarModal(true)} title={`${progress}% Completado. Cambiar avatar.`}&gt;</w:t>
+        <w:br/>
+        <w:t xml:space="preserve">          &lt;svg width="60" height="60" className="hud-progress-ring"&gt;</w:t>
+        <w:br/>
+        <w:t xml:space="preserve">            &lt;circle</w:t>
+        <w:br/>
+        <w:t xml:space="preserve">              className="hud-progress-ring-bg"</w:t>
+        <w:br/>
+        <w:t xml:space="preserve">              stroke="rgba(255, 255, 255, 0.1)"</w:t>
+        <w:br/>
+        <w:t xml:space="preserve">              strokeWidth="4"</w:t>
+        <w:br/>
+        <w:t xml:space="preserve">              fill="transparent"</w:t>
+        <w:br/>
+        <w:t xml:space="preserve">              r={radius}</w:t>
+        <w:br/>
+        <w:t xml:space="preserve">              cx="30"</w:t>
+        <w:br/>
+        <w:t xml:space="preserve">              cy="30"</w:t>
+        <w:br/>
+        <w:t xml:space="preserve">            /&gt;</w:t>
+        <w:br/>
+        <w:t xml:space="preserve">            &lt;circle</w:t>
+        <w:br/>
+        <w:t xml:space="preserve">              className="hud-progress-ring-fill"</w:t>
+        <w:br/>
+        <w:t xml:space="preserve">              stroke="var(--crear-gold)"</w:t>
+        <w:br/>
+        <w:t xml:space="preserve">              strokeWidth="4"</w:t>
+        <w:br/>
+        <w:t xml:space="preserve">              strokeDasharray={circumference}</w:t>
+        <w:br/>
+        <w:t xml:space="preserve">              strokeDashoffset={strokeDashoffset}</w:t>
+        <w:br/>
+        <w:t xml:space="preserve">              strokeLinecap="round"</w:t>
+        <w:br/>
+        <w:t xml:space="preserve">              fill="transparent"</w:t>
+        <w:br/>
+        <w:t xml:space="preserve">              r={radius}</w:t>
+        <w:br/>
+        <w:t xml:space="preserve">              cx="30"</w:t>
+        <w:br/>
+        <w:t xml:space="preserve">              cy="30"</w:t>
+        <w:br/>
+        <w:t xml:space="preserve">            /&gt;</w:t>
+        <w:br/>
+        <w:t xml:space="preserve">          &lt;/svg&gt;</w:t>
+        <w:br/>
+        <w:t xml:space="preserve">          {selectedAvatar ? (</w:t>
+        <w:br/>
+        <w:t xml:space="preserve">            &lt;img src={selectedAvatar} alt="Avatar" className="hud-avatar-img" /&gt;</w:t>
+        <w:br/>
+        <w:t xml:space="preserve">          ) : (</w:t>
+        <w:br/>
+        <w:t xml:space="preserve">            &lt;div className="hud-avatar-placeholder"&gt;?&lt;/div&gt;</w:t>
+        <w:br/>
+        <w:t xml:space="preserve">          )}</w:t>
+        <w:br/>
+        <w:t xml:space="preserve">        &lt;/div&gt;</w:t>
+        <w:br/>
+        <w:t xml:space="preserve">      &lt;/div&gt;</w:t>
+        <w:br/>
+        <w:br/>
+        <w:t xml:space="preserve">      {showAvatarModal &amp;&amp; (</w:t>
+        <w:br/>
+        <w:t xml:space="preserve">        &lt;div className="modal-overlay" onClick={() =&gt; setShowAvatarModal(false)} style={{ zIndex: 10001 }}&gt;</w:t>
+        <w:br/>
+        <w:t xml:space="preserve">          &lt;div className="modal-content glass-panel" onClick={e =&gt; e.stopPropagation()}&gt;</w:t>
+        <w:br/>
+        <w:t xml:space="preserve">            &lt;h3 className="text-gold" style={{ marginTop: 0, fontSize: '1.5rem' }}&gt;Elige tu Avatar Disruptor&lt;/h3&gt;</w:t>
+        <w:br/>
+        <w:t xml:space="preserve">            &lt;p className="text-muted" style={{ marginBottom: '1.5rem' }}&gt;Si no tienes una foto de perfil (o quieres cambiarla), puedes elegir a uno de los dioses que interrumpieron la mitología.&lt;/p&gt;</w:t>
+        <w:br/>
+        <w:t xml:space="preserve">            </w:t>
+        <w:br/>
+        <w:t xml:space="preserve">            &lt;div className="gods-grid"&gt;</w:t>
+        <w:br/>
+        <w:t xml:space="preserve">              {gods.map(god =&gt; (</w:t>
+        <w:br/>
+        <w:t xml:space="preserve">                &lt;div key={god.id} className="god-card" onClick={() =&gt; selectAvatar(god.path)}&gt;</w:t>
+        <w:br/>
+        <w:t xml:space="preserve">                  &lt;img src={god.path} alt={god.name} /&gt;</w:t>
+        <w:br/>
+        <w:t xml:space="preserve">                  &lt;p&gt;{god.name}&lt;/p&gt;</w:t>
+        <w:br/>
+        <w:t xml:space="preserve">                &lt;/div&gt;</w:t>
+        <w:br/>
+        <w:t xml:space="preserve">              ))}</w:t>
+        <w:br/>
+        <w:t xml:space="preserve">            &lt;/div&gt;</w:t>
+        <w:br/>
+        <w:br/>
+        <w:t xml:space="preserve">            &lt;button className="btn-secondary" style={{ marginTop: '2rem', width: '100%' }} onClick={() =&gt; setShowAvatarModal(false)}&gt;</w:t>
+        <w:br/>
+        <w:t xml:space="preserve">              Cerrar</w:t>
+        <w:br/>
+        <w:t xml:space="preserve">            &lt;/button&gt;</w:t>
+        <w:br/>
+        <w:t xml:space="preserve">          &lt;/div&gt;</w:t>
+        <w:br/>
+        <w:t xml:space="preserve">        &lt;/div&gt;</w:t>
+        <w:br/>
+        <w:t xml:space="preserve">      )}</w:t>
+        <w:br/>
+        <w:t xml:space="preserve">    &lt;/&gt;</w:t>
+        <w:br/>
+        <w:t xml:space="preserve">  );</w:t>
+        <w:br/>
+        <w:t>}</w:t>
+        <w:br/>
+      </w:r>
+    </w:p>
+    <w:p>
+      <w:r>
+        <w:br w:type="page"/>
+      </w:r>
+    </w:p>
+    <w:p>
+      <w:r>
+        <w:rPr>
+          <w:b/>
+          <w:sz w:val="28"/>
+        </w:rPr>
         <w:t>Archivo: src/components/ProtectedRoute.jsx</w:t>
       </w:r>
     </w:p>
@@ -2841,7 +3382,7 @@
         <w:br/>
         <w:t xml:space="preserve">      "Establece límites claros para evitar burnout.",</w:t>
         <w:br/>
-        <w:t xml:space="preserve">      "Enrola a al menos 1 persona por trimestre a ser coach o líder."</w:t>
+        <w:t xml:space="preserve">      "Impacta a mínimo 7 personas por trimestre para que vivan una vida extraordinaria. Nota: El estándar mínimo de 7 personas no es tu meta. Es el reflejo de tu estándar. Si tu estándar es alto, 7 personas será solo el comienzo."</w:t>
         <w:br/>
         <w:t xml:space="preserve">    ]</w:t>
         <w:br/>
@@ -2979,7 +3520,7 @@
         <w:br/>
         <w:t xml:space="preserve">    id: 'modulo2',</w:t>
         <w:br/>
-        <w:t xml:space="preserve">    titulo: 'Módulo 2: Arquitectura de Intervención Clínica',</w:t>
+        <w:t xml:space="preserve">    titulo: 'Módulo 2: Arquitectura de Intervenciones de Coaching',</w:t>
         <w:br/>
         <w:t xml:space="preserve">    descripcion: 'Estructura estándar de sesión y repertorio de técnicas conversacionales.',</w:t>
         <w:br/>
@@ -3105,7 +3646,7 @@
         <w:br/>
         <w:t xml:space="preserve">    id: 'modulo9',</w:t>
         <w:br/>
-        <w:t xml:space="preserve">    titulo: 'Módulo 9: Guía Clínica: Parálisis y Sobreanálisis',</w:t>
+        <w:t xml:space="preserve">    titulo: 'Módulo 9: Parálisis, Sobreanálisis y Acción',</w:t>
         <w:br/>
         <w:t xml:space="preserve">    descripcion: 'Especialización en desbloqueo cognitivo, interrupción de parálisis y acción masiva.',</w:t>
         <w:br/>
@@ -3408,7 +3949,7 @@
         <w:br/>
         <w:t xml:space="preserve">    instrucciones: [</w:t>
         <w:br/>
-        <w:t xml:space="preserve">      "Cada persona escribe 3 compromisos que está dispuesto a hacer en los próximos 7 días.",</w:t>
+        <w:t xml:space="preserve">      "Cada persona escribe sus compromisos de impacto (estándar mínimo 7 personas) que está dispuesto a hacer en los próximos 7 días. Nota: El estándar mínimo de 7 personas no es tu meta. Es el reflejo de tu estándar. Si tu estándar es alto, 7 personas será solo el comienzo.",</w:t>
         <w:br/>
         <w:t xml:space="preserve">      "En plenaria, cada uno 'subasta' sus compromisos: los lee en voz alta.",</w:t>
         <w:br/>
@@ -3794,7 +4335,7 @@
         <w:br/>
         <w:t xml:space="preserve">    instrucciones: [</w:t>
         <w:br/>
-        <w:t xml:space="preserve">      "Cada persona escribe su 'futuro imposible' (algo que desea pero cree inalcanzable).",</w:t>
+        <w:t xml:space="preserve">      "Cada persona escribe su 'futuro de posibilidad' (algo que desea pero cree inalcanzable).",</w:t>
         <w:br/>
         <w:t xml:space="preserve">      "Formen un 'tribunal' con 3 roles: Fiscal (cuestiona por qué es imposible), Defensor (argumenta por qué es posible), Juez (decide si vale la pena intentarlo).",</w:t>
         <w:br/>
@@ -5072,7 +5613,7 @@
         <w:br/>
         <w:t xml:space="preserve">        fase: "3. Declaración",</w:t>
         <w:br/>
-        <w:t xml:space="preserve">        herramienta: "Declaración: 'Mi futuro imposible es... y estoy dispuesto a...'",</w:t>
+        <w:t xml:space="preserve">        herramienta: "Declaración: 'Mi futuro de posibilidad es... y estoy dispuesto a...'",</w:t>
         <w:br/>
         <w:t xml:space="preserve">        instrucciones: "Declarar el futuro y el compromiso de intentarlo."</w:t>
         <w:br/>
@@ -5084,7 +5625,7 @@
         <w:br/>
         <w:t xml:space="preserve">        herramienta: "Checkpoint 7 días",</w:t>
         <w:br/>
-        <w:t xml:space="preserve">        instrucciones: "Reportar: '¿Qué paso diste hacia tu futuro imposible?'"</w:t>
+        <w:t xml:space="preserve">        instrucciones: "Reportar: '¿Qué paso diste hacia tu futuro de posibilidad?'"</w:t>
         <w:br/>
         <w:t xml:space="preserve">      }</w:t>
         <w:br/>
@@ -5221,7 +5762,7 @@
         <w:br/>
         <w:t xml:space="preserve">      &lt;div class="alert-info"&gt;</w:t>
         <w:br/>
-        <w:t xml:space="preserve">        &lt;p&gt;&lt;strong&gt;Este documento constituye el manual académico y metodológico&lt;/strong&gt; diseñado para la estandarización de competencias en el ámbito del coaching de alto rendimiento, la transformación profunda y la regulación emocional.&lt;/p&gt;</w:t>
+        <w:t xml:space="preserve">        &lt;p&gt;&lt;strong&gt;Este documento constituye el manual académico y metodológico&lt;/strong&gt; diseñado para la estandarización de competencias en el ámbito del coaching de alto rendimiento, la transformación profunda, la presencia y la gestión de estados.&lt;/p&gt;</w:t>
         <w:br/>
         <w:t xml:space="preserve">      &lt;/div&gt;</w:t>
         <w:br/>
@@ -5318,7 +5859,7 @@
         <w:br/>
         <w:t xml:space="preserve">      &lt;div class="glass-panel" style="padding: 1.5rem; margin-top: 1.5rem;"&gt;</w:t>
         <w:br/>
-        <w:t xml:space="preserve">        &lt;p&gt;&lt;strong&gt;El observador y el contexto:&lt;/strong&gt; Nuestras preguntas, categorías y decisiones influyen en la experiencia que tenemos de los sistemas humanos y en las posibilidades de acción que percibimos. (Inspirado analógicamente en el Efecto Observador).&lt;/p&gt;</w:t>
+        <w:t xml:space="preserve">        &lt;p&gt;&lt;strong&gt;El observador y el contexto:&lt;/strong&gt; Nuestras preguntas, categorías, interpretaciones y decisiones influyen en la manera en que experimentamos una situación y en las posibilidades de acción que identificamos.&lt;/p&gt;</w:t>
         <w:br/>
         <w:t xml:space="preserve">        &lt;p&gt;&lt;strong&gt;Definición Operativa:&lt;/strong&gt; Consiste en un proceso sistémico de expansión perceptual que utiliza la metáfora de cambio no lineal, la reestructuración del lenguaje, el diseño de promesas y la habituación estratégica para catalizar saltos cualitativos en el desarrollo personal.&lt;/p&gt;</w:t>
         <w:br/>
@@ -5421,13 +5962,13 @@
         <w:br/>
         <w:t xml:space="preserve">    id: "m1_l4",</w:t>
         <w:br/>
-        <w:t xml:space="preserve">    title: "1.4 Regulación Emocional y Anclaje (Grounding)",</w:t>
+        <w:t xml:space="preserve">    title: "1.4 Presencia, Autorregulación y Anclaje (Grounding)",</w:t>
         <w:br/>
         <w:t xml:space="preserve">    content: `</w:t>
         <w:br/>
         <w:t xml:space="preserve">      &lt;h3&gt;1.4.1 Definición y Mecanismos&lt;/h3&gt;</w:t>
         <w:br/>
-        <w:t xml:space="preserve">      &lt;p&gt;El &lt;span class="highlight-text"&gt;Grounding (técnica de anclaje somático)&lt;/span&gt; es una intervención psico-fisiológica breve diseñada para modular la reactividad del sistema nervioso autónomo y restablecer la homeostasis. Sus funciones clínicas y operativas principales son:&lt;/p&gt;</w:t>
+        <w:t xml:space="preserve">      &lt;p&gt;El &lt;span class="highlight-text"&gt;Grounding (técnica de anclaje)&lt;/span&gt; es una práctica breve de atención corporal, respiración y presencia utilizada para favorecer el enfoque, disminuir distracciones y preparar al participante para una conversación o actividad. Sus funciones operativas principales son:&lt;/p&gt;</w:t>
         <w:br/>
         <w:t xml:space="preserve">      </w:t>
         <w:br/>
@@ -5486,7 +6027,7 @@
         <w:br/>
         <w:t xml:space="preserve">        &lt;li&gt;&lt;strong&gt;Eficiencia cognitiva (Simplicidad):&lt;/strong&gt; Empleo de instrucciones unívocas, directas y desprovistas de abstracciones complejas.&lt;/li&gt;</w:t>
         <w:br/>
-        <w:t xml:space="preserve">        &lt;li&gt;&lt;strong&gt;Viabilidad contextual (Accesibilidad):&lt;/strong&gt; Capacidad de ejecución autónoma en entornos cotidianos sin requerir instrumentación clínica especializada.&lt;/li&gt;</w:t>
+        <w:t xml:space="preserve">        &lt;li&gt;&lt;strong&gt;Viabilidad contextual (Accesibilidad):&lt;/strong&gt; Capacidad de ejecución autónoma en entornos cotidianos sin requerir instrumentación o acompañamiento especializado.&lt;/li&gt;</w:t>
         <w:br/>
         <w:t xml:space="preserve">        &lt;li&gt;&lt;strong&gt;Bioseguridad y contención:&lt;/strong&gt; Exclusión categórica de estímulos o posturas que puedan inducir desregulación traumática o riesgo físico.&lt;/li&gt;</w:t>
         <w:br/>
@@ -5625,7 +6166,7 @@
         <w:br/>
         <w:t xml:space="preserve">            &lt;li&gt;Acompañar en el diseño de planes de acción verificables.&lt;/li&gt;</w:t>
         <w:br/>
-        <w:t xml:space="preserve">            &lt;li&gt;Enseñar técnicas breves de regulación emocional (groundings) para la claridad cognitiva temporal.&lt;/li&gt;</w:t>
+        <w:t xml:space="preserve">            &lt;li&gt;Enseñar técnicas breves de autorregulación y gestión de estados (groundings) para la claridad cognitiva temporal.&lt;/li&gt;</w:t>
         <w:br/>
         <w:t xml:space="preserve">            &lt;li&gt;Desafiar las excusas operativas y el sobreanálisis.&lt;/li&gt;</w:t>
         <w:br/>
@@ -5677,7 +6218,7 @@
         <w:br/>
         <w:t xml:space="preserve">          &lt;tr&gt;</w:t>
         <w:br/>
-        <w:t xml:space="preserve">            &lt;td&gt;&lt;strong&gt;Incapacidad persistente para actuar:&lt;/strong&gt; El cliente experimenta parálisis total, ataques de pánico ante la idea de tomar acción, o desregulación emocional severa que no cede con groundings.&lt;/td&gt;</w:t>
+        <w:t xml:space="preserve">            &lt;td&gt;&lt;strong&gt;Incapacidad persistente para actuar:&lt;/strong&gt; El cliente experimenta parálisis total, ataques de pánico ante la idea de tomar acción, o alteración de estado persistente que no cede con groundings.&lt;/td&gt;</w:t>
         <w:br/>
         <w:t xml:space="preserve">            &lt;td&gt;Detener la exploración ontológica. Reconocer la sobrecarga ("Veo que esto es muy pesado"). Sugerir evaluación psicológica antes de continuar el coaching.&lt;/td&gt;</w:t>
         <w:br/>
@@ -5763,7 +6304,7 @@
         <w:t xml:space="preserve">      &lt;/div&gt;</w:t>
         <w:br/>
         <w:br/>
-        <w:t xml:space="preserve">      &lt;h3&gt;Fuentes de la Creatividad Clínica&lt;/h3&gt;</w:t>
+        <w:t xml:space="preserve">      &lt;h3&gt;Fuentes de la Creatividad en el Coaching&lt;/h3&gt;</w:t>
         <w:br/>
         <w:t xml:space="preserve">      &lt;ul class="icon-list blue-bullets"&gt;</w:t>
         <w:br/>
@@ -6576,9 +7117,9 @@
         <w:br/>
         <w:t xml:space="preserve">        &lt;p&gt;&lt;strong&gt;2.3.1 Pasos para Diseñar un Grounding&lt;/strong&gt;&lt;/p&gt;</w:t>
         <w:br/>
-        <w:t xml:space="preserve">        &lt;p style="font-size: 0.95rem;"&gt;Un Grounding es una intervención psico-fisiológica breve diseñada para modular la reactividad del sistema nervioso autónomo y restablecer la homeostasis. Puede apoyar la claridad mental y la regulación emocional, pero no sustituye el análisis, la evidencia objetiva ni un proceso terapéutico.&lt;/p&gt;</w:t>
-        <w:br/>
-        <w:t xml:space="preserve">        &lt;p&gt;El diseño de una intervención de anclaje requiere ejecutar seis pasos metodológicos estrictos para garantizar su eficacia neurofisiológica.&lt;/p&gt;</w:t>
+        <w:t xml:space="preserve">        &lt;p style="font-size: 0.95rem;"&gt;Un Grounding es una práctica breve de atención corporal, respiración y presencia utilizada para favorecer el enfoque, disminuir distracciones y preparar al participante para una conversación o actividad. Puede apoyar la claridad mental y la gestión de estados, pero no sustituye el análisis, la evidencia objetiva ni un proceso terapéutico.&lt;/p&gt;</w:t>
+        <w:br/>
+        <w:t xml:space="preserve">        &lt;p&gt;El diseño de una intervención de anclaje requiere ejecutar seis pasos metodológicos estrictos para garantizar su eficacia en la gestión de estados.&lt;/p&gt;</w:t>
         <w:br/>
         <w:t xml:space="preserve">      &lt;/div&gt;</w:t>
         <w:br/>
@@ -7296,7 +7837,7 @@
         <w:br/>
         <w:t xml:space="preserve">        &lt;li&gt;&lt;strong&gt;El Mapa de la Angustia (Herramienta 5):&lt;/strong&gt; Identifica una situación angustiante y pregúntate: "¿Qué libertad estoy evitando ejercer?". Declara que esa angustia te está diciendo que eres libre de elegir distinto.&lt;/li&gt;</w:t>
         <w:br/>
-        <w:t xml:space="preserve">        &lt;li&gt;&lt;strong&gt;El Salto de Posibilidad Existencial (Herramienta 6):&lt;/strong&gt; Define un futuro imposible sin garantías. Da un paso HOY sabiendo que podrías fracasar. Aprende a vivir con la incertidumbre, ese es el "Caballero de la Fe" de Kierkegaard.&lt;/li&gt;</w:t>
+        <w:t xml:space="preserve">        &lt;li&gt;&lt;strong&gt;El Salto de Posibilidad Existencial (Herramienta 6):&lt;/strong&gt; Define un futuro de posibilidad sin garantías. Da un paso HOY sabiendo que podrías fracasar. Aprende a vivir con la incertidumbre, ese es el "Caballero de la Fe" de Kierkegaard.&lt;/li&gt;</w:t>
         <w:br/>
         <w:t xml:space="preserve">      &lt;/ul&gt;</w:t>
         <w:br/>
@@ -7511,7 +8052,7 @@
         <w:br/>
         <w:t xml:space="preserve">        &lt;li&gt;&lt;strong&gt;H11: El Observador del Líder:&lt;/strong&gt; Identifica un problema. Obsérvalo desde 3 perspectivas distintas (como coach externo, como cliente, como tu yo del futuro). Elige la que te otorgue agencia.&lt;/li&gt;</w:t>
         <w:br/>
-        <w:t xml:space="preserve">        &lt;li&gt;&lt;strong&gt;H12: El Salto de Posibilidad del Líder:&lt;/strong&gt; ¿Qué creencia tendrías que SOLTAR y qué identidad ADOPTAR para llegar a ese futuro imposible de un solo paso? Actúa desde esa identidad HOY.&lt;/li&gt;</w:t>
+        <w:t xml:space="preserve">        &lt;li&gt;&lt;strong&gt;H12: El Salto de Posibilidad del Líder:&lt;/strong&gt; ¿Qué creencia tendrías que SOLTAR y qué identidad ADOPTAR para llegar a ese futuro de posibilidad de un solo paso? Actúa desde esa identidad HOY.&lt;/li&gt;</w:t>
         <w:br/>
         <w:t xml:space="preserve">      &lt;/ul&gt;</w:t>
         <w:br/>
@@ -7564,7 +8105,7 @@
         <w:br/>
         <w:t xml:space="preserve">      &lt;h3&gt;Ser Enrolamiento&lt;/h3&gt;</w:t>
         <w:br/>
-        <w:t xml:space="preserve">      &lt;p&gt;Enrolar no es persuadir ni convencer; es invitar a otros a habitar futuros imposibles desde tu propia presencia y congruencia.&lt;/p&gt;</w:t>
+        <w:t xml:space="preserve">      &lt;p&gt;Enrolar no es persuadir ni convencer; es invitar a otros a habitar futuros de posibilidad desde tu propia presencia y congruencia.&lt;/p&gt;</w:t>
         <w:br/>
         <w:t xml:space="preserve">      </w:t>
         <w:br/>
@@ -7590,7 +8131,7 @@
         <w:br/>
         <w:t xml:space="preserve">              &lt;td&gt;&lt;strong class="text-gold"&gt;H15. Mapa de Enrolamiento&lt;/strong&gt;&lt;/td&gt;</w:t>
         <w:br/>
-        <w:t xml:space="preserve">              &lt;td&gt;Dibuja tu futuro imposible en el centro. Alrededor pon 10 personas a las que podrías sumar. Identifica el futuro imposible de ELLOS y conéctalo al tuyo.&lt;/td&gt;</w:t>
+        <w:t xml:space="preserve">              &lt;td&gt;Dibuja tu futuro de posibilidad en el centro. Alrededor, escribe los nombres de mínimo 7 personas (idealmente 10+) que podrían vivir una vida extraordinaria. Identifica el futuro de posibilidad de ELLOS y conéctalo al tuyo. Importante: El número 7 no es tu meta. Es el reflejo de un estándar alto. No busques impactar 7 personas por cumplir. Busca un estándar tan alto que 7 personas sea solo el comienzo.&lt;/td&gt;</w:t>
         <w:br/>
         <w:t xml:space="preserve">            &lt;/tr&gt;</w:t>
         <w:br/>
@@ -7598,7 +8139,7 @@
         <w:br/>
         <w:t xml:space="preserve">              &lt;td&gt;&lt;strong class="text-blue"&gt;H16. Declaración de Expansión&lt;/strong&gt;&lt;/td&gt;</w:t>
         <w:br/>
-        <w:t xml:space="preserve">              &lt;td&gt;"Me comprometo a enrolar a X personas en los próximos Y días para que vivan sus futuros imposibles". Expande a otros para que ellos expandan a más.&lt;/td&gt;</w:t>
+        <w:t xml:space="preserve">              &lt;td&gt;"Me comprometo a impactar al máximo de personas posible, con un estándar mínimo de 7 personas en los próximos Y días para que vivan una vida extraordinaria." Expande a otros para que ellos expandan a más. Nota: El estándar mínimo de 7 personas no es tu meta. Es el reflejo de tu estándar. Si tu estándar es alto, 7 personas será solo el comienzo.&lt;/td&gt;</w:t>
         <w:br/>
         <w:t xml:space="preserve">            &lt;/tr&gt;</w:t>
         <w:br/>
@@ -7626,7 +8167,7 @@
         <w:br/>
         <w:t xml:space="preserve">  &lt;h3 style="margin-top: 0; color: var(--crear-gold);"&gt;¿Qué es un Maestro Enrolador?&lt;/h3&gt;</w:t>
         <w:br/>
-        <w:t xml:space="preserve">  &lt;p&gt;Un &lt;strong&gt;Maestro Enrolador&lt;/strong&gt; no es alguien que "hace enrolamiento". Es alguien que &lt;strong&gt;ES enrolamiento&lt;/strong&gt;. Su presencia, su palabra y su acción generan un campo que invita a otros a expandirse hacia sus futuros imposibles.&lt;/p&gt;</w:t>
+        <w:t xml:space="preserve">  &lt;p&gt;Un &lt;strong&gt;Maestro Enrolador&lt;/strong&gt; no es alguien que "hace enrolamiento". Es alguien que &lt;strong&gt;ES enrolamiento&lt;/strong&gt;. Su presencia, su palabra y su acción generan un campo que invita a otros a expandirse hacia sus futuros de posibilidad.&lt;/p&gt;</w:t>
         <w:br/>
         <w:t>&lt;/div&gt;</w:t>
         <w:br/>
@@ -7726,7 +8267,7 @@
         <w:br/>
         <w:t xml:space="preserve">  &lt;div class="glass-panel" style="padding: 1.5rem; border-left: 3px solid #00e676;"&gt;</w:t>
         <w:br/>
-        <w:t xml:space="preserve">    &lt;h5 style="margin-top: 0;"&gt;Nivel 4: El Expansor&lt;/h5&gt;&lt;p&gt;&lt;strong&gt;Enfoque:&lt;/strong&gt; "¿Cuál es tu futuro imposible?"&lt;/p&gt;&lt;p&gt;&lt;strong&gt;Herramienta:&lt;/strong&gt; Preguntas poderosas.&lt;/p&gt;&lt;p&gt;&lt;strong&gt;Limitación:&lt;/strong&gt; Aún hay "yo" que expande.&lt;/p&gt;</w:t>
+        <w:t xml:space="preserve">    &lt;h5 style="margin-top: 0;"&gt;Nivel 4: El Expansor&lt;/h5&gt;&lt;p&gt;&lt;strong&gt;Enfoque:&lt;/strong&gt; "¿Cuál es tu futuro de posibilidad?"&lt;/p&gt;&lt;p&gt;&lt;strong&gt;Herramienta:&lt;/strong&gt; Preguntas poderosas.&lt;/p&gt;&lt;p&gt;&lt;strong&gt;Limitación:&lt;/strong&gt; Aún hay "yo" que expande.&lt;/p&gt;</w:t>
         <w:br/>
         <w:t xml:space="preserve">  &lt;/div&gt;</w:t>
         <w:br/>
@@ -7779,7 +8320,7 @@
         <w:br/>
         <w:t xml:space="preserve">    &lt;h4 style="margin: 0 0 0.5rem 0;"&gt;3: No Convenzo, Expando&lt;/h4&gt;</w:t>
         <w:br/>
-        <w:t xml:space="preserve">    &lt;p&gt;&lt;strong&gt;Novato:&lt;/strong&gt; "Tienes que hacer esto." | &lt;strong&gt;Maestro:&lt;/strong&gt; "¿Qué futuro imposible estás evitando crear?"&lt;/p&gt;</w:t>
+        <w:t xml:space="preserve">    &lt;p&gt;&lt;strong&gt;Novato:&lt;/strong&gt; "Tienes que hacer esto." | &lt;strong&gt;Maestro:&lt;/strong&gt; "¿Qué futuro de posibilidad estás evitando crear?"&lt;/p&gt;</w:t>
         <w:br/>
         <w:t xml:space="preserve">    &lt;p style="margin-bottom: 0;"&gt;&lt;strong&gt;Práctica:&lt;/strong&gt; El otro se expande no por lo que dices, sino por lo que tú ves en él.&lt;/p&gt;</w:t>
         <w:br/>
@@ -7861,7 +8402,7 @@
         <w:br/>
         <w:t xml:space="preserve">    &lt;p&gt;&lt;strong&gt;Novato:&lt;/strong&gt; "Quiero que me sigan." | &lt;strong&gt;Maestro:&lt;/strong&gt; "Quiero que sean líderes."&lt;/p&gt;</w:t>
         <w:br/>
-        <w:t xml:space="preserve">    &lt;p style="margin-bottom: 0;"&gt;&lt;strong&gt;Práctica:&lt;/strong&gt; Busca crear líderes que creen otros líderes.&lt;/p&gt;</w:t>
+        <w:t xml:space="preserve">    &lt;p style="margin-bottom: 0;"&gt;&lt;strong&gt;Práctica:&lt;/strong&gt; Busca crear líderes que impacten a mínimo 7 personas cada uno. Nota: El número 7 no es tu meta. Es el reflejo de un estándar alto. No busques impactar 7 personas por cumplir. Busca un estándar tan alto que 7 personas sea solo el comienzo.&lt;/p&gt;</w:t>
         <w:br/>
         <w:t xml:space="preserve">  &lt;/div&gt;</w:t>
         <w:br/>
@@ -7869,7 +8410,7 @@
         <w:br/>
         <w:t xml:space="preserve">    &lt;h4 style="margin: 0 0 0.5rem 0;"&gt;12: No Termino, Expando&lt;/h4&gt;</w:t>
         <w:br/>
-        <w:t xml:space="preserve">    &lt;p&gt;&lt;strong&gt;Novato:&lt;/strong&gt; "Ya lo enrolé. Listo." | &lt;strong&gt;Maestro:&lt;/strong&gt; "Lo enrolé. Él enrola a otros. Expansión infinita."&lt;/p&gt;</w:t>
+        <w:t xml:space="preserve">    &lt;p&gt;&lt;strong&gt;Novato:&lt;/strong&gt; "Ya lo enrolé. Listo." | &lt;strong&gt;Maestro:&lt;/strong&gt; "Impacto a mínimo 7 personas. Ellas impactan a otras. Expansión infinita. Importante: El número 7 no es mi meta. Es el reflejo de mi estándar. No busco impactar 7 personas por cumplir. Busco un estándar tan alto que 7 personas sea solo el comienzo."&lt;/p&gt;</w:t>
         <w:br/>
         <w:t xml:space="preserve">    &lt;p style="margin-bottom: 0;"&gt;&lt;strong&gt;Práctica:&lt;/strong&gt; El efecto multiplicador es el legado.&lt;/p&gt;</w:t>
         <w:br/>
@@ -7890,7 +8431,7 @@
         <w:br/>
         <w:t xml:space="preserve">      &lt;li&gt;&lt;strong&gt;1. Presencia Plena:&lt;/strong&gt; 100% presente, el otro se siente visto. Cultívalo con groundings y meditación.&lt;/li&gt;</w:t>
         <w:br/>
-        <w:t xml:space="preserve">      &lt;li&gt;&lt;strong&gt;2. Claridad de Visión:&lt;/strong&gt; Hablar con certeza. Lee tu futuro imposible diariamente.&lt;/li&gt;</w:t>
+        <w:t xml:space="preserve">      &lt;li&gt;&lt;strong&gt;2. Claridad de Visión:&lt;/strong&gt; Hablar con certeza. Lee tu futuro de posibilidad diariamente.&lt;/li&gt;</w:t>
         <w:br/>
         <w:t xml:space="preserve">      &lt;li&gt;&lt;strong&gt;3. Congruencia Radical:&lt;/strong&gt; Tu palabra, acción y ser están alineados.&lt;/li&gt;</w:t>
         <w:br/>
@@ -7929,7 +8470,7 @@
         <w:br/>
         <w:t xml:space="preserve">  &lt;h4 style="margin-top: 0; color: var(--text-main);"&gt;Prácticas Diarias&lt;/h4&gt;</w:t>
         <w:br/>
-        <w:t xml:space="preserve">  &lt;p&gt;&lt;strong&gt;1. Declaración (5m):&lt;/strong&gt; "Hoy soy enrolamiento. Visualiza a 3 personas expandidas."&lt;/p&gt;</w:t>
+        <w:t xml:space="preserve">  &lt;p&gt;&lt;strong&gt;1. Declaración (5m):&lt;/strong&gt; "Hoy soy enrolamiento. Visualiza a mínimo 7 personas a quienes impactas hoy. Importante: El número 7 no es tu meta. Es el reflejo de tu estándar. No busques impactar 7 personas por cumplir. Busca un estándar tan alto que 7 personas sea solo el comienzo."&lt;/p&gt;</w:t>
         <w:br/>
         <w:t xml:space="preserve">  &lt;p&gt;&lt;strong&gt;2. Grounding (2m):&lt;/strong&gt; Antes de interactuar, respira y declara presencia.&lt;/p&gt;</w:t>
         <w:br/>
@@ -7943,7 +8484,7 @@
         <w:br/>
         <w:t xml:space="preserve">  &lt;h4 style="margin-top: 2rem; color: var(--crear-blue);"&gt;El Legado&lt;/h4&gt;</w:t>
         <w:br/>
-        <w:t xml:space="preserve">  &lt;p style="font-size: 1.1rem; color: var(--text-muted); font-style: italic;"&gt;"Un Maestro Enrolador se caracteriza por su efecto multiplicador: facilita que otras personas se expandan y contribuyan, a su vez, al desarrollo de liderazgo en sus propios entornos."&lt;/p&gt;</w:t>
+        <w:t xml:space="preserve">  &lt;p style="font-size: 1.1rem; color: var(--text-muted); font-style: italic;"&gt;"Un Maestro Enrolador no se mide por: ❌ Cuántas personas enrola (el número es un indicador, no el propósito). ✅ Se mide por cuántas personas viven una vida extraordinaria (estándar mínimo 7, idealmente ilimitadas). Nota: El estándar mínimo de 7 personas no es tu meta. Es el reflejo de tu estándar. Si tu estándar es alto, 7 personas será solo el comienzo."&lt;/p&gt;</w:t>
         <w:br/>
         <w:t>&lt;/div&gt;</w:t>
         <w:br/>
@@ -8129,7 +8670,7 @@
         <w:br/>
         <w:t xml:space="preserve">    id: "m9_l2",</w:t>
         <w:br/>
-        <w:t xml:space="preserve">    title: "Estrategias Clínicas de Choque (1-5)",</w:t>
+        <w:t xml:space="preserve">    title: "Estrategias de Choque y Expansión (1-5)",</w:t>
         <w:br/>
         <w:t xml:space="preserve">    content: `</w:t>
         <w:br/>
@@ -8365,7 +8906,7 @@
         <w:br/>
         <w:t xml:space="preserve">    titulo: "Visión del Programa",</w:t>
         <w:br/>
-        <w:t xml:space="preserve">    texto: "Este programa no te enseña a 'hacer' enrolamiento. Te entrena para SER enrolamiento. Entrenamos a equipos para convertirse en creadores de contexto de alto rendimiento, de modo que: 1) Vivan sus futuros imposibles, 2) Enrolen a al menos 3 personas, 3) Entrenen a otros a ser enrolamiento.",</w:t>
+        <w:t xml:space="preserve">    texto: "Este programa no te enseña a 'hacer' enrolamiento. Te entrena para SER enrolamiento. Entrenamos a equipos para convertirse en creadores de contexto de alto rendimiento, de modo que: 1) Vivan sus futuros de posibilidad, 2) Impacten al máximo de personas posible, con un estándar mínimo de 7 personas para que vivan una vida extraordinaria. Importante: El número 7 no es la meta. Es el reflejo de un estándar alto. No busques impactar 7 personas por cumplir. Busca un estándar tan alto que 7 personas sea solo el comienzo. 3) Entrenen a otros a ser enrolamiento.",</w:t>
         <w:br/>
         <w:t xml:space="preserve">    detalles: [</w:t>
         <w:br/>
@@ -8417,7 +8958,7 @@
         <w:br/>
         <w:t xml:space="preserve">        { fuente: "Principios de Posibilidad", concepto: "El observador crea la realidad que observa", aplicacion: "El líder observa posibilidades, no limitaciones, y eso crea realidad" },</w:t>
         <w:br/>
-        <w:t xml:space="preserve">        { fuente: "Coaching de Alto Rendimiento", concepto: "La transformación no es lineal, es un salto desde el futuro", aplicacion: "El líder diseña desde el futuro imposible, no desde el problema actual" }</w:t>
+        <w:t xml:space="preserve">        { fuente: "Coaching de Alto Rendimiento", concepto: "La transformación no es lineal, es un salto desde el futuro", aplicacion: "El líder diseña desde el futuro de posibilidad, no desde el problema actual" }</w:t>
         <w:br/>
         <w:t xml:space="preserve">      ]</w:t>
         <w:br/>
@@ -8445,9 +8986,9 @@
         <w:br/>
         <w:t xml:space="preserve">          nombre: "2. Enrolamiento",</w:t>
         <w:br/>
-        <w:t xml:space="preserve">          compromiso: "Invitar a otros a sumarse a la visión.",</w:t>
-        <w:br/>
-        <w:t xml:space="preserve">          practica: ["Compartes tu futuro imposible.", "Invitas (no presionas) a otros a crear el suyo.", "Celebras su expansión, no tu 'logro' de enrolarlos."],</w:t>
+        <w:t xml:space="preserve">          compromiso: "Invitar a otros a sumarse a la visión. Impacta al máximo de personas posible, con un estándar mínimo de 7 personas para que vivan una vida extraordinaria. Nota: El número 7 no es tu meta. Es el reflejo de tu estándar. Si tu estándar es alto, 7 personas será solo el comienzo.",</w:t>
+        <w:br/>
+        <w:t xml:space="preserve">          practica: ["Compartes tu futuro de posibilidad.", "Invitas (no presionas) a otros a crear el suyo.", "Celebras su expansión, no tu 'logro' de enrolarlos."],</w:t>
         <w:br/>
         <w:t xml:space="preserve">          impacto: "Creas un movimiento, no un equipo."</w:t>
         <w:br/>
@@ -8467,11 +9008,11 @@
         <w:br/>
         <w:t xml:space="preserve">        {</w:t>
         <w:br/>
-        <w:t xml:space="preserve">          nombre: "4. Futuros Imposibles",</w:t>
+        <w:t xml:space="preserve">          nombre: "4. Futuros de Posibilidad",</w:t>
         <w:br/>
         <w:t xml:space="preserve">          compromiso: "Mantener viva la visión de lo que es posible crear.",</w:t>
         <w:br/>
-        <w:t xml:space="preserve">          practica: ["Declaras tu futuro imposible (no tu meta 'realista').", "Actúas desde ese futuro, no desde tu presente.", "Inspiras a otros a declarar los suyos."],</w:t>
+        <w:t xml:space="preserve">          practica: ["Declaras tu futuro de posibilidad (no tu meta 'realista').", "Actúas desde ese futuro, no desde tu presente.", "Inspiras a otros a declarar los suyos."],</w:t>
         <w:br/>
         <w:t xml:space="preserve">          impacto: "Creas un campo de posibilidad, no de limitación."</w:t>
         <w:br/>
@@ -8495,7 +9036,7 @@
         <w:br/>
         <w:t xml:space="preserve">    {</w:t>
         <w:br/>
-        <w:t xml:space="preserve">      titulo: "El Propósito: Vivir Futuros Imposibles",</w:t>
+        <w:t xml:space="preserve">      titulo: "El Propósito: Vivir Futuros de Posibilidad",</w:t>
         <w:br/>
         <w:t xml:space="preserve">      definicion: "Una aspiración que hoy parece inalcanzable, pero que se declara como posible de crear. No es una meta SMART ni un objetivo 'realista'. Es una declaración audaz, un salto de posibilidad, un compromiso con lo extraordinario.",</w:t>
         <w:br/>
@@ -8515,7 +9056,7 @@
         <w:br/>
         <w:t xml:space="preserve">        {</w:t>
         <w:br/>
-        <w:t xml:space="preserve">          nombre: "1. Vivir tu Futuro Imposible",</w:t>
+        <w:t xml:space="preserve">          nombre: "1. Vivir tu Futuro de Posibilidad",</w:t>
         <w:br/>
         <w:t xml:space="preserve">          descripcion: "No solo declararlo. Lo vives HOY, no 'cuando esté listo'.",</w:t>
         <w:br/>
@@ -8525,11 +9066,11 @@
         <w:br/>
         <w:t xml:space="preserve">        {</w:t>
         <w:br/>
-        <w:t xml:space="preserve">          nombre: "2. Enrolar a 3 Personas",</w:t>
-        <w:br/>
-        <w:t xml:space="preserve">          descripcion: "No solo inspirarlas. Las enrolos activamente a vivir SUS futuros imposibles.",</w:t>
-        <w:br/>
-        <w:t xml:space="preserve">          como: ["Compartes tu futuro imposible.", "Les preguntas: '¿Cuál es el TUYO?'", "Las acompañas a declararlo y vivirlo."]</w:t>
+        <w:t xml:space="preserve">          nombre: "2. Impactar al Máximo de Personas",</w:t>
+        <w:br/>
+        <w:t xml:space="preserve">          descripcion: "No solo inspirarlas. Las impactas activamente para que vivan una vida extraordinaria. Estándar mínimo: 7 personas. Importante: El estándar mínimo de 7 personas no es tu meta. Es el reflejo de un estándar alto. No busques impactar 7 personas por cumplir. Busca un estándar tan alto que 7 personas sea solo el comienzo.",</w:t>
+        <w:br/>
+        <w:t xml:space="preserve">          como: ["Compartes tu futuro de posibilidad.", "Les preguntas: '¿Cuál es el TUYO?'", "Las acompañas a declararlo y vivirlo."]</w:t>
         <w:br/>
         <w:t xml:space="preserve">        },</w:t>
         <w:br/>
@@ -8606,21 +9147,21 @@
         <w:br/>
         <w:t xml:space="preserve">    id: 3,</w:t>
         <w:br/>
-        <w:t xml:space="preserve">    nombre: "El Contrato de Futuros Imposibles",</w:t>
-        <w:br/>
-        <w:t xml:space="preserve">    proposito: "Declarar y sostener el futuro imposible personal y del equipo.",</w:t>
+        <w:t xml:space="preserve">    nombre: "El Contrato de Futuros de Posibilidad",</w:t>
+        <w:br/>
+        <w:t xml:space="preserve">    proposito: "Declarar y sostener el futuro de posibilidad personal y del equipo.",</w:t>
         <w:br/>
         <w:t xml:space="preserve">    uso: "Contrato firmado y visible.",</w:t>
         <w:br/>
         <w:t xml:space="preserve">    estructuraList: [</w:t>
         <w:br/>
-        <w:t xml:space="preserve">      "1. Mi futuro imposible: (describir en presente, como si ya fuera real)",</w:t>
+        <w:t xml:space="preserve">      "1. Mi futuro de posibilidad: (describir en presente, como si ya fuera real)",</w:t>
         <w:br/>
         <w:t xml:space="preserve">      "2. Quién tengo que ser: (qué versión de mí tiene que existir)",</w:t>
         <w:br/>
         <w:t xml:space="preserve">      "3. Acciones diarias: (3 acciones concretas que me alinean)",</w:t>
         <w:br/>
-        <w:t xml:space="preserve">      "4. A quién enrolo: (3 personas a quienes enrolo)",</w:t>
+        <w:t xml:space="preserve">      "4. A quién impacto: (Estándar mínimo: 7 personas a quienes impactas para que vivan una vida extraordinaria. Nota: El estándar mínimo de 7 personas no es tu meta. Es el reflejo de tu estándar. Si tu estándar es alto, 7 personas será solo el comienzo)",</w:t>
         <w:br/>
         <w:t xml:space="preserve">      "5. Checkpoint: (fecha de reporte de progreso)"</w:t>
         <w:br/>
@@ -8695,13 +9236,13 @@
         <w:br/>
         <w:t xml:space="preserve">    herramientasClave: "Brújula del Enrolamiento, Mapa del Contexto",</w:t>
         <w:br/>
-        <w:t xml:space="preserve">    compromiso: "Declara tu futuro imposible",</w:t>
+        <w:t xml:space="preserve">    compromiso: "Declara tu futuro de posibilidad",</w:t>
         <w:br/>
         <w:t xml:space="preserve">    dias: [</w:t>
         <w:br/>
-        <w:t xml:space="preserve">      { dia: 1, reto: "Declara tu futuro imposible por escrito. Compártelo con el equipo." },</w:t>
-        <w:br/>
-        <w:t xml:space="preserve">      { dia: 2, reto: "Identifica 3 personas a quienes enrolos esta semana." },</w:t>
+        <w:t xml:space="preserve">      { dia: 1, reto: "Declara tu futuro de posibilidad por escrito. Compártelo con el equipo." },</w:t>
+        <w:br/>
+        <w:t xml:space="preserve">      { dia: 2, reto: "Identifica a mínimo 7 personas a quienes impactarás esta semana." },</w:t>
         <w:br/>
         <w:t xml:space="preserve">      { dia: 3, reto: "Practica la escucha profunda (5 minutos sin hablar, solo escuchar)." },</w:t>
         <w:br/>
@@ -8767,7 +9308,7 @@
         <w:br/>
         <w:t xml:space="preserve">      { dia: 18, reto: "Evalúa: ¿Qué contexto creaste hoy?" },</w:t>
         <w:br/>
-        <w:t xml:space="preserve">      { dia: 19, reto: "Enrola a 3 personas. Reporta." },</w:t>
+        <w:t xml:space="preserve">      { dia: 19, reto: "Impacta a mínimo 7 personas. Reporta." },</w:t>
         <w:br/>
         <w:t xml:space="preserve">      { dia: 20, reto: "Reflexiona: ¿Qué contexto te limita? ¿Cómo lo transformas?" },</w:t>
         <w:br/>
@@ -8781,25 +9322,25 @@
         <w:br/>
         <w:t xml:space="preserve">    semana: 4,</w:t>
         <w:br/>
-        <w:t xml:space="preserve">    titulo: "Vivir Futuros Imposibles",</w:t>
-        <w:br/>
-        <w:t xml:space="preserve">    herramientasClave: "Contrato de Futuros Imposibles, Silla del Futuro",</w:t>
-        <w:br/>
-        <w:t xml:space="preserve">    compromiso: "Actúa desde tu futuro imposible",</w:t>
+        <w:t xml:space="preserve">    titulo: "Vivir Futuros de Posibilidad",</w:t>
+        <w:br/>
+        <w:t xml:space="preserve">    herramientasClave: "Contrato de Futuros de Posibilidad, Silla del Futuro",</w:t>
+        <w:br/>
+        <w:t xml:space="preserve">    compromiso: "Actúa desde tu futuro de posibilidad",</w:t>
         <w:br/>
         <w:t xml:space="preserve">    dias: [</w:t>
         <w:br/>
-        <w:t xml:space="preserve">      { dia: 22, reto: "Relee tu futuro imposible. ¿Sigues comprometido?" },</w:t>
-        <w:br/>
-        <w:t xml:space="preserve">      { dia: 23, reto: "Identifica UNA acción que te acerca a tu futuro imposible. Hazla hoy." },</w:t>
-        <w:br/>
-        <w:t xml:space="preserve">      { dia: 24, reto: "Enrola a alguien a vivir SU futuro imposible." },</w:t>
-        <w:br/>
-        <w:t xml:space="preserve">      { dia: 25, reto: "Evalúa: ¿Qué te detiene de vivir tu futuro imposible?" },</w:t>
-        <w:br/>
-        <w:t xml:space="preserve">      { dia: 26, reto: "Comparte tu futuro imposible con alguien externo al equipo." },</w:t>
-        <w:br/>
-        <w:t xml:space="preserve">      { dia: 27, reto: "Reporta: ¿Qué acción tomaste hacia tu futuro imposible esta semana?" },</w:t>
+        <w:t xml:space="preserve">      { dia: 22, reto: "Relee tu futuro de posibilidad. ¿Sigues comprometido?" },</w:t>
+        <w:br/>
+        <w:t xml:space="preserve">      { dia: 23, reto: "Identifica UNA acción que te acerca a tu futuro de posibilidad. Hazla hoy." },</w:t>
+        <w:br/>
+        <w:t xml:space="preserve">      { dia: 24, reto: "Enrola a alguien a vivir SU futuro de posibilidad." },</w:t>
+        <w:br/>
+        <w:t xml:space="preserve">      { dia: 25, reto: "Evalúa: ¿Qué te detiene de vivir tu futuro de posibilidad?" },</w:t>
+        <w:br/>
+        <w:t xml:space="preserve">      { dia: 26, reto: "Comparte tu futuro de posibilidad con alguien externo al equipo." },</w:t>
+        <w:br/>
+        <w:t xml:space="preserve">      { dia: 27, reto: "Reporta: ¿Qué acción tomaste hacia tu futuro de posibilidad esta semana?" },</w:t>
         <w:br/>
         <w:t xml:space="preserve">      { dia: 28, reto: "Descansa. Integra." }</w:t>
         <w:br/>
@@ -8819,7 +9360,7 @@
         <w:br/>
         <w:t xml:space="preserve">    dias: [</w:t>
         <w:br/>
-        <w:t xml:space="preserve">      { dia: 29, reto: "Identifica a 3 personas a quienes entrenarás." },</w:t>
+        <w:t xml:space="preserve">      { dia: 29, reto: "Identifica a mínimo 7 personas a quienes impactarás. Importante: El número 7 no es tu meta. Es el reflejo de un estándar alto. No busques impactar 7 personas por cumplir. Busca un estándar tan alto que 7 personas sea solo el comienzo." },</w:t>
         <w:br/>
         <w:t xml:space="preserve">      { dia: 30, reto: "Comparte con ellas el concepto de 'ser enrolamiento'." },</w:t>
         <w:br/>
@@ -8827,7 +9368,7 @@
         <w:br/>
         <w:t xml:space="preserve">      { dia: 32, reto: "Pídeles que enrolen a alguien. Reporta." },</w:t>
         <w:br/>
-        <w:t xml:space="preserve">      { dia: 33, reto: "Evalúa: ¿Qué aprendiste al entrenar?" },</w:t>
+        <w:t xml:space="preserve">      { dia: 33, reto: "Impacta a mínimo 7 personas. Reporta. Nota: El número 7 no es tu meta. Es el reflejo de tu estándar. Si tu estándar es alto, 7 personas será solo el comienzo." },</w:t>
         <w:br/>
         <w:t xml:space="preserve">      { dia: 34, reto: "Ajusta tu enfoque de entrenamiento." },</w:t>
         <w:br/>
@@ -8853,9 +9394,9 @@
         <w:br/>
         <w:t xml:space="preserve">      { dia: 37, reto: "Enrola a alguien a continuar tu legado." },</w:t>
         <w:br/>
-        <w:t xml:space="preserve">      { dia: 38, reto: "Evalúa: ¿Cuántas personas enrolos en total? (meta: 10+)" },</w:t>
-        <w:br/>
-        <w:t xml:space="preserve">      { dia: 39, reto: "Evalúa: ¿Cuántas personas entrenaste? (meta: 3+)" },</w:t>
+        <w:t xml:space="preserve">      { dia: 38, reto: "Evalúa: ¿A cuántas personas impactaste en total? (mínimo 7, idealmente 10+)" },</w:t>
+        <w:br/>
+        <w:t xml:space="preserve">      { dia: 39, reto: "Evalúa: ¿A cuántas personas entrenaste y expandiste en total? (mínimo 7+)" },</w:t>
         <w:br/>
         <w:t xml:space="preserve">      { dia: 40, reto: "Comparte tu transformación con el equipo." },</w:t>
         <w:br/>
@@ -8878,7 +9419,7 @@
         <w:br/>
         <w:t xml:space="preserve">    { nombre: "El Círculo de la Expansión (30 min)", uso: "Semanal (Viernes)", proposito: "Compartir transformaciones.", instrucciones: ["1. Círculo. Compartir: 'Esta semana enrolié a...', 'Yo aprendí...'", "2. Equipo celebra cada historia."] },</w:t>
         <w:br/>
-        <w:t xml:space="preserve">    { nombre: "El Muro de los Futuros Imposibles", uso: "Permanente", proposito: "Mantener viva la visión.", instrucciones: ["1. Escribir futuro en post-it.", "2. Pegar en muro visible.", "3. Actualización semanal: 'Esta semana avancé en...'"] },</w:t>
+        <w:t xml:space="preserve">    { nombre: "El Muro de los Futuros de Posibilidad", uso: "Permanente", proposito: "Mantener viva la visión.", instrucciones: ["1. Escribir futuro en post-it.", "2. Pegar en muro visible.", "3. Actualización semanal: 'Esta semana avancé en...'"] },</w:t>
         <w:br/>
         <w:t xml:space="preserve">    { nombre: "El Contrato de Accountability", uso: "Revisión semanal", proposito: "Sostener responsabilidad.", instrucciones: ["1. Declarar compromiso.", "2. Equipo acepta/rechaza si no es claro/medible.", "3. Contrato público.", "4. Checkpoint semanal: '¿Cumpliste?'"] }</w:t>
         <w:br/>
@@ -8888,9 +9429,9 @@
         <w:br/>
         <w:t xml:space="preserve">    metricas: [</w:t>
         <w:br/>
-        <w:t xml:space="preserve">      { metrica: "Futuros imposibles declarados", meta: "100% del equipo", como: "Contrato de Futuros Imposibles" },</w:t>
-        <w:br/>
-        <w:t xml:space="preserve">      { metrica: "Personas enrolos", meta: "10+ por participante", como: "Reporte semanal" },</w:t>
+        <w:t xml:space="preserve">      { metrica: "Futuros imposibles declarados", meta: "100% del equipo", como: "Contrato de Futuros de Posibilidad" },</w:t>
+        <w:br/>
+        <w:t xml:space="preserve">      { metrica: "Personas impactadas", meta: "Estándar mínimo 7, idealmente 10+ por participante. Importante: El estándar mínimo de 7 personas no es tu meta. Es el reflejo de un estándar alto. No busques impactar 7 personas por cumplir. Busca un estándar tan alto que 7 personas sea solo el comienzo.", como: "Reporte semanal" },</w:t>
         <w:br/>
         <w:t xml:space="preserve">      { metrica: "Personas entrenadas", meta: "3+ por participante", como: "Reporte de entrenamiento" },</w:t>
         <w:br/>
@@ -8902,9 +9443,9 @@
         <w:br/>
         <w:t xml:space="preserve">    evaluacionFinal: [</w:t>
         <w:br/>
-        <w:t xml:space="preserve">      "Su futuro imposible y cómo lo vivió.",</w:t>
-        <w:br/>
-        <w:t xml:space="preserve">      "Las personas que enroló (mínimo 10).",</w:t>
+        <w:t xml:space="preserve">      "Su futuro de posibilidad y cómo lo vivió.",</w:t>
+        <w:br/>
+        <w:t xml:space="preserve">      "Las personas que impactó (estándar mínimo 7, idealmente 10+. Nota: El estándar mínimo de 7 personas no es tu meta. Es el reflejo de tu estándar. Si tu estándar es alto, 7 personas será solo el comienzo).",</w:t>
         <w:br/>
         <w:t xml:space="preserve">      "Las personas que entrenó (mínimo 3).",</w:t>
         <w:br/>
@@ -8918,7 +9459,7 @@
         <w:br/>
         <w:t xml:space="preserve">  peliculas: [</w:t>
         <w:br/>
-        <w:t xml:space="preserve">    { titulo: "En Busca de la Felicidad (2006)", tema: "Persistencia, futuro imposible.", dinamica: "¿Cuál es tu 'oficina en el metro'?", link: "https://www.youtube.com/watch?v=0wJM21yvUqw" },</w:t>
+        <w:t xml:space="preserve">    { titulo: "En Busca de la Felicidad (2006)", tema: "Persistencia, futuro de posibilidad.", dinamica: "¿Cuál es tu 'oficina en el metro'?", link: "https://www.youtube.com/watch?v=0wJM21yvUqw" },</w:t>
         <w:br/>
         <w:t xml:space="preserve">    { titulo: "Invictus (2009)", tema: "Liderazgo, creación de contexto.", dinamica: "¿Qué contexto creas tú?", link: "https://www.youtube.com/watch?v=RZY8c_a_dlQ" },</w:t>
         <w:br/>
@@ -10102,11 +10643,11 @@
         <w:br/>
         <w:t xml:space="preserve">              &lt;svg xmlns="http://www.w3.org/2000/svg" width="20" height="20" viewBox="0 0 24 24" fill="none" stroke="currentColor" strokeWidth="2" strokeLinecap="round" strokeLinejoin="round"&gt;</w:t>
         <w:br/>
-        <w:t xml:space="preserve">                &lt;path d="M12 2v20M17 5H9.5a3.5 3.5 0 0 0 0 7h5a3.5 3.5 0 0 1 0 7H6"/&gt;</w:t>
+        <w:t xml:space="preserve">                &lt;circle cx="12" cy="5" r="3"/&gt;&lt;path d="M12 22V8"/&gt;&lt;path d="M5 12H2a10 10 0 0 0 20 0h-3"/&gt;</w:t>
         <w:br/>
         <w:t xml:space="preserve">              &lt;/svg&gt;</w:t>
         <w:br/>
-        <w:t xml:space="preserve">              Preparación Fisiológica (Grounding)</w:t>
+        <w:t xml:space="preserve">              Preparación y Presencia (Grounding)</w:t>
         <w:br/>
         <w:t xml:space="preserve">            &lt;/h3&gt;</w:t>
         <w:br/>
@@ -11156,7 +11697,7 @@
         <w:br/>
         <w:t xml:space="preserve">      termino: "Grounding",</w:t>
         <w:br/>
-        <w:t xml:space="preserve">      definicion: "Intervención psico-fisiológica breve (30-180 segundos) diseñada para modular la reactividad del sistema nervioso autónomo y restablecer la homeostasis. Ayuda a recuperar la claridad cognitiva, pero no sustituye el proceso analítico ni constituye una intervención psicoterapéutica profunda."</w:t>
+        <w:t xml:space="preserve">      definicion: "Práctica breve de atención corporal, respiración y presencia utilizada para favorecer el enfoque, disminuir distracciones y preparar al participante para una conversación o actividad. Ayuda a recuperar la claridad, pero no sustituye el proceso analítico ni constituye una intervención psicoterapéutica profunda."</w:t>
         <w:br/>
         <w:t xml:space="preserve">    },</w:t>
         <w:br/>
@@ -11170,9 +11711,9 @@
         <w:br/>
         <w:t xml:space="preserve">    {</w:t>
         <w:br/>
-        <w:t xml:space="preserve">      termino: "Futuro Imposible",</w:t>
-        <w:br/>
-        <w:t xml:space="preserve">      definicion: "Visión inspiradora que proyecta una aspiración que hoy parece inalcanzable. Funciona como un faro de dirección y un habilitador de saltos discontinuos, no como un KPI rígido o una métrica operativa de éxito."</w:t>
+        <w:t xml:space="preserve">      termino: "Futuro de Posibilidad",</w:t>
+        <w:br/>
+        <w:t xml:space="preserve">      definicion: "Declaración de una aspiración que amplía el marco habitual de acción y exige nuevas decisiones, capacidades y compromisos. Funciona como un faro de dirección, no como un KPI rígido o una métrica operativa de éxito."</w:t>
         <w:br/>
         <w:t xml:space="preserve">    },</w:t>
         <w:br/>
@@ -11196,7 +11737,7 @@
         <w:br/>
         <w:t xml:space="preserve">      termino: "Enrolamiento",</w:t>
         <w:br/>
-        <w:t xml:space="preserve">      definicion: "El proceso de invitar a otros a participar en un futuro imposible de manera libre y comprometida. No es persuadir, convencer ni manipular desde la carencia, sino crear un contexto de posibilidad compartida donde el otro elige expandirse."</w:t>
+        <w:t xml:space="preserve">      definicion: "El proceso de invitar a otros a participar en un futuro de posibilidad de manera libre y comprometida. No es persuadir, convencer ni manipular desde la carencia, sino crear un contexto compartido donde el otro elige expandirse."</w:t>
         <w:br/>
         <w:t xml:space="preserve">    },</w:t>
         <w:br/>
@@ -11204,7 +11745,7 @@
         <w:br/>
         <w:t xml:space="preserve">      termino: "Coaching de Alto Rendimiento",</w:t>
         <w:br/>
-        <w:t xml:space="preserve">      definicion: "Marco heurístico del programa que utiliza los Principios de Posibilidad (salto discontinuo, observador generativo) para explicar cambios no-lineales en el comportamiento humano."</w:t>
+        <w:t xml:space="preserve">      definicion: "Marco metodológico del programa que utiliza principios de filosofía, liderazgo y ontología del lenguaje para generar resultados extraordinarios a través de la expansión de las posibilidades de acción del observador."</w:t>
         <w:br/>
         <w:t xml:space="preserve">    }</w:t>
         <w:br/>
@@ -12601,7 +13142,7 @@
         <w:br/>
         <w:t xml:space="preserve">                      &lt;th style={{ padding: '1rem', textAlign: 'left', borderBottom: '2px solid var(--color-error)', color: 'var(--color-error)' }}&gt;Futuro "Realista"&lt;/th&gt;</w:t>
         <w:br/>
-        <w:t xml:space="preserve">                      &lt;th style={{ padding: '1rem', textAlign: 'left', borderBottom: '2px solid var(--crear-gold)', color: 'var(--crear-gold)' }}&gt;Futuro Imposible&lt;/th&gt;</w:t>
+        <w:t xml:space="preserve">                      &lt;th style={{ padding: '1rem', textAlign: 'left', borderBottom: '2px solid var(--crear-gold)', color: 'var(--crear-gold)' }}&gt;Futuro de Posibilidad&lt;/th&gt;</w:t>
         <w:br/>
         <w:t xml:space="preserve">                    &lt;/tr&gt;</w:t>
         <w:br/>
@@ -13373,7 +13914,13 @@
         <w:br/>
         <w:t xml:space="preserve">  const historialResumido = sessionsHistory.map(s =&gt; {</w:t>
         <w:br/>
-        <w:t xml:space="preserve">    return `Sesión (${new Date(s.startedAt).toLocaleDateString()}): Duración ${s.durationMinutes || 0} min. Dispositivo: ${s.device}. Módulos visitados: ${s.history ? s.history.length : 0}`;</w:t>
+        <w:t xml:space="preserve">    const fecha = new Date(s.startedAt).toLocaleDateString();</w:t>
+        <w:br/>
+        <w:t xml:space="preserve">    const duracion = s.durationMinutes || 0;</w:t>
+        <w:br/>
+        <w:t xml:space="preserve">    const mods = s.history ? s.history.length : 0;</w:t>
+        <w:br/>
+        <w:t xml:space="preserve">    return 'Sesion (' + fecha + '): Duracion ' + duracion + ' min. Dispositivo: ' + s.device + '. Modulos: ' + mods;</w:t>
         <w:br/>
         <w:t xml:space="preserve">  }).join('\n');</w:t>
         <w:br/>

</xml_diff>

<commit_message>
Feat: Integracion de Manual de Enrolamiento Narrativo BrandScript y Guiones MJ v1.0 (/guiones-mj)
</commit_message>
<xml_diff>
--- a/Auditoria_Codigo_Completo.docx
+++ b/Auditoria_Codigo_Completo.docx
@@ -514,6 +514,8 @@
         <w:br/>
         <w:t>import AdminDashboard from './pages/AdminDashboard'</w:t>
         <w:br/>
+        <w:t>import TareasQuantumTeam from './pages/TareasQuantumTeam'</w:t>
+        <w:br/>
         <w:t>import NotFound from './pages/NotFound'</w:t>
         <w:br/>
         <w:t>import Glosario from './pages/Glosario'</w:t>
@@ -794,6 +796,8 @@
         <w:br/>
         <w:t xml:space="preserve">          &lt;Route path="/" element={&lt;Navigate to="/dashboard" replace /&gt;} /&gt;</w:t>
         <w:br/>
+        <w:t xml:space="preserve">          &lt;Route path="/home" element={&lt;ProtectedRoute&gt;&lt;Dashboard /&gt;&lt;/ProtectedRoute&gt;} /&gt;</w:t>
+        <w:br/>
         <w:t xml:space="preserve">          &lt;Route path="/dashboard" element={&lt;ProtectedRoute&gt;&lt;Dashboard /&gt;&lt;/ProtectedRoute&gt;} /&gt;</w:t>
         <w:br/>
         <w:t xml:space="preserve">          &lt;Route path="/ruta" element={&lt;ProtectedRoute&gt;&lt;RutaFormacion /&gt;&lt;/ProtectedRoute&gt;} /&gt;</w:t>
@@ -816,7 +820,11 @@
         <w:br/>
         <w:t xml:space="preserve">          &lt;Route path="/evaluaciones" element={&lt;ProtectedRoute&gt;&lt;Evaluaciones /&gt;&lt;/ProtectedRoute&gt;} /&gt;</w:t>
         <w:br/>
+        <w:t xml:space="preserve">          &lt;Route path="/tareas-qt" element={&lt;ProtectedRoute&gt;&lt;TareasQuantumTeam /&gt;&lt;/ProtectedRoute&gt;} /&gt;</w:t>
+        <w:br/>
         <w:t xml:space="preserve">          &lt;Route path="/admin" element={&lt;AdminRoute&gt;&lt;AdminDashboard /&gt;&lt;/AdminRoute&gt;} /&gt;</w:t>
+        <w:br/>
+        <w:t xml:space="preserve">          &lt;Route path="/superadmin" element={&lt;AdminRoute&gt;&lt;AdminDashboard /&gt;&lt;/AdminRoute&gt;} /&gt;</w:t>
         <w:br/>
         <w:t xml:space="preserve">          &lt;Route path="*" element={&lt;NotFound /&gt;} /&gt;</w:t>
         <w:br/>
@@ -1913,24 +1921,30 @@
         <w:br/>
         <w:t>import { UIProvider } from './context/UIContext'</w:t>
         <w:br/>
+        <w:t>import ErrorBoundary from './components/ErrorBoundary'</w:t>
+        <w:br/>
         <w:br/>
         <w:t>ReactDOM.createRoot(document.getElementById('root')).render(</w:t>
         <w:br/>
         <w:t xml:space="preserve">  &lt;React.StrictMode&gt;</w:t>
         <w:br/>
-        <w:t xml:space="preserve">    &lt;BrowserRouter&gt;</w:t>
-        <w:br/>
-        <w:t xml:space="preserve">      &lt;AuthProvider&gt;</w:t>
-        <w:br/>
-        <w:t xml:space="preserve">        &lt;UIProvider&gt;</w:t>
-        <w:br/>
-        <w:t xml:space="preserve">          &lt;App /&gt;</w:t>
-        <w:br/>
-        <w:t xml:space="preserve">        &lt;/UIProvider&gt;</w:t>
-        <w:br/>
-        <w:t xml:space="preserve">      &lt;/AuthProvider&gt;</w:t>
-        <w:br/>
-        <w:t xml:space="preserve">    &lt;/BrowserRouter&gt;</w:t>
+        <w:t xml:space="preserve">    &lt;ErrorBoundary&gt;</w:t>
+        <w:br/>
+        <w:t xml:space="preserve">      &lt;BrowserRouter&gt;</w:t>
+        <w:br/>
+        <w:t xml:space="preserve">        &lt;AuthProvider&gt;</w:t>
+        <w:br/>
+        <w:t xml:space="preserve">          &lt;UIProvider&gt;</w:t>
+        <w:br/>
+        <w:t xml:space="preserve">            &lt;App /&gt;</w:t>
+        <w:br/>
+        <w:t xml:space="preserve">          &lt;/UIProvider&gt;</w:t>
+        <w:br/>
+        <w:t xml:space="preserve">        &lt;/AuthProvider&gt;</w:t>
+        <w:br/>
+        <w:t xml:space="preserve">      &lt;/BrowserRouter&gt;</w:t>
+        <w:br/>
+        <w:t xml:space="preserve">    &lt;/ErrorBoundary&gt;</w:t>
         <w:br/>
         <w:t xml:space="preserve">  &lt;/React.StrictMode&gt;,</w:t>
         <w:br/>
@@ -2004,6 +2018,96 @@
           <w:b/>
           <w:sz w:val="28"/>
         </w:rPr>
+        <w:t>Archivo: src/components/ErrorBoundary.jsx</w:t>
+      </w:r>
+    </w:p>
+    <w:p>
+      <w:r>
+        <w:rPr>
+          <w:rFonts w:ascii="Consolas" w:hAnsi="Consolas"/>
+          <w:sz w:val="18"/>
+        </w:rPr>
+        <w:t>import React from 'react';</w:t>
+        <w:br/>
+        <w:br/>
+        <w:t>class ErrorBoundary extends React.Component {</w:t>
+        <w:br/>
+        <w:t xml:space="preserve">  constructor(props) {</w:t>
+        <w:br/>
+        <w:t xml:space="preserve">    super(props);</w:t>
+        <w:br/>
+        <w:t xml:space="preserve">    this.state = { hasError: false, error: null };</w:t>
+        <w:br/>
+        <w:t xml:space="preserve">  }</w:t>
+        <w:br/>
+        <w:br/>
+        <w:t xml:space="preserve">  static getDerivedStateFromError(error) {</w:t>
+        <w:br/>
+        <w:t xml:space="preserve">    return { hasError: true, error };</w:t>
+        <w:br/>
+        <w:t xml:space="preserve">  }</w:t>
+        <w:br/>
+        <w:br/>
+        <w:t xml:space="preserve">  componentDidCatch(error, errorInfo) {</w:t>
+        <w:br/>
+        <w:t xml:space="preserve">    console.error("ErrorBoundary atrapó un error:", error, errorInfo);</w:t>
+        <w:br/>
+        <w:t xml:space="preserve">  }</w:t>
+        <w:br/>
+        <w:br/>
+        <w:t xml:space="preserve">  render() {</w:t>
+        <w:br/>
+        <w:t xml:space="preserve">    if (this.state.hasError) {</w:t>
+        <w:br/>
+        <w:t xml:space="preserve">      return (</w:t>
+        <w:br/>
+        <w:t xml:space="preserve">        &lt;div style={{ padding: '2rem', textAlign: 'center', color: '#fff', background: '#0a0a0a', minHeight: '100vh', display: 'flex', flexDirection: 'column', alignItems: 'center', justifyContent: 'center' }}&gt;</w:t>
+        <w:br/>
+        <w:t xml:space="preserve">          &lt;h2 className="text-gold" style={{ fontSize: '2rem', marginBottom: '1rem' }}&gt;Algo salió mal&lt;/h2&gt;</w:t>
+        <w:br/>
+        <w:t xml:space="preserve">          &lt;p style={{ marginBottom: '2rem', opacity: 0.8 }}&gt;La plataforma ha encontrado un error inesperado.&lt;/p&gt;</w:t>
+        <w:br/>
+        <w:t xml:space="preserve">          &lt;button </w:t>
+        <w:br/>
+        <w:t xml:space="preserve">            className="btn-primary" </w:t>
+        <w:br/>
+        <w:t xml:space="preserve">            onClick={() =&gt; window.location.replace('/')}</w:t>
+        <w:br/>
+        <w:t xml:space="preserve">          &gt;</w:t>
+        <w:br/>
+        <w:t xml:space="preserve">            Volver al inicio</w:t>
+        <w:br/>
+        <w:t xml:space="preserve">          &lt;/button&gt;</w:t>
+        <w:br/>
+        <w:t xml:space="preserve">        &lt;/div&gt;</w:t>
+        <w:br/>
+        <w:t xml:space="preserve">      );</w:t>
+        <w:br/>
+        <w:t xml:space="preserve">    }</w:t>
+        <w:br/>
+        <w:br/>
+        <w:t xml:space="preserve">    return this.props.children; </w:t>
+        <w:br/>
+        <w:t xml:space="preserve">  }</w:t>
+        <w:br/>
+        <w:t>}</w:t>
+        <w:br/>
+        <w:br/>
+        <w:t>export default ErrorBoundary;</w:t>
+        <w:br/>
+      </w:r>
+    </w:p>
+    <w:p>
+      <w:r>
+        <w:br w:type="page"/>
+      </w:r>
+    </w:p>
+    <w:p>
+      <w:r>
+        <w:rPr>
+          <w:b/>
+          <w:sz w:val="28"/>
+        </w:rPr>
         <w:t>Archivo: src/components/GlobalHUDWidget.jsx</w:t>
       </w:r>
     </w:p>
@@ -2559,6 +2663,24 @@
         <w:t xml:space="preserve">            &gt;</w:t>
         <w:br/>
         <w:t xml:space="preserve">              Autoevaluación Coach 🧭</w:t>
+        <w:br/>
+        <w:t xml:space="preserve">            &lt;/NavLink&gt;</w:t>
+        <w:br/>
+        <w:t xml:space="preserve">          &lt;/li&gt;</w:t>
+        <w:br/>
+        <w:t xml:space="preserve">          &lt;li&gt;</w:t>
+        <w:br/>
+        <w:t xml:space="preserve">            &lt;NavLink </w:t>
+        <w:br/>
+        <w:t xml:space="preserve">              to="/tareas-qt"</w:t>
+        <w:br/>
+        <w:t xml:space="preserve">              className={({ isActive }) =&gt; isActive ? "active" : ""}</w:t>
+        <w:br/>
+        <w:t xml:space="preserve">              onClick={onClose}</w:t>
+        <w:br/>
+        <w:t xml:space="preserve">            &gt;</w:t>
+        <w:br/>
+        <w:t xml:space="preserve">              Tareas QT (Deadlines C1) 🎯</w:t>
         <w:br/>
         <w:t xml:space="preserve">            &lt;/NavLink&gt;</w:t>
         <w:br/>
@@ -9555,6 +9677,591 @@
           <w:b/>
           <w:sz w:val="28"/>
         </w:rPr>
+        <w:t>Archivo: src/data/tareasQtData.js</w:t>
+      </w:r>
+    </w:p>
+    <w:p>
+      <w:r>
+        <w:rPr>
+          <w:rFonts w:ascii="Consolas" w:hAnsi="Consolas"/>
+          <w:sz w:val="18"/>
+        </w:rPr>
+        <w:t>/**</w:t>
+        <w:br/>
+        <w:t xml:space="preserve"> * REPOSITORIO MAESTRO DE TAREAS OPERATIVAS DEL QUANTUM TEAM (CAPÍTULO 1)</w:t>
+        <w:br/>
+        <w:t xml:space="preserve"> * Extraído del Sistema Operativo de Alto Rendimiento - CREAR Poder Sin Límites</w:t>
+        <w:br/>
+        <w:t xml:space="preserve"> * </w:t>
+        <w:br/>
+        <w:t xml:space="preserve"> * Reglas de cálculo de fechas relativas al inicio del C1 (Viernes 09:00 AM):</w:t>
+        <w:br/>
+        <w:t xml:space="preserve"> * - offsetDays: días relativos al viernes de inicio (negativo = antes, 0 = viernes, 1 = sábado, 2 = domingo, positivo = después)</w:t>
+        <w:br/>
+        <w:t xml:space="preserve"> * - hour: hora exacta (formato 24h)</w:t>
+        <w:br/>
+        <w:t xml:space="preserve"> * - minute: minuto</w:t>
+        <w:br/>
+        <w:t xml:space="preserve"> */</w:t>
+        <w:br/>
+        <w:br/>
+        <w:t>export const TAREAS_QT_C1 = [</w:t>
+        <w:br/>
+        <w:t xml:space="preserve">  // ==========================================</w:t>
+        <w:br/>
+        <w:t xml:space="preserve">  // FASE 1: ANTES DE CAPÍTULO 1 (PRE-SALA)</w:t>
+        <w:br/>
+        <w:t xml:space="preserve">  // ==========================================</w:t>
+        <w:br/>
+        <w:t xml:space="preserve">  {</w:t>
+        <w:br/>
+        <w:t xml:space="preserve">    id: "pre-01",</w:t>
+        <w:br/>
+        <w:t xml:space="preserve">    fase: "ANTES",</w:t>
+        <w:br/>
+        <w:t xml:space="preserve">    faseTitulo: "Fase 1: Preparación &amp; Convocatoria Pre-Sala",</w:t>
+        <w:br/>
+        <w:t xml:space="preserve">    titulo: "Alineación y Asignación de Roles en Sala QT",</w:t>
+        <w:br/>
+        <w:t xml:space="preserve">    descripcion: "Asignar y confirmar a los líderes en cada puesto clave: Capitán QT, Audio/Luces, Registro/Puerta, Guardianes de Pasillo, Soporte Emocional, Cronometrador y Logística/Abastecimiento.",</w:t>
+        <w:br/>
+        <w:t xml:space="preserve">    rol: "Capitán QT / Coordinador",</w:t>
+        <w:br/>
+        <w:t xml:space="preserve">    prioridad: "ALTA",</w:t>
+        <w:br/>
+        <w:t xml:space="preserve">    offsetDays: -7,</w:t>
+        <w:br/>
+        <w:t xml:space="preserve">    time: "10:00",</w:t>
+        <w:br/>
+        <w:t xml:space="preserve">    entregable: "Matriz de roles confirmada y publicada en grupo oficial.",</w:t>
+        <w:br/>
+        <w:t xml:space="preserve">    origenManual: "Módulo 4: Desarrollo de Aliados y Matriz de Cancha"</w:t>
+        <w:br/>
+        <w:t xml:space="preserve">  },</w:t>
+        <w:br/>
+        <w:t xml:space="preserve">  {</w:t>
+        <w:br/>
+        <w:t xml:space="preserve">    id: "pre-02",</w:t>
+        <w:br/>
+        <w:t xml:space="preserve">    fase: "ANTES",</w:t>
+        <w:br/>
+        <w:t xml:space="preserve">    faseTitulo: "Fase 1: Preparación &amp; Convocatoria Pre-Sala",</w:t>
+        <w:br/>
+        <w:t xml:space="preserve">    titulo: "Auditoría de Lista de Participantes y Casos Especiales",</w:t>
+        <w:br/>
+        <w:t xml:space="preserve">    descripcion: "Revisar la nómina oficial de participantes inscritos. Identificar casos médicos, condiciones físicas, mujeres embarazadas o situaciones emocionales delicadas para asignación de guardián dedicado.",</w:t>
+        <w:br/>
+        <w:t xml:space="preserve">    rol: "Registro &amp; Soporte Emocional",</w:t>
+        <w:br/>
+        <w:t xml:space="preserve">    prioridad: "CRÍTICA",</w:t>
+        <w:br/>
+        <w:t xml:space="preserve">    offsetDays: -5,</w:t>
+        <w:br/>
+        <w:t xml:space="preserve">    time: "15:00",</w:t>
+        <w:br/>
+        <w:t xml:space="preserve">    entregable: "Ficha de alertas médicas/emocionales entregada al Entrenador.",</w:t>
+        <w:br/>
+        <w:t xml:space="preserve">    origenManual: "Módulo 5: Protocolo de Seguridad y Casos Especiales"</w:t>
+        <w:br/>
+        <w:t xml:space="preserve">  },</w:t>
+        <w:br/>
+        <w:t xml:space="preserve">  {</w:t>
+        <w:br/>
+        <w:t xml:space="preserve">    id: "pre-03",</w:t>
+        <w:br/>
+        <w:t xml:space="preserve">    fase: "ANTES",</w:t>
+        <w:br/>
+        <w:t xml:space="preserve">    faseTitulo: "Fase 1: Preparación &amp; Convocatoria Pre-Sala",</w:t>
+        <w:br/>
+        <w:t xml:space="preserve">    titulo: "Validación de Uniformes e Imagen Oficial del Staff",</w:t>
+        <w:br/>
+        <w:t xml:space="preserve">    descripcion: "Garantizar que todo el Quantum Team cuente con el polo oficial de la empresa en perfecto estado, pantalón formal oscuro (sin roturas) y calzado pulcro. Cero uso de logos o accesorios no autorizados.",</w:t>
+        <w:br/>
+        <w:t xml:space="preserve">    rol: "Todos los QT",</w:t>
+        <w:br/>
+        <w:t xml:space="preserve">    prioridad: "MEDIA",</w:t>
+        <w:br/>
+        <w:t xml:space="preserve">    offsetDays: -3,</w:t>
+        <w:br/>
+        <w:t xml:space="preserve">    time: "12:00",</w:t>
+        <w:br/>
+        <w:t xml:space="preserve">    entregable: "Checklist de uniforme y credenciales al 100%.",</w:t>
+        <w:br/>
+        <w:t xml:space="preserve">    origenManual: "Módulo 1: Identidad, ADN &amp; Estándar Impecable"</w:t>
+        <w:br/>
+        <w:t xml:space="preserve">  },</w:t>
+        <w:br/>
+        <w:t xml:space="preserve">  {</w:t>
+        <w:br/>
+        <w:t xml:space="preserve">    id: "pre-04",</w:t>
+        <w:br/>
+        <w:t xml:space="preserve">    fase: "ANTES",</w:t>
+        <w:br/>
+        <w:t xml:space="preserve">    faseTitulo: "Fase 1: Preparación &amp; Convocatoria Pre-Sala",</w:t>
+        <w:br/>
+        <w:t xml:space="preserve">    titulo: "Confección de Kits, Gafetes y Bitácoras de Participante",</w:t>
+        <w:br/>
+        <w:t xml:space="preserve">    descripcion: "Impresión de credenciales con nombres oficiales, armado de carpetas de trabajo, entrega de bolígrafos y preparación de sobres confidenciales para las dinámicas vivenciales.",</w:t>
+        <w:br/>
+        <w:t xml:space="preserve">    rol: "Logística &amp; Materiales",</w:t>
+        <w:br/>
+        <w:t xml:space="preserve">    prioridad: "ALTA",</w:t>
+        <w:br/>
+        <w:t xml:space="preserve">    offsetDays: -2,</w:t>
+        <w:br/>
+        <w:t xml:space="preserve">    time: "18:00",</w:t>
+        <w:br/>
+        <w:t xml:space="preserve">    entregable: "Cajas de material ordenadas alfabéticamente.",</w:t>
+        <w:br/>
+        <w:t xml:space="preserve">    origenManual: "Módulo 5: Flujos de Trabajo Temporales"</w:t>
+        <w:br/>
+        <w:t xml:space="preserve">  },</w:t>
+        <w:br/>
+        <w:t xml:space="preserve">  {</w:t>
+        <w:br/>
+        <w:t xml:space="preserve">    id: "pre-05",</w:t>
+        <w:br/>
+        <w:t xml:space="preserve">    fase: "ANTES",</w:t>
+        <w:br/>
+        <w:t xml:space="preserve">    faseTitulo: "Fase 1: Preparación &amp; Convocatoria Pre-Sala",</w:t>
+        <w:br/>
+        <w:t xml:space="preserve">    titulo: "Montaje de Sala: Alineación Milimétrica y Ergonomía",</w:t>
+        <w:br/>
+        <w:t xml:space="preserve">    descripcion: "Disposición de sillas en arco/herradura con separación exacta, pasillos despejados para tránsito de staff, eliminación de puntos ciegos hacia el podio del entrenador.",</w:t>
+        <w:br/>
+        <w:t xml:space="preserve">    rol: "Guardianes de Sala &amp; Logística",</w:t>
+        <w:br/>
+        <w:t xml:space="preserve">    prioridad: "CRÍTICA",</w:t>
+        <w:br/>
+        <w:t xml:space="preserve">    offsetDays: -1,</w:t>
+        <w:br/>
+        <w:t xml:space="preserve">    time: "16:00",</w:t>
+        <w:br/>
+        <w:t xml:space="preserve">    entregable: "Alineación de sala verificada con cinta métrica y libre de obstáculos.",</w:t>
+        <w:br/>
+        <w:t xml:space="preserve">    origenManual: "Checklist Maestro Pre-Apertura (20 Puntos Críticos)"</w:t>
+        <w:br/>
+        <w:t xml:space="preserve">  },</w:t>
+        <w:br/>
+        <w:t xml:space="preserve">  {</w:t>
+        <w:br/>
+        <w:t xml:space="preserve">    id: "pre-06",</w:t>
+        <w:br/>
+        <w:t xml:space="preserve">    fase: "ANTES",</w:t>
+        <w:br/>
+        <w:t xml:space="preserve">    faseTitulo: "Fase 1: Preparación &amp; Convocatoria Pre-Sala",</w:t>
+        <w:br/>
+        <w:t xml:space="preserve">    titulo: "Calibración Acústica, Microfonía y Climatización (AC a 21°C)",</w:t>
+        <w:br/>
+        <w:t xml:space="preserve">    descripcion: "Prueba de sonido (micrófono diadema y mano), ajuste de ecualización para evitar feedback, carga de playlists emocionales y ajuste del aire acondicionado entre 20°C y 22°C para mantener el estado de alerta.",</w:t>
+        <w:br/>
+        <w:t xml:space="preserve">    rol: "Audio &amp; Luces",</w:t>
+        <w:br/>
+        <w:t xml:space="preserve">    prioridad: "CRÍTICA",</w:t>
+        <w:br/>
+        <w:t xml:space="preserve">    offsetDays: -1,</w:t>
+        <w:br/>
+        <w:t xml:space="preserve">    time: "18:00",</w:t>
+        <w:br/>
+        <w:t xml:space="preserve">    entregable: "Sonido impecable probado y termostato fijado en 21°C.",</w:t>
+        <w:br/>
+        <w:t xml:space="preserve">    origenManual: "Checklist Maestro Pre-Apertura"</w:t>
+        <w:br/>
+        <w:t xml:space="preserve">  },</w:t>
+        <w:br/>
+        <w:t xml:space="preserve">  {</w:t>
+        <w:br/>
+        <w:t xml:space="preserve">    id: "pre-07",</w:t>
+        <w:br/>
+        <w:t xml:space="preserve">    fase: "ANTES",</w:t>
+        <w:br/>
+        <w:t xml:space="preserve">    faseTitulo: "Fase 1: Preparación &amp; Convocatoria Pre-Sala",</w:t>
+        <w:br/>
+        <w:t xml:space="preserve">    titulo: "Círculo Sagrado de Staff &amp; Alineación con el Entrenador",</w:t>
+        <w:br/>
+        <w:t xml:space="preserve">    descripcion: "Reunión general del Quantum Team con el Entrenador Principal (Jueves por la noche). Grounding de equipo, mente en cero, repaso del mapa de quiebres y entrega del corazón al servicio.",</w:t>
+        <w:br/>
+        <w:t xml:space="preserve">    rol: "Todos los QT",</w:t>
+        <w:br/>
+        <w:t xml:space="preserve">    prioridad: "CRÍTICA",</w:t>
+        <w:br/>
+        <w:t xml:space="preserve">    offsetDays: -1,</w:t>
+        <w:br/>
+        <w:t xml:space="preserve">    time: "20:00",</w:t>
+        <w:br/>
+        <w:t xml:space="preserve">    entregable: "Pacto de impecabilidad y energía unificada.",</w:t>
+        <w:br/>
+        <w:t xml:space="preserve">    origenManual: "Módulo 2: Cultura Crear &amp; 12 Principios del QT"</w:t>
+        <w:br/>
+        <w:t xml:space="preserve">  },</w:t>
+        <w:br/>
+        <w:br/>
+        <w:t xml:space="preserve">  // ==========================================</w:t>
+        <w:br/>
+        <w:t xml:space="preserve">  // FASE 2: DURANTE CAPÍTULO 1 (SALA ACTIVA)</w:t>
+        <w:br/>
+        <w:t xml:space="preserve">  // ==========================================</w:t>
+        <w:br/>
+        <w:t xml:space="preserve">  {</w:t>
+        <w:br/>
+        <w:t xml:space="preserve">    id: "dur-01",</w:t>
+        <w:br/>
+        <w:t xml:space="preserve">    fase: "DURANTE",</w:t>
+        <w:br/>
+        <w:t xml:space="preserve">    faseTitulo: "Fase 2: Ejecución de Alto Rendimiento en Sala",</w:t>
+        <w:br/>
+        <w:t xml:space="preserve">    titulo: "Viernes 07:30 AM — Llegada de Staff y Grounding Matutino",</w:t>
+        <w:br/>
+        <w:t xml:space="preserve">    descripcion: "Llegada puntual del 100% del staff, verificación final de baterías de micrófonos, pañuelos en puntos estratégicos y último ajuste de temperatura antes de abrir puertas.",</w:t>
+        <w:br/>
+        <w:t xml:space="preserve">    rol: "Todos los QT",</w:t>
+        <w:br/>
+        <w:t xml:space="preserve">    prioridad: "CRÍTICA",</w:t>
+        <w:br/>
+        <w:t xml:space="preserve">    offsetDays: 0,</w:t>
+        <w:br/>
+        <w:t xml:space="preserve">    time: "07:30",</w:t>
+        <w:br/>
+        <w:t xml:space="preserve">    entregable: "Staff en posición y sala blindada.",</w:t>
+        <w:br/>
+        <w:t xml:space="preserve">    origenManual: "Módulo 3: Mapa de Transformación Día 1"</w:t>
+        <w:br/>
+        <w:t xml:space="preserve">  },</w:t>
+        <w:br/>
+        <w:t xml:space="preserve">  {</w:t>
+        <w:br/>
+        <w:t xml:space="preserve">    id: "dur-02",</w:t>
+        <w:br/>
+        <w:t xml:space="preserve">    fase: "DURANTE",</w:t>
+        <w:br/>
+        <w:t xml:space="preserve">    faseTitulo: "Fase 2: Ejecución de Alto Rendimiento en Sala",</w:t>
+        <w:br/>
+        <w:t xml:space="preserve">    titulo: "Viernes 08:00 AM — Registro Impecable y Custodia de Distractores",</w:t>
+        <w:br/>
+        <w:t xml:space="preserve">    descripcion: "Recepción cálida y firme, verificación de documento de identidad, entrega de gafete oficial y recolección segura de celulares / relojes inteligentes en sobres numerados.",</w:t>
+        <w:br/>
+        <w:t xml:space="preserve">    rol: "Puerta &amp; Registro",</w:t>
+        <w:br/>
+        <w:t xml:space="preserve">    prioridad: "ALTA",</w:t>
+        <w:br/>
+        <w:t xml:space="preserve">    offsetDays: 0,</w:t>
+        <w:br/>
+        <w:t xml:space="preserve">    time: "08:00",</w:t>
+        <w:br/>
+        <w:t xml:space="preserve">    entregable: "100% de participantes registrados sin celulares en sala.",</w:t>
+        <w:br/>
+        <w:t xml:space="preserve">    origenManual: "Módulo 5: Protocolo de Puerta y Custodia"</w:t>
+        <w:br/>
+        <w:t xml:space="preserve">  },</w:t>
+        <w:br/>
+        <w:t xml:space="preserve">  {</w:t>
+        <w:br/>
+        <w:t xml:space="preserve">    id: "dur-03",</w:t>
+        <w:br/>
+        <w:t xml:space="preserve">    fase: "DURANTE",</w:t>
+        <w:br/>
+        <w:t xml:space="preserve">    faseTitulo: "Fase 2: Ejecución de Alto Rendimiento en Sala",</w:t>
+        <w:br/>
+        <w:t xml:space="preserve">    titulo: "Viernes 09:00 AM — Apertura Oficial &amp; Postura de Guardia en Sala",</w:t>
+        <w:br/>
+        <w:t xml:space="preserve">    descripcion: "Cierre hermético de puertas, postura corporal de poder y servicio en los perímetros de sala. Monitoreo visual de participantes para sostener el contexto del entrenador sin cruzar miradas distractoras.",</w:t>
+        <w:br/>
+        <w:t xml:space="preserve">    rol: "Guardianes de Sala",</w:t>
+        <w:br/>
+        <w:t xml:space="preserve">    prioridad: "CRÍTICA",</w:t>
+        <w:br/>
+        <w:t xml:space="preserve">    offsetDays: 0,</w:t>
+        <w:br/>
+        <w:t xml:space="preserve">    time: "09:00",</w:t>
+        <w:br/>
+        <w:t xml:space="preserve">    entregable: "Sala en silencio absoluto y contexto sostenido.",</w:t>
+        <w:br/>
+        <w:t xml:space="preserve">    origenManual: "Módulo 1: Postura del Guardián del Contexto"</w:t>
+        <w:br/>
+        <w:t xml:space="preserve">  },</w:t>
+        <w:br/>
+        <w:t xml:space="preserve">  {</w:t>
+        <w:br/>
+        <w:t xml:space="preserve">    id: "dur-04",</w:t>
+        <w:br/>
+        <w:t xml:space="preserve">    fase: "DURANTE",</w:t>
+        <w:br/>
+        <w:t xml:space="preserve">    faseTitulo: "Fase 2: Ejecución de Alto Rendimiento en Sala",</w:t>
+        <w:br/>
+        <w:t xml:space="preserve">    titulo: "Viernes Tarde/Noche — Contención en Procesos de Quiebre Profundo",</w:t>
+        <w:br/>
+        <w:t xml:space="preserve">    descripcion: "Suministro silencioso de pañuelos y agua cuando sea estrictamente requerido, sin interrumpir el proceso emocional del participante ni quitarle su quiebre. Custodia de baños y pasillos.",</w:t>
+        <w:br/>
+        <w:t xml:space="preserve">    rol: "Soporte Emocional",</w:t>
+        <w:br/>
+        <w:t xml:space="preserve">    prioridad: "ALTA",</w:t>
+        <w:br/>
+        <w:t xml:space="preserve">    offsetDays: 0,</w:t>
+        <w:br/>
+        <w:t xml:space="preserve">    time: "19:00",</w:t>
+        <w:br/>
+        <w:t xml:space="preserve">    entregable: "Participantes contenidos con dignidad y respeto.",</w:t>
+        <w:br/>
+        <w:t xml:space="preserve">    origenManual: "Módulo 3: Día 1 - El Quiebre"</w:t>
+        <w:br/>
+        <w:t xml:space="preserve">  },</w:t>
+        <w:br/>
+        <w:t xml:space="preserve">  {</w:t>
+        <w:br/>
+        <w:t xml:space="preserve">    id: "dur-05",</w:t>
+        <w:br/>
+        <w:t xml:space="preserve">    fase: "DURANTE",</w:t>
+        <w:br/>
+        <w:t xml:space="preserve">    faseTitulo: "Fase 2: Ejecución de Alto Rendimiento en Sala",</w:t>
+        <w:br/>
+        <w:t xml:space="preserve">    titulo: "Viernes Cierre (23:00) — Debriefing Nocturno de Staff (Máx 20 min)",</w:t>
+        <w:br/>
+        <w:t xml:space="preserve">    descripcion: "Revisión rápida con el Entrenador sobre la jornada del viernes: participantes en riesgo de abandono, ajustes de logística para el sábado, descanso inmediato.",</w:t>
+        <w:br/>
+        <w:t xml:space="preserve">    rol: "Todos los QT",</w:t>
+        <w:br/>
+        <w:t xml:space="preserve">    prioridad: "MEDIA",</w:t>
+        <w:br/>
+        <w:t xml:space="preserve">    offsetDays: 0,</w:t>
+        <w:br/>
+        <w:t xml:space="preserve">    time: "23:00",</w:t>
+        <w:br/>
+        <w:t xml:space="preserve">    entregable: "Minuta de ajustes y retiro a descanso reparador.",</w:t>
+        <w:br/>
+        <w:t xml:space="preserve">    origenManual: "Módulo 5: Rituales de Cierre Diario"</w:t>
+        <w:br/>
+        <w:t xml:space="preserve">  },</w:t>
+        <w:br/>
+        <w:t xml:space="preserve">  {</w:t>
+        <w:br/>
+        <w:t xml:space="preserve">    id: "dur-06",</w:t>
+        <w:br/>
+        <w:t xml:space="preserve">    fase: "DURANTE",</w:t>
+        <w:br/>
+        <w:t xml:space="preserve">    faseTitulo: "Fase 2: Ejecución de Alto Rendimiento en Sala",</w:t>
+        <w:br/>
+        <w:t xml:space="preserve">    titulo: "Sábado 07:30 AM — Puerta Estricta y Montaje de Dinámica de Espejo",</w:t>
+        <w:br/>
+        <w:t xml:space="preserve">    descripcion: "Verificación de puntualidad de participantes al segundo día. Preparación de sala para los procesos vivenciales de reconstrucción y auto-observación.",</w:t>
+        <w:br/>
+        <w:t xml:space="preserve">    rol: "Puerta &amp; Logística",</w:t>
+        <w:br/>
+        <w:t xml:space="preserve">    prioridad: "CRÍTICA",</w:t>
+        <w:br/>
+        <w:t xml:space="preserve">    offsetDays: 1,</w:t>
+        <w:br/>
+        <w:t xml:space="preserve">    time: "07:30",</w:t>
+        <w:br/>
+        <w:t xml:space="preserve">    entregable: "Sala lista y participantes ingresados sin retrasos.",</w:t>
+        <w:br/>
+        <w:t xml:space="preserve">    origenManual: "Módulo 3: Día 2 - El Espejo y la Reconstrucción"</w:t>
+        <w:br/>
+        <w:t xml:space="preserve">  },</w:t>
+        <w:br/>
+        <w:t xml:space="preserve">  {</w:t>
+        <w:br/>
+        <w:t xml:space="preserve">    id: "dur-07",</w:t>
+        <w:br/>
+        <w:t xml:space="preserve">    fase: "DURANTE",</w:t>
+        <w:br/>
+        <w:t xml:space="preserve">    faseTitulo: "Fase 2: Ejecución de Alto Rendimiento en Sala",</w:t>
+        <w:br/>
+        <w:t xml:space="preserve">    titulo: "Sábado Noche — El Gran Traspaso &amp; Procesos de Perdón",</w:t>
+        <w:br/>
+        <w:t xml:space="preserve">    descripcion: "Control de iluminación tenue, música ambiental envolvente, custodia perimetral absoluta durante la dinámica central del perdón y cartas.",</w:t>
+        <w:br/>
+        <w:t xml:space="preserve">    rol: "Audio, Luces &amp; Guardianes",</w:t>
+        <w:br/>
+        <w:t xml:space="preserve">    prioridad: "CRÍTICA",</w:t>
+        <w:br/>
+        <w:t xml:space="preserve">    offsetDays: 1,</w:t>
+        <w:br/>
+        <w:t xml:space="preserve">    time: "20:00",</w:t>
+        <w:br/>
+        <w:t xml:space="preserve">    entregable: "Atmósfera sagrada y proceso completado al 100%.",</w:t>
+        <w:br/>
+        <w:t xml:space="preserve">    origenManual: "Módulo 3: Dinámica Central del Sábado"</w:t>
+        <w:br/>
+        <w:t xml:space="preserve">  },</w:t>
+        <w:br/>
+        <w:t xml:space="preserve">  {</w:t>
+        <w:br/>
+        <w:t xml:space="preserve">    id: "dur-08",</w:t>
+        <w:br/>
+        <w:t xml:space="preserve">    fase: "DURANTE",</w:t>
+        <w:br/>
+        <w:t xml:space="preserve">    faseTitulo: "Fase 2: Ejecución de Alto Rendimiento en Sala",</w:t>
+        <w:br/>
+        <w:t xml:space="preserve">    titulo: "Domingo 08:00 AM — Declaración de Visión &amp; Enrolamiento al Ser",</w:t>
+        <w:br/>
+        <w:t xml:space="preserve">    descripcion: "Apertura del último día con energía máxima. Preparación de mesas de información de Capítulo 2 y registro de testimonios.",</w:t>
+        <w:br/>
+        <w:t xml:space="preserve">    rol: "Todos los QT",</w:t>
+        <w:br/>
+        <w:t xml:space="preserve">    prioridad: "ALTA",</w:t>
+        <w:br/>
+        <w:t xml:space="preserve">    offsetDays: 2,</w:t>
+        <w:br/>
+        <w:t xml:space="preserve">    time: "08:00",</w:t>
+        <w:br/>
+        <w:t xml:space="preserve">    entregable: "Mesas de C2 preparadas y material listo.",</w:t>
+        <w:br/>
+        <w:t xml:space="preserve">    origenManual: "Módulo 3: Día 3 - El Enrolamiento al Ser"</w:t>
+        <w:br/>
+        <w:t xml:space="preserve">  },</w:t>
+        <w:br/>
+        <w:t xml:space="preserve">  {</w:t>
+        <w:br/>
+        <w:t xml:space="preserve">    id: "dur-09",</w:t>
+        <w:br/>
+        <w:t xml:space="preserve">    fase: "DURANTE",</w:t>
+        <w:br/>
+        <w:t xml:space="preserve">    faseTitulo: "Fase 2: Ejecución de Alto Rendimiento en Sala",</w:t>
+        <w:br/>
+        <w:t xml:space="preserve">    titulo: "Domingo 16:00 PM — Protocolo de Ceremonia de Graduación &amp; Familias",</w:t>
+        <w:br/>
+        <w:t xml:space="preserve">    descripcion: "Recepción ordenada de familiares e invitados de graduación, control de aforo, entrega de pines oficiales y rosas, música triunfal sincronizada al segundo.",</w:t>
+        <w:br/>
+        <w:t xml:space="preserve">    rol: "Puerta, Audio &amp; Guardianes",</w:t>
+        <w:br/>
+        <w:t xml:space="preserve">    prioridad: "CRÍTICA",</w:t>
+        <w:br/>
+        <w:t xml:space="preserve">    offsetDays: 2,</w:t>
+        <w:br/>
+        <w:t xml:space="preserve">    time: "16:00",</w:t>
+        <w:br/>
+        <w:t xml:space="preserve">    entregable: "Ceremonia impecable y entrega de credenciales de graduado.",</w:t>
+        <w:br/>
+        <w:t xml:space="preserve">    origenManual: "Módulo 5: Protocolo de Graduación y Familias"</w:t>
+        <w:br/>
+        <w:t xml:space="preserve">  },</w:t>
+        <w:br/>
+        <w:br/>
+        <w:t xml:space="preserve">  // ==========================================</w:t>
+        <w:br/>
+        <w:t xml:space="preserve">  // FASE 3: DESPUÉS DE CAPÍTULO 1 (POST-SALA)</w:t>
+        <w:br/>
+        <w:t xml:space="preserve">  // ==========================================</w:t>
+        <w:br/>
+        <w:t xml:space="preserve">  {</w:t>
+        <w:br/>
+        <w:t xml:space="preserve">    id: "post-01",</w:t>
+        <w:br/>
+        <w:t xml:space="preserve">    fase: "DESPUÉS",</w:t>
+        <w:br/>
+        <w:t xml:space="preserve">    faseTitulo: "Fase 3: Cierre, Métricas &amp; Continuidad Post-C1",</w:t>
+        <w:br/>
+        <w:t xml:space="preserve">    titulo: "Domingo 20:30 PM — Desmontaje Total y Devolución del Local",</w:t>
+        <w:br/>
+        <w:t xml:space="preserve">    descripcion: "Recolección completa de equipos, señalética, cables, banderas y basura. Dejar el salón del hotel en estado impecable (mejor de como fue recibido).",</w:t>
+        <w:br/>
+        <w:t xml:space="preserve">    rol: "Logística &amp; Todos los QT",</w:t>
+        <w:br/>
+        <w:t xml:space="preserve">    prioridad: "ALTA",</w:t>
+        <w:br/>
+        <w:t xml:space="preserve">    offsetDays: 2,</w:t>
+        <w:br/>
+        <w:t xml:space="preserve">    time: "20:30",</w:t>
+        <w:br/>
+        <w:t xml:space="preserve">    entregable: "Acta de entrega de local firmada sin observaciones.",</w:t>
+        <w:br/>
+        <w:t xml:space="preserve">    origenManual: "Módulo 5: Protocolo de Cierre y Desmontaje"</w:t>
+        <w:br/>
+        <w:t xml:space="preserve">  },</w:t>
+        <w:br/>
+        <w:t xml:space="preserve">  {</w:t>
+        <w:br/>
+        <w:t xml:space="preserve">    id: "post-02",</w:t>
+        <w:br/>
+        <w:t xml:space="preserve">    fase: "DESPUÉS",</w:t>
+        <w:br/>
+        <w:t xml:space="preserve">    faseTitulo: "Fase 3: Cierre, Métricas &amp; Continuidad Post-C1",</w:t>
+        <w:br/>
+        <w:t xml:space="preserve">    titulo: "Domingo 22:00 PM — Círculo de Cierre QT &amp; Entrega de Aprendizajes",</w:t>
+        <w:br/>
+        <w:t xml:space="preserve">    descripcion: "Reunión íntima del staff con el Entrenador: agradecimiento mutuo, reconocimiento a la excelencia, retroalimentación ontológica personal y cierre formal del servicio.",</w:t>
+        <w:br/>
+        <w:t xml:space="preserve">    rol: "Todos los QT",</w:t>
+        <w:br/>
+        <w:t xml:space="preserve">    prioridad: "ALTA",</w:t>
+        <w:br/>
+        <w:t xml:space="preserve">    offsetDays: 2,</w:t>
+        <w:br/>
+        <w:t xml:space="preserve">    time: "22:00",</w:t>
+        <w:br/>
+        <w:t xml:space="preserve">    entregable: "Cierre energético y celebración del equipo.",</w:t>
+        <w:br/>
+        <w:t xml:space="preserve">    origenManual: "Módulo 2: El Ritual de Agradecimiento del Staff"</w:t>
+        <w:br/>
+        <w:t xml:space="preserve">  },</w:t>
+        <w:br/>
+        <w:t xml:space="preserve">  {</w:t>
+        <w:br/>
+        <w:t xml:space="preserve">    id: "post-03",</w:t>
+        <w:br/>
+        <w:t xml:space="preserve">    fase: "DESPUÉS",</w:t>
+        <w:br/>
+        <w:t xml:space="preserve">    faseTitulo: "Fase 3: Cierre, Métricas &amp; Continuidad Post-C1",</w:t>
+        <w:br/>
+        <w:t xml:space="preserve">    titulo: "Lunes T+1 — Autopsia Operativa y Cálculo de Conversión (PP%)",</w:t>
+        <w:br/>
+        <w:t xml:space="preserve">    descripcion: "Reunión de gerencia y capitanes: auditar métricas de graduación, porcentaje de pase a Capítulo 2 (PP%), quiebres logísticos presentados y plan de acción preventivo para la siguiente edición.",</w:t>
+        <w:br/>
+        <w:t xml:space="preserve">    rol: "Capitán QT &amp; Gerencia de Sede",</w:t>
+        <w:br/>
+        <w:t xml:space="preserve">    prioridad: "CRÍTICA",</w:t>
+        <w:br/>
+        <w:t xml:space="preserve">    offsetDays: 3,</w:t>
+        <w:br/>
+        <w:t xml:space="preserve">    time: "18:00",</w:t>
+        <w:br/>
+        <w:t xml:space="preserve">    entregable: "Informe de Autopsia Post-C1 cargado al sistema con métricas reales.",</w:t>
+        <w:br/>
+        <w:t xml:space="preserve">    origenManual: "portal-content-gerencia: Calculadora de Conversión PP% y Autopsia"</w:t>
+        <w:br/>
+        <w:t xml:space="preserve">  },</w:t>
+        <w:br/>
+        <w:t xml:space="preserve">  {</w:t>
+        <w:br/>
+        <w:t xml:space="preserve">    id: "post-04",</w:t>
+        <w:br/>
+        <w:t xml:space="preserve">    fase: "DESPUÉS",</w:t>
+        <w:br/>
+        <w:t xml:space="preserve">    faseTitulo: "Fase 3: Cierre, Métricas &amp; Continuidad Post-C1",</w:t>
+        <w:br/>
+        <w:t xml:space="preserve">    titulo: "Miércoles T+3 — Acompañamiento a Noche de Reencuentro e Inicio C2",</w:t>
+        <w:br/>
+        <w:t xml:space="preserve">    descripcion: "Seguimiento y confirmación de asistencia de los graduados a su primera sesión de seguimiento / enrolamiento activo hacia su Capítulo Dos.",</w:t>
+        <w:br/>
+        <w:t xml:space="preserve">    rol: "Capitán QT &amp; Líderes de Enrolamiento",</w:t>
+        <w:br/>
+        <w:t xml:space="preserve">    prioridad: "ALTA",</w:t>
+        <w:br/>
+        <w:t xml:space="preserve">    offsetDays: 5,</w:t>
+        <w:br/>
+        <w:t xml:space="preserve">    time: "19:00",</w:t>
+        <w:br/>
+        <w:t xml:space="preserve">    entregable: "Lista de asistencia al Reencuentro con más del 85% de presencia.",</w:t>
+        <w:br/>
+        <w:t xml:space="preserve">    origenManual: "Módulo 3: La Cadena de Continuidad Transformacional"</w:t>
+        <w:br/>
+        <w:t xml:space="preserve">  }</w:t>
+        <w:br/>
+        <w:t>];</w:t>
+        <w:br/>
+      </w:r>
+    </w:p>
+    <w:p>
+      <w:r>
+        <w:br w:type="page"/>
+      </w:r>
+    </w:p>
+    <w:p>
+      <w:r>
+        <w:rPr>
+          <w:b/>
+          <w:sz w:val="28"/>
+        </w:rPr>
         <w:t>Archivo: src/lib/firebase.js</w:t>
       </w:r>
     </w:p>
@@ -9628,6 +10335,8 @@
         <w:br/>
         <w:t>import DOMPurify from 'dompurify';</w:t>
         <w:br/>
+        <w:t>import { curriculum } from '../data/curriculum';</w:t>
+        <w:br/>
         <w:br/>
         <w:t>export default function AdminDashboard() {</w:t>
         <w:br/>
@@ -9654,23 +10363,33 @@
         <w:br/>
         <w:t xml:space="preserve">    if (!route) return 'Sin actividad';</w:t>
         <w:br/>
-        <w:t xml:space="preserve">    if (route.includes('fundamentos')) return 'Módulo 1: Fundamentos';</w:t>
-        <w:br/>
-        <w:t xml:space="preserve">    if (route.includes('m1_eval')) return 'Evaluación Módulo 1';</w:t>
-        <w:br/>
-        <w:t xml:space="preserve">    if (route.includes('groundings')) return 'Groundings';</w:t>
-        <w:br/>
-        <w:t xml:space="preserve">    if (route.includes('dinamicas')) return 'Máquina de Dinámicas';</w:t>
-        <w:br/>
-        <w:t xml:space="preserve">    if (route.includes('quiebres')) return 'Máquina de Quiebres';</w:t>
-        <w:br/>
-        <w:t xml:space="preserve">    if (route.includes('entrenamiento')) return 'Programa 6 Semanas';</w:t>
-        <w:br/>
-        <w:t xml:space="preserve">    if (route.includes('autoevaluacion')) return 'Autoevaluación Coach';</w:t>
+        <w:t xml:space="preserve">    if (route.includes('evaluacion/')) {</w:t>
+        <w:br/>
+        <w:t xml:space="preserve">      const modId = route.split('evaluacion/')[1]?.split('/')[0];</w:t>
+        <w:br/>
+        <w:t xml:space="preserve">      const match = curriculum.find(m =&gt; m.id === modId);</w:t>
+        <w:br/>
+        <w:t xml:space="preserve">      return match ? `Evaluación ${match.titulo}` : `Evaluación ${modId}`;</w:t>
+        <w:br/>
+        <w:t xml:space="preserve">    }</w:t>
+        <w:br/>
+        <w:t xml:space="preserve">    if (route.includes('modulo/')) {</w:t>
+        <w:br/>
+        <w:t xml:space="preserve">      const modId = route.split('modulo/')[1]?.split('/')[0];</w:t>
+        <w:br/>
+        <w:t xml:space="preserve">      const match = curriculum.find(m =&gt; m.id === modId);</w:t>
+        <w:br/>
+        <w:t xml:space="preserve">      return match ? match.titulo : `Módulo ${modId}`;</w:t>
+        <w:br/>
+        <w:t xml:space="preserve">    }</w:t>
+        <w:br/>
+        <w:t xml:space="preserve">    if (route.includes('glosario')) return 'Glosario Central';</w:t>
         <w:br/>
         <w:t xml:space="preserve">    if (route.includes('dashboard')) return 'Dashboard Principal';</w:t>
         <w:br/>
         <w:t xml:space="preserve">    if (route.includes('ruta')) return 'Ruta de Formación';</w:t>
+        <w:br/>
+        <w:t xml:space="preserve">    if (route.includes('admin')) return 'Panel CEO / Dirección';</w:t>
         <w:br/>
         <w:t xml:space="preserve">    return route;</w:t>
         <w:br/>
@@ -10641,11 +11360,6 @@
         <w:br/>
         <w:t xml:space="preserve">            &lt;h3 className="text-blue" style={{ marginTop: 0, marginBottom: '0.5rem', fontSize: '1.2rem', display: 'flex', alignItems: 'center', gap: '8px' }}&gt;</w:t>
         <w:br/>
-        <w:t xml:space="preserve">              &lt;svg xmlns="http://www.w3.org/2000/svg" width="20" height="20" viewBox="0 0 24 24" fill="none" stroke="currentColor" strokeWidth="2" strokeLinecap="round" strokeLinejoin="round"&gt;</w:t>
-        <w:br/>
-        <w:t xml:space="preserve">                &lt;circle cx="12" cy="5" r="3"/&gt;&lt;path d="M12 22V8"/&gt;&lt;path d="M5 12H2a10 10 0 0 0 20 0h-3"/&gt;</w:t>
-        <w:br/>
-        <w:t xml:space="preserve">              &lt;/svg&gt;</w:t>
         <w:br/>
         <w:t xml:space="preserve">              Preparación y Presencia (Grounding)</w:t>
         <w:br/>
@@ -10750,6 +11464,112 @@
         <w:t xml:space="preserve">            Continuar donde lo dejé</w:t>
         <w:br/>
         <w:t xml:space="preserve">          &lt;/button&gt;</w:t>
+        <w:br/>
+        <w:t xml:space="preserve">        &lt;/article&gt;</w:t>
+        <w:br/>
+        <w:t xml:space="preserve">      &lt;/section&gt;</w:t>
+        <w:br/>
+        <w:br/>
+        <w:t xml:space="preserve">      {/* SECCIÓN OFICIAL: TAREAS &amp; RETOS EN CONJUNTO DEL EQUIPO (DEADLINES C1) */}</w:t>
+        <w:br/>
+        <w:t xml:space="preserve">      &lt;section aria-label="Tareas y Retos de Equipo" style={{ marginTop: '2rem' }}&gt;</w:t>
+        <w:br/>
+        <w:t xml:space="preserve">        &lt;article className="glass-panel" style={{ padding: '2rem', border: '1px solid rgba(0, 210, 255, 0.3)', borderRadius: '1.25rem', position: 'relative', overflow: 'hidden' }}&gt;</w:t>
+        <w:br/>
+        <w:t xml:space="preserve">          &lt;div style={{ display: 'flex', flexWrap: 'wrap', justifyContent: 'space-between', alignItems: 'center', gap: '1.5rem' }}&gt;</w:t>
+        <w:br/>
+        <w:t xml:space="preserve">            &lt;div style={{ flex: 1, minWidth: '280px' }}&gt;</w:t>
+        <w:br/>
+        <w:t xml:space="preserve">              &lt;div style={{ display: 'inline-flex', alignItems: 'center', gap: '0.5rem', background: 'rgba(255, 183, 3, 0.15)', border: '1px solid rgba(255, 183, 3, 0.4)', padding: '0.25rem 0.75rem', borderRadius: '9999px', marginBottom: '0.6rem' }}&gt;</w:t>
+        <w:br/>
+        <w:t xml:space="preserve">                &lt;span style={{ fontSize: '0.75rem', fontWeight: 800, color: 'var(--crear-gold, #ffb703)', letterSpacing: '1px' }}&gt;⚡ RETOS EN CONJUNTO &amp; DEADLINES C1&lt;/span&gt;</w:t>
+        <w:br/>
+        <w:t xml:space="preserve">              &lt;/div&gt;</w:t>
+        <w:br/>
+        <w:t xml:space="preserve">              &lt;h3 style={{ margin: '0 0 0.5rem', fontSize: '1.5rem', fontWeight: 900, color: '#ffffff' }}&gt;</w:t>
+        <w:br/>
+        <w:t xml:space="preserve">                Tareas y Retos Sincronizados de Equipo</w:t>
+        <w:br/>
+        <w:t xml:space="preserve">              &lt;/h3&gt;</w:t>
+        <w:br/>
+        <w:t xml:space="preserve">              &lt;p className="text-muted" style={{ margin: 0, fontSize: '0.95rem', maxWidth: '650px' }}&gt;</w:t>
+        <w:br/>
+        <w:t xml:space="preserve">                Organiza las metas grupales antes, durante y después de Capítulo 1. Deadlines vivos calculados en tiempo real según la fecha de entrenamiento de tu sede.</w:t>
+        <w:br/>
+        <w:t xml:space="preserve">              &lt;/p&gt;</w:t>
+        <w:br/>
+        <w:t xml:space="preserve">            &lt;/div&gt;</w:t>
+        <w:br/>
+        <w:br/>
+        <w:t xml:space="preserve">            {/* BOTÓN + TAREA / RETO DE ALTO CONTRASTE Y MÁXIMA VISIBILIDAD */}</w:t>
+        <w:br/>
+        <w:t xml:space="preserve">            &lt;div style={{ display: 'flex', gap: '0.75rem', flexWrap: 'wrap' }}&gt;</w:t>
+        <w:br/>
+        <w:t xml:space="preserve">              &lt;button </w:t>
+        <w:br/>
+        <w:t xml:space="preserve">                onClick={() =&gt; navigate('/tareas-qt')}</w:t>
+        <w:br/>
+        <w:t xml:space="preserve">                style={{</w:t>
+        <w:br/>
+        <w:t xml:space="preserve">                  background: 'linear-gradient(135deg, #00d2ff 0%, #1a75bc 100%)',</w:t>
+        <w:br/>
+        <w:t xml:space="preserve">                  color: '#030712',</w:t>
+        <w:br/>
+        <w:t xml:space="preserve">                  border: '2px solid #ffffff',</w:t>
+        <w:br/>
+        <w:t xml:space="preserve">                  boxShadow: '0 0 25px rgba(0, 210, 255, 0.6), inset 0 1px 1px rgba(255,255,255,0.8)',</w:t>
+        <w:br/>
+        <w:t xml:space="preserve">                  padding: '0.85rem 1.75rem',</w:t>
+        <w:br/>
+        <w:t xml:space="preserve">                  borderRadius: '9999px',</w:t>
+        <w:br/>
+        <w:t xml:space="preserve">                  fontWeight: 900,</w:t>
+        <w:br/>
+        <w:t xml:space="preserve">                  fontSize: '0.9rem',</w:t>
+        <w:br/>
+        <w:t xml:space="preserve">                  letterSpacing: '1.5px',</w:t>
+        <w:br/>
+        <w:t xml:space="preserve">                  textTransform: 'uppercase',</w:t>
+        <w:br/>
+        <w:t xml:space="preserve">                  cursor: 'pointer',</w:t>
+        <w:br/>
+        <w:t xml:space="preserve">                  display: 'inline-flex',</w:t>
+        <w:br/>
+        <w:t xml:space="preserve">                  alignItems: 'center',</w:t>
+        <w:br/>
+        <w:t xml:space="preserve">                  gap: '0.5rem',</w:t>
+        <w:br/>
+        <w:t xml:space="preserve">                  transition: 'all 0.25s ease'</w:t>
+        <w:br/>
+        <w:t xml:space="preserve">                }}</w:t>
+        <w:br/>
+        <w:t xml:space="preserve">                onMouseEnter={e =&gt; {</w:t>
+        <w:br/>
+        <w:t xml:space="preserve">                  e.currentTarget.style.transform = 'scale(1.05)';</w:t>
+        <w:br/>
+        <w:t xml:space="preserve">                  e.currentTarget.style.boxShadow = '0 0 35px rgba(0, 210, 255, 0.9)';</w:t>
+        <w:br/>
+        <w:t xml:space="preserve">                }}</w:t>
+        <w:br/>
+        <w:t xml:space="preserve">                onMouseLeave={e =&gt; {</w:t>
+        <w:br/>
+        <w:t xml:space="preserve">                  e.currentTarget.style.transform = 'scale(1)';</w:t>
+        <w:br/>
+        <w:t xml:space="preserve">                  e.currentTarget.style.boxShadow = '0 0 25px rgba(0, 210, 255, 0.6), inset 0 1px 1px rgba(255,255,255,0.8)';</w:t>
+        <w:br/>
+        <w:t xml:space="preserve">                }}</w:t>
+        <w:br/>
+        <w:t xml:space="preserve">              &gt;</w:t>
+        <w:br/>
+        <w:t xml:space="preserve">                &lt;span style={{ fontSize: '1.2rem', lineHeight: 1 }}&gt;+&lt;/span&gt;</w:t>
+        <w:br/>
+        <w:t xml:space="preserve">                &lt;span&gt;TAREAS &amp; RETOS QT&lt;/span&gt;</w:t>
+        <w:br/>
+        <w:t xml:space="preserve">              &lt;/button&gt;</w:t>
+        <w:br/>
+        <w:t xml:space="preserve">            &lt;/div&gt;</w:t>
+        <w:br/>
+        <w:t xml:space="preserve">          &lt;/div&gt;</w:t>
         <w:br/>
         <w:t xml:space="preserve">        &lt;/article&gt;</w:t>
         <w:br/>
@@ -12648,6 +13468,8 @@
         <w:br/>
         <w:t xml:space="preserve">  const [completedLessons, setCompletedLessons] = useState([]);</w:t>
         <w:br/>
+        <w:t xml:space="preserve">  const [isVerifying, setIsVerifying] = useState(true);</w:t>
+        <w:br/>
         <w:br/>
         <w:t xml:space="preserve">  useEffect(() =&gt; {</w:t>
         <w:br/>
@@ -12681,16 +13503,24 @@
         <w:br/>
         <w:t xml:space="preserve">            </w:t>
         <w:br/>
-        <w:t xml:space="preserve">          if (!isPrevCompleted) {</w:t>
+        <w:t xml:space="preserve">            if (!isPrevCompleted) {</w:t>
         <w:br/>
         <w:t xml:space="preserve">            navigate('/ruta');</w:t>
         <w:br/>
+        <w:t xml:space="preserve">            return;</w:t>
+        <w:br/>
         <w:t xml:space="preserve">          }</w:t>
         <w:br/>
         <w:t xml:space="preserve">        }</w:t>
         <w:br/>
+        <w:t xml:space="preserve">        setIsVerifying(false);</w:t>
+        <w:br/>
         <w:t xml:space="preserve">      });</w:t>
         <w:br/>
+        <w:t xml:space="preserve">    } else {</w:t>
+        <w:br/>
+        <w:t xml:space="preserve">      setIsVerifying(false);</w:t>
+        <w:br/>
         <w:t xml:space="preserve">    }</w:t>
         <w:br/>
         <w:t xml:space="preserve">  }, [user, id, navigate]);</w:t>
@@ -12765,6 +13595,21 @@
         <w:t xml:space="preserve">    }</w:t>
         <w:br/>
         <w:t xml:space="preserve">  };</w:t>
+        <w:br/>
+        <w:br/>
+        <w:t xml:space="preserve">  if (isVerifying) {</w:t>
+        <w:br/>
+        <w:t xml:space="preserve">    return (</w:t>
+        <w:br/>
+        <w:t xml:space="preserve">      &lt;div className="module-container" style={{maxWidth: '800px', margin: '0 auto', paddingBottom: '4rem', paddingTop: '4rem', textAlign: 'center'}}&gt;</w:t>
+        <w:br/>
+        <w:t xml:space="preserve">        &lt;div className="text-gold" style={{fontSize: '1.2rem', opacity: 0.8}}&gt;Verificando acceso...&lt;/div&gt;</w:t>
+        <w:br/>
+        <w:t xml:space="preserve">      &lt;/div&gt;</w:t>
+        <w:br/>
+        <w:t xml:space="preserve">    );</w:t>
+        <w:br/>
+        <w:t xml:space="preserve">  }</w:t>
         <w:br/>
         <w:br/>
         <w:t xml:space="preserve">  return (</w:t>
@@ -13891,6 +14736,1461 @@
           <w:b/>
           <w:sz w:val="28"/>
         </w:rPr>
+        <w:t>Archivo: src/pages/TareasQuantumTeam.jsx</w:t>
+      </w:r>
+    </w:p>
+    <w:p>
+      <w:r>
+        <w:rPr>
+          <w:rFonts w:ascii="Consolas" w:hAnsi="Consolas"/>
+          <w:sz w:val="18"/>
+        </w:rPr>
+        <w:t>import { useState, useEffect, useMemo } from 'react';</w:t>
+        <w:br/>
+        <w:t>import { TAREAS_QT_C1 } from '../data/tareasQtData';</w:t>
+        <w:br/>
+        <w:t>import calendarioC1 from '../data/calendario_c1.json';</w:t>
+        <w:br/>
+        <w:br/>
+        <w:t>// RETOS EN CONJUNTO PREDETERMINADOS (METAS COLECTIVAS DE EQUIPO SINCRONIZADAS AL C1)</w:t>
+        <w:br/>
+        <w:t>const RETOS_CONJUNTO_DEFAULT = [</w:t>
+        <w:br/>
+        <w:t xml:space="preserve">  {</w:t>
+        <w:br/>
+        <w:t xml:space="preserve">    id: "reto-01",</w:t>
+        <w:br/>
+        <w:t xml:space="preserve">    tipo: "RETO_EQUIPO",</w:t>
+        <w:br/>
+        <w:t xml:space="preserve">    fase: "ANTES",</w:t>
+        <w:br/>
+        <w:t xml:space="preserve">    faseTitulo: "Pre-C1: Blindaje y Convocatoria",</w:t>
+        <w:br/>
+        <w:t xml:space="preserve">    titulo: "🔥 Reto Colectivo: 100% de Confirmación y Llamadas de Alineación",</w:t>
+        <w:br/>
+        <w:t xml:space="preserve">    descripcion: "Todo el equipo de Aliados y QT debe contactar al 100% de sus participantes asignados antes del jueves a las 18:00 para garantizar cero ausencias en sala.",</w:t>
+        <w:br/>
+        <w:t xml:space="preserve">    metaColectiva: "100% Asistencia confirmada",</w:t>
+        <w:br/>
+        <w:t xml:space="preserve">    offsetDays: -1,</w:t>
+        <w:br/>
+        <w:t xml:space="preserve">    time: "18:00",</w:t>
+        <w:br/>
+        <w:t xml:space="preserve">    puntosXP: "+500 XP Equipo",</w:t>
+        <w:br/>
+        <w:t xml:space="preserve">    origen: "Regla de Convocatoria Masiva"</w:t>
+        <w:br/>
+        <w:t xml:space="preserve">  },</w:t>
+        <w:br/>
+        <w:t xml:space="preserve">  {</w:t>
+        <w:br/>
+        <w:t xml:space="preserve">    id: "reto-02",</w:t>
+        <w:br/>
+        <w:t xml:space="preserve">    tipo: "RETO_EQUIPO",</w:t>
+        <w:br/>
+        <w:t xml:space="preserve">    fase: "DURANTE",</w:t>
+        <w:br/>
+        <w:t xml:space="preserve">    faseTitulo: "Día 1 Viernes: El Quiebre",</w:t>
+        <w:br/>
+        <w:t xml:space="preserve">    titulo: "⚡ Reto Colectivo: Cero Tardanzas y Retiro Hermético de Celulares",</w:t>
+        <w:br/>
+        <w:t xml:space="preserve">    descripcion: "Ningún participante ni miembro del equipo ingresa después de las 09:00 AM. Registro al 100% con celulares resguardados en sobres sellados.",</w:t>
+        <w:br/>
+        <w:t xml:space="preserve">    metaColectiva: "0 minutos de tardanza en todo el grupo",</w:t>
+        <w:br/>
+        <w:t xml:space="preserve">    offsetDays: 0,</w:t>
+        <w:br/>
+        <w:t xml:space="preserve">    time: "09:00",</w:t>
+        <w:br/>
+        <w:t xml:space="preserve">    puntosXP: "+350 XP Equipo",</w:t>
+        <w:br/>
+        <w:t xml:space="preserve">    origen: "Estándar de Impecabilidad"</w:t>
+        <w:br/>
+        <w:t xml:space="preserve">  },</w:t>
+        <w:br/>
+        <w:t xml:space="preserve">  {</w:t>
+        <w:br/>
+        <w:t xml:space="preserve">    id: "reto-03",</w:t>
+        <w:br/>
+        <w:t xml:space="preserve">    tipo: "RETO_EQUIPO",</w:t>
+        <w:br/>
+        <w:t xml:space="preserve">    fase: "DURANTE",</w:t>
+        <w:br/>
+        <w:t xml:space="preserve">    faseTitulo: "Día 2 Sábado: El Espejo",</w:t>
+        <w:br/>
+        <w:t xml:space="preserve">    titulo: "🛡️ Reto Colectivo: Sostenimiento de Cartas &amp; Cero Abandono en Procesos",</w:t>
+        <w:br/>
+        <w:t xml:space="preserve">    descripcion: "Garantizar la recolección y entrega impecable del 100% de cartas confidenciales de familiares y sostenimiento perimetral sin fugas en sala.",</w:t>
+        <w:br/>
+        <w:t xml:space="preserve">    metaColectiva: "100% de cartas procesadas",</w:t>
+        <w:br/>
+        <w:t xml:space="preserve">    offsetDays: 1,</w:t>
+        <w:br/>
+        <w:t xml:space="preserve">    time: "20:00",</w:t>
+        <w:br/>
+        <w:t xml:space="preserve">    puntosXP: "+600 XP Equipo",</w:t>
+        <w:br/>
+        <w:t xml:space="preserve">    origen: "Módulo 3: El Gran Traspaso"</w:t>
+        <w:br/>
+        <w:t xml:space="preserve">  },</w:t>
+        <w:br/>
+        <w:t xml:space="preserve">  {</w:t>
+        <w:br/>
+        <w:t xml:space="preserve">    id: "reto-04",</w:t>
+        <w:br/>
+        <w:t xml:space="preserve">    tipo: "RETO_EQUIPO",</w:t>
+        <w:br/>
+        <w:t xml:space="preserve">    fase: "DURANTE",</w:t>
+        <w:br/>
+        <w:t xml:space="preserve">    faseTitulo: "Día 3 Domingo: Graduación &amp; Enrolamiento",</w:t>
+        <w:br/>
+        <w:t xml:space="preserve">    titulo: "🏆 Reto Colectivo: Conversión Superior al 85% a Capítulo Dos (PP%)",</w:t>
+        <w:br/>
+        <w:t xml:space="preserve">    descripcion: "Acompañar y enrolar a los participantes hacia su siguiente nivel de liderazgo y transformación en Capítulo 2.",</w:t>
+        <w:br/>
+        <w:t xml:space="preserve">    metaColectiva: "PP% &gt; 85% de graduados enrolados a C2",</w:t>
+        <w:br/>
+        <w:t xml:space="preserve">    offsetDays: 2,</w:t>
+        <w:br/>
+        <w:t xml:space="preserve">    time: "18:00",</w:t>
+        <w:br/>
+        <w:t xml:space="preserve">    puntosXP: "+1000 XP Equipo Máximo",</w:t>
+        <w:br/>
+        <w:t xml:space="preserve">    origen: "Métricas de Expansión Global"</w:t>
+        <w:br/>
+        <w:t xml:space="preserve">  },</w:t>
+        <w:br/>
+        <w:t xml:space="preserve">  {</w:t>
+        <w:br/>
+        <w:t xml:space="preserve">    id: "reto-05",</w:t>
+        <w:br/>
+        <w:t xml:space="preserve">    tipo: "RETO_EQUIPO",</w:t>
+        <w:br/>
+        <w:t xml:space="preserve">    fase: "DESPUÉS",</w:t>
+        <w:br/>
+        <w:t xml:space="preserve">    faseTitulo: "Post-C1: Continuidad &amp; Reencuentro",</w:t>
+        <w:br/>
+        <w:t xml:space="preserve">    titulo: "🤝 Reto Colectivo: 100% de Graduados en la Noche de Reencuentro",</w:t>
+        <w:br/>
+        <w:t xml:space="preserve">    descripcion: "Llamada de seguimiento y presencia total de la hermandad del equipo en el primer taller de seguimiento post-C1.",</w:t>
+        <w:br/>
+        <w:t xml:space="preserve">    metaColectiva: "85%+ de presencia en Reencuentro",</w:t>
+        <w:br/>
+        <w:t xml:space="preserve">    offsetDays: 5,</w:t>
+        <w:br/>
+        <w:t xml:space="preserve">    time: "19:00",</w:t>
+        <w:br/>
+        <w:t xml:space="preserve">    puntosXP: "+400 XP Equipo",</w:t>
+        <w:br/>
+        <w:t xml:space="preserve">    origen: "Cadena de Continuidad"</w:t>
+        <w:br/>
+        <w:t xml:space="preserve">  }</w:t>
+        <w:br/>
+        <w:t>];</w:t>
+        <w:br/>
+        <w:br/>
+        <w:t>export default function TareasQuantumTeam() {</w:t>
+        <w:br/>
+        <w:t xml:space="preserve">  const sedes = [</w:t>
+        <w:br/>
+        <w:t xml:space="preserve">    { code: 'UIO1', label: 'Quito (UIO)', flag: '🇪🇨' },</w:t>
+        <w:br/>
+        <w:t xml:space="preserve">    { code: 'GYE', label: 'Guayaquil (GYE)', flag: '🇪🇨' },</w:t>
+        <w:br/>
+        <w:t xml:space="preserve">    { code: 'LIM', label: 'Lima (LIM)', flag: '🇵🇪' },</w:t>
+        <w:br/>
+        <w:t xml:space="preserve">    { code: 'CUE', label: 'Cuenca (CUE)', flag: '🇪🇨' },</w:t>
+        <w:br/>
+        <w:t xml:space="preserve">    { code: 'MED', label: 'Medellín (MED)', flag: '🇨🇴' },</w:t>
+        <w:br/>
+        <w:t xml:space="preserve">    { code: 'MEX', label: 'CDMX (MEX)', flag: '🇲🇽' }</w:t>
+        <w:br/>
+        <w:t xml:space="preserve">  ];</w:t>
+        <w:br/>
+        <w:br/>
+        <w:t xml:space="preserve">  const [selectedSede, setSelectedSede] = useState('LIM');</w:t>
+        <w:br/>
+        <w:t xml:space="preserve">  const [selectedEventIndex, setSelectedEventIndex] = useState(0);</w:t>
+        <w:br/>
+        <w:t xml:space="preserve">  const [activeTab, setActiveTab] = useState('ALL'); // 'ALL', 'TAREAS', 'RETOS'</w:t>
+        <w:br/>
+        <w:t xml:space="preserve">  const [filterFase, setFilterFase] = useState('TODAS');</w:t>
+        <w:br/>
+        <w:t xml:space="preserve">  const [filterRol, setFilterRol] = useState('TODOS');</w:t>
+        <w:br/>
+        <w:t xml:space="preserve">  const [now, setNow] = useState(new Date());</w:t>
+        <w:br/>
+        <w:t xml:space="preserve">  const [showNewTaskModal, setShowNewTaskModal] = useState(false);</w:t>
+        <w:br/>
+        <w:br/>
+        <w:t xml:space="preserve">  // Tareas personalizadas creadas por el usuario</w:t>
+        <w:br/>
+        <w:t xml:space="preserve">  const [customItems, setCustomItems] = useState(() =&gt; {</w:t>
+        <w:br/>
+        <w:t xml:space="preserve">    try {</w:t>
+        <w:br/>
+        <w:t xml:space="preserve">      return JSON.parse(localStorage.getItem('cpsl_custom_qt_items_v1') || '[]');</w:t>
+        <w:br/>
+        <w:t xml:space="preserve">    } catch {</w:t>
+        <w:br/>
+        <w:t xml:space="preserve">      return [];</w:t>
+        <w:br/>
+        <w:t xml:space="preserve">    }</w:t>
+        <w:br/>
+        <w:t xml:space="preserve">  });</w:t>
+        <w:br/>
+        <w:br/>
+        <w:t xml:space="preserve">  // Estado del formulario de nueva tarea/reto</w:t>
+        <w:br/>
+        <w:t xml:space="preserve">  const [newItemForm, setNewItemForm] = useState({</w:t>
+        <w:br/>
+        <w:t xml:space="preserve">    tipo: 'TAREA',</w:t>
+        <w:br/>
+        <w:t xml:space="preserve">    titulo: '',</w:t>
+        <w:br/>
+        <w:t xml:space="preserve">    descripcion: '',</w:t>
+        <w:br/>
+        <w:t xml:space="preserve">    fase: 'ANTES',</w:t>
+        <w:br/>
+        <w:t xml:space="preserve">    offsetDays: 0,</w:t>
+        <w:br/>
+        <w:t xml:space="preserve">    time: '12:00',</w:t>
+        <w:br/>
+        <w:t xml:space="preserve">    rol: 'Todos los QT',</w:t>
+        <w:br/>
+        <w:t xml:space="preserve">    entregable: '',</w:t>
+        <w:br/>
+        <w:t xml:space="preserve">    metaColectiva: '',</w:t>
+        <w:br/>
+        <w:t xml:space="preserve">    puntosXP: '+150 XP'</w:t>
+        <w:br/>
+        <w:t xml:space="preserve">  });</w:t>
+        <w:br/>
+        <w:br/>
+        <w:t xml:space="preserve">  // Progreso completado</w:t>
+        <w:br/>
+        <w:t xml:space="preserve">  const [completedTasks, setCompletedTasks] = useState(() =&gt; {</w:t>
+        <w:br/>
+        <w:t xml:space="preserve">    try {</w:t>
+        <w:br/>
+        <w:t xml:space="preserve">      return JSON.parse(localStorage.getItem('cpsl_qt_completed_tasks_v1') || '{}');</w:t>
+        <w:br/>
+        <w:t xml:space="preserve">    } catch {</w:t>
+        <w:br/>
+        <w:t xml:space="preserve">      return {};</w:t>
+        <w:br/>
+        <w:t xml:space="preserve">    }</w:t>
+        <w:br/>
+        <w:t xml:space="preserve">  });</w:t>
+        <w:br/>
+        <w:br/>
+        <w:t xml:space="preserve">  // Reloj en tiempo real</w:t>
+        <w:br/>
+        <w:t xml:space="preserve">  useEffect(() =&gt; {</w:t>
+        <w:br/>
+        <w:t xml:space="preserve">    const timer = setInterval(() =&gt; setNow(new Date()), 1000);</w:t>
+        <w:br/>
+        <w:t xml:space="preserve">    return () =&gt; clearInterval(timer);</w:t>
+        <w:br/>
+        <w:t xml:space="preserve">  }, []);</w:t>
+        <w:br/>
+        <w:br/>
+        <w:t xml:space="preserve">  // Lista de eventos C1 de la sede seleccionada</w:t>
+        <w:br/>
+        <w:t xml:space="preserve">  const sedeEvents = useMemo(() =&gt; {</w:t>
+        <w:br/>
+        <w:t xml:space="preserve">    const list = calendarioC1[selectedSede] || [];</w:t>
+        <w:br/>
+        <w:t xml:space="preserve">    return [...list].sort((a, b) =&gt; new Date(a.start) - new Date(b.start));</w:t>
+        <w:br/>
+        <w:t xml:space="preserve">  }, [selectedSede]);</w:t>
+        <w:br/>
+        <w:br/>
+        <w:t xml:space="preserve">  // Seleccionar automáticamente el próximo evento futuro</w:t>
+        <w:br/>
+        <w:t xml:space="preserve">  useEffect(() =&gt; {</w:t>
+        <w:br/>
+        <w:t xml:space="preserve">    if (sedeEvents.length &gt; 0) {</w:t>
+        <w:br/>
+        <w:t xml:space="preserve">      const nowTime = now.getTime();</w:t>
+        <w:br/>
+        <w:t xml:space="preserve">      const nextIdx = sedeEvents.findIndex(ev =&gt; new Date(ev.start).getTime() &gt;= nowTime);</w:t>
+        <w:br/>
+        <w:t xml:space="preserve">      setSelectedEventIndex(nextIdx !== -1 ? nextIdx : sedeEvents.length - 1);</w:t>
+        <w:br/>
+        <w:t xml:space="preserve">    }</w:t>
+        <w:br/>
+        <w:t xml:space="preserve">  }, [selectedSede, sedeEvents]);</w:t>
+        <w:br/>
+        <w:br/>
+        <w:t xml:space="preserve">  const activeEvent = sedeEvents[selectedEventIndex] || sedeEvents[0] || { start: '2026-09-11T09:00:00', equipo: '1' };</w:t>
+        <w:br/>
+        <w:t xml:space="preserve">  const eventStartDate = useMemo(() =&gt; new Date(activeEvent.start), [activeEvent]);</w:t>
+        <w:br/>
+        <w:br/>
+        <w:t xml:space="preserve">  // Clave de almacenamiento</w:t>
+        <w:br/>
+        <w:t xml:space="preserve">  const eventStorageKey = `${selectedSede}_EQ${activeEvent.equipo || selectedEventIndex}_${activeEvent.start}`;</w:t>
+        <w:br/>
+        <w:br/>
+        <w:t xml:space="preserve">  const toggleTask = (taskId) =&gt; {</w:t>
+        <w:br/>
+        <w:t xml:space="preserve">    const updated = {</w:t>
+        <w:br/>
+        <w:t xml:space="preserve">      ...completedTasks,</w:t>
+        <w:br/>
+        <w:t xml:space="preserve">      [eventStorageKey]: {</w:t>
+        <w:br/>
+        <w:t xml:space="preserve">        ...(completedTasks[eventStorageKey] || {}),</w:t>
+        <w:br/>
+        <w:t xml:space="preserve">        [taskId]: !(completedTasks[eventStorageKey] &amp;&amp; completedTasks[eventStorageKey][taskId])</w:t>
+        <w:br/>
+        <w:t xml:space="preserve">      }</w:t>
+        <w:br/>
+        <w:t xml:space="preserve">    };</w:t>
+        <w:br/>
+        <w:t xml:space="preserve">    setCompletedTasks(updated);</w:t>
+        <w:br/>
+        <w:t xml:space="preserve">    try {</w:t>
+        <w:br/>
+        <w:t xml:space="preserve">      localStorage.setItem('cpsl_qt_completed_tasks_v1', JSON.stringify(updated));</w:t>
+        <w:br/>
+        <w:t xml:space="preserve">    } catch (e) {</w:t>
+        <w:br/>
+        <w:t xml:space="preserve">      console.warn("Storage warning:", e);</w:t>
+        <w:br/>
+        <w:t xml:space="preserve">    }</w:t>
+        <w:br/>
+        <w:t xml:space="preserve">  };</w:t>
+        <w:br/>
+        <w:br/>
+        <w:t xml:space="preserve">  // Guardar nueva tarea o reto creado</w:t>
+        <w:br/>
+        <w:t xml:space="preserve">  const handleCreateNewItem = (e) =&gt; {</w:t>
+        <w:br/>
+        <w:t xml:space="preserve">    e.preventDefault();</w:t>
+        <w:br/>
+        <w:t xml:space="preserve">    if (!newItemForm.titulo) return;</w:t>
+        <w:br/>
+        <w:br/>
+        <w:t xml:space="preserve">    const newItem = {</w:t>
+        <w:br/>
+        <w:t xml:space="preserve">      id: 'custom-' + Date.now(),</w:t>
+        <w:br/>
+        <w:t xml:space="preserve">      ...newItemForm,</w:t>
+        <w:br/>
+        <w:t xml:space="preserve">      offsetDays: Number(newItemForm.offsetDays),</w:t>
+        <w:br/>
+        <w:t xml:space="preserve">      origenManual: 'Creado por el Equipo',</w:t>
+        <w:br/>
+        <w:t xml:space="preserve">      origen: 'Reto Creado por el Equipo'</w:t>
+        <w:br/>
+        <w:t xml:space="preserve">    };</w:t>
+        <w:br/>
+        <w:br/>
+        <w:t xml:space="preserve">    const updated = [...customItems, newItem];</w:t>
+        <w:br/>
+        <w:t xml:space="preserve">    setCustomItems(updated);</w:t>
+        <w:br/>
+        <w:t xml:space="preserve">    try {</w:t>
+        <w:br/>
+        <w:t xml:space="preserve">      localStorage.setItem('cpsl_custom_qt_items_v1', JSON.stringify(updated));</w:t>
+        <w:br/>
+        <w:t xml:space="preserve">    } catch (err) {</w:t>
+        <w:br/>
+        <w:t xml:space="preserve">      console.warn("Storage error:", err);</w:t>
+        <w:br/>
+        <w:t xml:space="preserve">    }</w:t>
+        <w:br/>
+        <w:br/>
+        <w:t xml:space="preserve">    setShowNewTaskModal(false);</w:t>
+        <w:br/>
+        <w:t xml:space="preserve">    setNewItemForm({</w:t>
+        <w:br/>
+        <w:t xml:space="preserve">      tipo: 'TAREA',</w:t>
+        <w:br/>
+        <w:t xml:space="preserve">      titulo: '',</w:t>
+        <w:br/>
+        <w:t xml:space="preserve">      descripcion: '',</w:t>
+        <w:br/>
+        <w:t xml:space="preserve">      fase: 'ANTES',</w:t>
+        <w:br/>
+        <w:t xml:space="preserve">      offsetDays: 0,</w:t>
+        <w:br/>
+        <w:t xml:space="preserve">      time: '12:00',</w:t>
+        <w:br/>
+        <w:t xml:space="preserve">      rol: 'Todos los QT',</w:t>
+        <w:br/>
+        <w:t xml:space="preserve">      entregable: '',</w:t>
+        <w:br/>
+        <w:t xml:space="preserve">      metaColectiva: '',</w:t>
+        <w:br/>
+        <w:t xml:space="preserve">      puntosXP: '+150 XP'</w:t>
+        <w:br/>
+        <w:t xml:space="preserve">    });</w:t>
+        <w:br/>
+        <w:t xml:space="preserve">  };</w:t>
+        <w:br/>
+        <w:br/>
+        <w:t xml:space="preserve">  // Unión de tareas maestras + retos en conjunto + personalizadas</w:t>
+        <w:br/>
+        <w:t xml:space="preserve">  const allMasterItems = useMemo(() =&gt; {</w:t>
+        <w:br/>
+        <w:t xml:space="preserve">    const combined = [</w:t>
+        <w:br/>
+        <w:t xml:space="preserve">      ...TAREAS_QT_C1.map(t =&gt; ({ ...t, tipo: 'TAREA' })),</w:t>
+        <w:br/>
+        <w:t xml:space="preserve">      ...RETOS_CONJUNTO_DEFAULT,</w:t>
+        <w:br/>
+        <w:t xml:space="preserve">      ...customItems</w:t>
+        <w:br/>
+        <w:t xml:space="preserve">    ];</w:t>
+        <w:br/>
+        <w:t xml:space="preserve">    return combined;</w:t>
+        <w:br/>
+        <w:t xml:space="preserve">  }, [customItems]);</w:t>
+        <w:br/>
+        <w:br/>
+        <w:t xml:space="preserve">  // Cálculo de fechas y deadlines en tiempo real</w:t>
+        <w:br/>
+        <w:t xml:space="preserve">  const computedItems = useMemo(() =&gt; {</w:t>
+        <w:br/>
+        <w:t xml:space="preserve">    return allMasterItems.map(item =&gt; {</w:t>
+        <w:br/>
+        <w:t xml:space="preserve">      const itemDate = new Date(eventStartDate);</w:t>
+        <w:br/>
+        <w:t xml:space="preserve">      itemDate.setDate(itemDate.getDate() + item.offsetDays);</w:t>
+        <w:br/>
+        <w:t xml:space="preserve">      const [h, m] = (item.time || "12:00").split(':').map(Number);</w:t>
+        <w:br/>
+        <w:t xml:space="preserve">      itemDate.setHours(h || 12, m || 0, 0, 0);</w:t>
+        <w:br/>
+        <w:br/>
+        <w:t xml:space="preserve">      const isCompleted = !!(completedTasks[eventStorageKey] &amp;&amp; completedTasks[eventStorageKey][item.id]);</w:t>
+        <w:br/>
+        <w:t xml:space="preserve">      const diffMs = itemDate.getTime() - now.getTime();</w:t>
+        <w:br/>
+        <w:t xml:space="preserve">      const isPast = diffMs &lt; 0;</w:t>
+        <w:br/>
+        <w:t xml:space="preserve">      const isToday = itemDate.toDateString() === now.toDateString();</w:t>
+        <w:br/>
+        <w:br/>
+        <w:t xml:space="preserve">      let status = 'UPCOMING';</w:t>
+        <w:br/>
+        <w:t xml:space="preserve">      if (isCompleted) status = 'DONE';</w:t>
+        <w:br/>
+        <w:t xml:space="preserve">      else if (isPast) status = 'OVERDUE';</w:t>
+        <w:br/>
+        <w:t xml:space="preserve">      else if (isToday) status = 'TODAY';</w:t>
+        <w:br/>
+        <w:br/>
+        <w:t xml:space="preserve">      return {</w:t>
+        <w:br/>
+        <w:t xml:space="preserve">        ...item,</w:t>
+        <w:br/>
+        <w:t xml:space="preserve">        deadlineDate: itemDate,</w:t>
+        <w:br/>
+        <w:t xml:space="preserve">        diffMs,</w:t>
+        <w:br/>
+        <w:t xml:space="preserve">        isCompleted,</w:t>
+        <w:br/>
+        <w:t xml:space="preserve">        status</w:t>
+        <w:br/>
+        <w:t xml:space="preserve">      };</w:t>
+        <w:br/>
+        <w:t xml:space="preserve">    });</w:t>
+        <w:br/>
+        <w:t xml:space="preserve">  }, [allMasterItems, eventStartDate, now, completedTasks, eventStorageKey]);</w:t>
+        <w:br/>
+        <w:br/>
+        <w:t xml:space="preserve">  // Filtros de pestaña, fase y rol</w:t>
+        <w:br/>
+        <w:t xml:space="preserve">  const filteredItems = useMemo(() =&gt; {</w:t>
+        <w:br/>
+        <w:t xml:space="preserve">    return computedItems.filter(item =&gt; {</w:t>
+        <w:br/>
+        <w:t xml:space="preserve">      if (activeTab === 'TAREAS' &amp;&amp; item.tipo !== 'TAREA') return false;</w:t>
+        <w:br/>
+        <w:t xml:space="preserve">      if (activeTab === 'RETOS' &amp;&amp; item.tipo !== 'RETO_EQUIPO') return false;</w:t>
+        <w:br/>
+        <w:t xml:space="preserve">      if (filterFase !== 'TODAS' &amp;&amp; item.fase !== filterFase) return false;</w:t>
+        <w:br/>
+        <w:t xml:space="preserve">      if (filterRol !== 'TODOS' &amp;&amp; item.rol &amp;&amp; !item.rol.toLowerCase().includes(filterRol.toLowerCase()) &amp;&amp; !item.rol.includes('Todos')) return false;</w:t>
+        <w:br/>
+        <w:t xml:space="preserve">      return true;</w:t>
+        <w:br/>
+        <w:t xml:space="preserve">    });</w:t>
+        <w:br/>
+        <w:t xml:space="preserve">  }, [computedItems, activeTab, filterFase, filterRol]);</w:t>
+        <w:br/>
+        <w:br/>
+        <w:t xml:space="preserve">  // Estadísticas</w:t>
+        <w:br/>
+        <w:t xml:space="preserve">  const totalCount = computedItems.length;</w:t>
+        <w:br/>
+        <w:t xml:space="preserve">  const completedCount = computedItems.filter(t =&gt; t.isCompleted).length;</w:t>
+        <w:br/>
+        <w:t xml:space="preserve">  const progressPct = Math.round((completedCount / totalCount) * 100) || 0;</w:t>
+        <w:br/>
+        <w:br/>
+        <w:t xml:space="preserve">  // Cuenta regresiva</w:t>
+        <w:br/>
+        <w:t xml:space="preserve">  const eventDiffMs = eventStartDate.getTime() - now.getTime();</w:t>
+        <w:br/>
+        <w:t xml:space="preserve">  const isEventPast = eventDiffMs &lt; 0;</w:t>
+        <w:br/>
+        <w:t xml:space="preserve">  const countdownDays = Math.abs(Math.floor(eventDiffMs / (1000 * 60 * 60 * 24)));</w:t>
+        <w:br/>
+        <w:t xml:space="preserve">  const countdownHours = Math.abs(Math.floor((eventDiffMs / (1000 * 60 * 60)) % 24));</w:t>
+        <w:br/>
+        <w:t xml:space="preserve">  const countdownMinutes = Math.abs(Math.floor((eventDiffMs / (1000 * 60)) % 60));</w:t>
+        <w:br/>
+        <w:t xml:space="preserve">  const countdownSeconds = Math.abs(Math.floor((eventDiffMs / 1000) % 60));</w:t>
+        <w:br/>
+        <w:br/>
+        <w:t xml:space="preserve">  const formatFechaLarga = (date) =&gt; {</w:t>
+        <w:br/>
+        <w:t xml:space="preserve">    return date.toLocaleDateString('es-ES', {</w:t>
+        <w:br/>
+        <w:t xml:space="preserve">      weekday: 'short',</w:t>
+        <w:br/>
+        <w:t xml:space="preserve">      day: 'numeric',</w:t>
+        <w:br/>
+        <w:t xml:space="preserve">      month: 'short',</w:t>
+        <w:br/>
+        <w:t xml:space="preserve">      year: 'numeric',</w:t>
+        <w:br/>
+        <w:t xml:space="preserve">      hour: '2-digit',</w:t>
+        <w:br/>
+        <w:t xml:space="preserve">      minute: '2-digit'</w:t>
+        <w:br/>
+        <w:t xml:space="preserve">    });</w:t>
+        <w:br/>
+        <w:t xml:space="preserve">  };</w:t>
+        <w:br/>
+        <w:br/>
+        <w:t xml:space="preserve">  return (</w:t>
+        <w:br/>
+        <w:t xml:space="preserve">    &lt;div className="tareas-qt-page" style={{ padding: '2rem 1.5rem', maxWidth: '1280px', margin: '0 auto', color: '#f3f4f6' }}&gt;</w:t>
+        <w:br/>
+        <w:t xml:space="preserve">      </w:t>
+        <w:br/>
+        <w:t xml:space="preserve">      {/* HEADER DE IMPACTO */}</w:t>
+        <w:br/>
+        <w:t xml:space="preserve">      &lt;div className="glass-panel" style={{ padding: '2rem', borderRadius: '1.5rem', marginBottom: '2rem', border: '1px solid rgba(0, 210, 255, 0.35)', position: 'relative', overflow: 'hidden' }}&gt;</w:t>
+        <w:br/>
+        <w:t xml:space="preserve">        &lt;div style={{ position: 'absolute', top: '-40px', right: '-40px', width: '220px', height: '220px', background: 'radial-gradient(circle, rgba(0,210,255,0.2) 0%, transparent 70%)', pointerEvents: 'none' }}&gt;&lt;/div&gt;</w:t>
+        <w:br/>
+        <w:t xml:space="preserve">        </w:t>
+        <w:br/>
+        <w:t xml:space="preserve">        &lt;div style={{ display: 'flex', flexWrap: 'wrap', justifyContent: 'space-between', alignItems: 'center', gap: '1.5rem' }}&gt;</w:t>
+        <w:br/>
+        <w:t xml:space="preserve">          &lt;div&gt;</w:t>
+        <w:br/>
+        <w:t xml:space="preserve">            &lt;div style={{ display: 'inline-flex', alignItems: 'center', gap: '0.5rem', background: 'rgba(0, 210, 255, 0.12)', border: '1px solid rgba(0, 210, 255, 0.4)', padding: '0.35rem 0.85rem', borderRadius: '9999px', marginBottom: '0.75rem' }}&gt;</w:t>
+        <w:br/>
+        <w:t xml:space="preserve">              &lt;span style={{ width: '8px', height: '8px', borderRadius: '50%', background: '#00d2ff', boxShadow: '0 0 8px #00d2ff' }}&gt;&lt;/span&gt;</w:t>
+        <w:br/>
+        <w:t xml:space="preserve">              &lt;span style={{ fontSize: '0.75rem', fontWeight: 800, letterSpacing: '1.5px', color: '#00d2ff', textTransform: 'uppercase' }}&gt;Sistema Operativo QT — Tareas &amp; Retos Vivos&lt;/span&gt;</w:t>
+        <w:br/>
+        <w:t xml:space="preserve">            &lt;/div&gt;</w:t>
+        <w:br/>
+        <w:t xml:space="preserve">            &lt;h1 style={{ fontSize: '2.2rem', fontWeight: 900, margin: 0, letterSpacing: '-0.5px' }}&gt;</w:t>
+        <w:br/>
+        <w:t xml:space="preserve">              Tareas &amp; Retos de Equipo en Vivo</w:t>
+        <w:br/>
+        <w:t xml:space="preserve">            &lt;/h1&gt;</w:t>
+        <w:br/>
+        <w:t xml:space="preserve">            &lt;p style={{ margin: '0.5rem 0 0', color: '#9ca3af', fontSize: '0.95rem', maxWidth: '650px' }}&gt;</w:t>
+        <w:br/>
+        <w:t xml:space="preserve">              Metas colectivas y cronograma operacional sincronizado al minuto con el calendario oficial de Capítulo 1.</w:t>
+        <w:br/>
+        <w:t xml:space="preserve">            &lt;/p&gt;</w:t>
+        <w:br/>
+        <w:t xml:space="preserve">          &lt;/div&gt;</w:t>
+        <w:br/>
+        <w:br/>
+        <w:t xml:space="preserve">          {/* CUENTA REGRESIVA VIVA &amp; BOTÓN + TAREA/RETO */}</w:t>
+        <w:br/>
+        <w:t xml:space="preserve">          &lt;div style={{ display: 'flex', flexDirection: 'column', gap: '1rem', alignItems: 'flex-end' }}&gt;</w:t>
+        <w:br/>
+        <w:t xml:space="preserve">            </w:t>
+        <w:br/>
+        <w:t xml:space="preserve">            {/* BOTÓN + TAREA / RETO DE ALTO CONTRASTE */}</w:t>
+        <w:br/>
+        <w:t xml:space="preserve">            &lt;button</w:t>
+        <w:br/>
+        <w:t xml:space="preserve">              onClick={() =&gt; setShowNewTaskModal(true)}</w:t>
+        <w:br/>
+        <w:t xml:space="preserve">              style={{</w:t>
+        <w:br/>
+        <w:t xml:space="preserve">                background: 'linear-gradient(135deg, #00d2ff 0%, #1a75bc 100%)',</w:t>
+        <w:br/>
+        <w:t xml:space="preserve">                color: '#030712',</w:t>
+        <w:br/>
+        <w:t xml:space="preserve">                border: '2px solid #ffffff',</w:t>
+        <w:br/>
+        <w:t xml:space="preserve">                boxShadow: '0 0 25px rgba(0, 210, 255, 0.7), inset 0 1px 1px rgba(255,255,255,0.9)',</w:t>
+        <w:br/>
+        <w:t xml:space="preserve">                padding: '0.8rem 1.6rem',</w:t>
+        <w:br/>
+        <w:t xml:space="preserve">                borderRadius: '9999px',</w:t>
+        <w:br/>
+        <w:t xml:space="preserve">                fontWeight: 900,</w:t>
+        <w:br/>
+        <w:t xml:space="preserve">                fontSize: '0.85rem',</w:t>
+        <w:br/>
+        <w:t xml:space="preserve">                letterSpacing: '1.5px',</w:t>
+        <w:br/>
+        <w:t xml:space="preserve">                textTransform: 'uppercase',</w:t>
+        <w:br/>
+        <w:t xml:space="preserve">                cursor: 'pointer',</w:t>
+        <w:br/>
+        <w:t xml:space="preserve">                display: 'inline-flex',</w:t>
+        <w:br/>
+        <w:t xml:space="preserve">                alignItems: 'center',</w:t>
+        <w:br/>
+        <w:t xml:space="preserve">                gap: '0.5rem',</w:t>
+        <w:br/>
+        <w:t xml:space="preserve">                transition: 'all 0.25s ease'</w:t>
+        <w:br/>
+        <w:t xml:space="preserve">              }}</w:t>
+        <w:br/>
+        <w:t xml:space="preserve">              onMouseEnter={e =&gt; {</w:t>
+        <w:br/>
+        <w:t xml:space="preserve">                e.currentTarget.style.transform = 'scale(1.05)';</w:t>
+        <w:br/>
+        <w:t xml:space="preserve">                e.currentTarget.style.boxShadow = '0 0 35px rgba(0, 210, 255, 0.95)';</w:t>
+        <w:br/>
+        <w:t xml:space="preserve">              }}</w:t>
+        <w:br/>
+        <w:t xml:space="preserve">              onMouseLeave={e =&gt; {</w:t>
+        <w:br/>
+        <w:t xml:space="preserve">                e.currentTarget.style.transform = 'scale(1)';</w:t>
+        <w:br/>
+        <w:t xml:space="preserve">                e.currentTarget.style.boxShadow = '0 0 25px rgba(0, 210, 255, 0.7), inset 0 1px 1px rgba(255,255,255,0.9)';</w:t>
+        <w:br/>
+        <w:t xml:space="preserve">              }}</w:t>
+        <w:br/>
+        <w:t xml:space="preserve">            &gt;</w:t>
+        <w:br/>
+        <w:t xml:space="preserve">              &lt;span style={{ fontSize: '1.2rem', lineHeight: 1 }}&gt;+&lt;/span&gt;</w:t>
+        <w:br/>
+        <w:t xml:space="preserve">              &lt;span&gt;CREAR TAREA O RETO DE EQUIPO&lt;/span&gt;</w:t>
+        <w:br/>
+        <w:t xml:space="preserve">            &lt;/button&gt;</w:t>
+        <w:br/>
+        <w:br/>
+        <w:t xml:space="preserve">            {/* Contador de Tiempo */}</w:t>
+        <w:br/>
+        <w:t xml:space="preserve">            &lt;div style={{ background: 'rgba(3, 7, 18, 0.85)', border: '1px solid rgba(212, 175, 55, 0.45)', borderRadius: '1rem', padding: '0.85rem 1.4rem', textAlign: 'center', minWidth: '260px' }}&gt;</w:t>
+        <w:br/>
+        <w:t xml:space="preserve">              &lt;span style={{ fontSize: '0.7rem', fontWeight: 800, color: 'var(--crear-gold, #ffb703)', textTransform: 'uppercase', letterSpacing: '1px', display: 'block', marginBottom: '0.25rem' }}&gt;</w:t>
+        <w:br/>
+        <w:t xml:space="preserve">                {isEventPast ? '⚡ ENTRENAMIENTO EN CURSO / FINALIZADO' : '⏳ CUENTA REGRESIVA AL INICIO C1'}</w:t>
+        <w:br/>
+        <w:t xml:space="preserve">              &lt;/span&gt;</w:t>
+        <w:br/>
+        <w:t xml:space="preserve">              &lt;div style={{ display: 'flex', justifyContent: 'center', gap: '0.5rem', fontFamily: 'monospace', fontSize: '1.4rem', fontWeight: 900, color: '#ffffff' }}&gt;</w:t>
+        <w:br/>
+        <w:t xml:space="preserve">                &lt;div&gt;&lt;span&gt;{String(countdownDays).padStart(2, '0')}&lt;/span&gt;&lt;span style={{ fontSize: '0.55rem', display: 'block', color: '#9ca3af', fontWeight: 'normal' }}&gt;DÍAS&lt;/span&gt;&lt;/div&gt;</w:t>
+        <w:br/>
+        <w:t xml:space="preserve">                &lt;span&gt;:&lt;/span&gt;</w:t>
+        <w:br/>
+        <w:t xml:space="preserve">                &lt;div&gt;&lt;span&gt;{String(countdownHours).padStart(2, '0')}&lt;/span&gt;&lt;span style={{ fontSize: '0.55rem', display: 'block', color: '#9ca3af', fontWeight: 'normal' }}&gt;HRS&lt;/span&gt;&lt;/div&gt;</w:t>
+        <w:br/>
+        <w:t xml:space="preserve">                &lt;span&gt;:&lt;/span&gt;</w:t>
+        <w:br/>
+        <w:t xml:space="preserve">                &lt;div&gt;&lt;span&gt;{String(countdownMinutes).padStart(2, '0')}&lt;/span&gt;&lt;span style={{ fontSize: '0.55rem', display: 'block', color: '#9ca3af', fontWeight: 'normal' }}&gt;MIN&lt;/span&gt;&lt;/div&gt;</w:t>
+        <w:br/>
+        <w:t xml:space="preserve">                &lt;span&gt;:&lt;/span&gt;</w:t>
+        <w:br/>
+        <w:t xml:space="preserve">                &lt;div&gt;&lt;span style={{ color: '#00d2ff' }}&gt;{String(countdownSeconds).padStart(2, '0')}&lt;/span&gt;&lt;span style={{ fontSize: '0.55rem', display: 'block', color: '#9ca3af', fontWeight: 'normal' }}&gt;SEG&lt;/span&gt;&lt;/div&gt;</w:t>
+        <w:br/>
+        <w:t xml:space="preserve">              &lt;/div&gt;</w:t>
+        <w:br/>
+        <w:t xml:space="preserve">            &lt;/div&gt;</w:t>
+        <w:br/>
+        <w:t xml:space="preserve">          &lt;/div&gt;</w:t>
+        <w:br/>
+        <w:t xml:space="preserve">        &lt;/div&gt;</w:t>
+        <w:br/>
+        <w:t xml:space="preserve">      &lt;/div&gt;</w:t>
+        <w:br/>
+        <w:br/>
+        <w:t xml:space="preserve">      {/* SELECTOR DE SEDE Y EDICIÓN */}</w:t>
+        <w:br/>
+        <w:t xml:space="preserve">      &lt;div className="glass-panel" style={{ padding: '1.25rem', borderRadius: '1rem', marginBottom: '1.5rem', display: 'flex', flexWrap: 'wrap', gap: '1rem', alignItems: 'center', justifyContent: 'space-between' }}&gt;</w:t>
+        <w:br/>
+        <w:t xml:space="preserve">        </w:t>
+        <w:br/>
+        <w:t xml:space="preserve">        {/* Píldoras de Sedes */}</w:t>
+        <w:br/>
+        <w:t xml:space="preserve">        &lt;div style={{ display: 'flex', flexWrap: 'wrap', gap: '0.5rem', alignItems: 'center' }}&gt;</w:t>
+        <w:br/>
+        <w:t xml:space="preserve">          &lt;span style={{ fontSize: '0.8rem', fontWeight: 700, color: '#9ca3af', marginRight: '0.25rem' }}&gt;SEDE:&lt;/span&gt;</w:t>
+        <w:br/>
+        <w:t xml:space="preserve">          {sedes.map(s =&gt; (</w:t>
+        <w:br/>
+        <w:t xml:space="preserve">            &lt;button</w:t>
+        <w:br/>
+        <w:t xml:space="preserve">              key={s.code}</w:t>
+        <w:br/>
+        <w:t xml:space="preserve">              onClick={() =&gt; setSelectedSede(s.code)}</w:t>
+        <w:br/>
+        <w:t xml:space="preserve">              style={{</w:t>
+        <w:br/>
+        <w:t xml:space="preserve">                background: selectedSede === s.code ? 'linear-gradient(135deg, rgba(0, 210, 255, 0.25), rgba(26, 117, 188, 0.4))' : 'rgba(255, 255, 255, 0.05)',</w:t>
+        <w:br/>
+        <w:t xml:space="preserve">                border: selectedSede === s.code ? '1px solid #00d2ff' : '1px solid rgba(255, 255, 255, 0.1)',</w:t>
+        <w:br/>
+        <w:t xml:space="preserve">                color: selectedSede === s.code ? '#00d2ff' : '#e5e7eb',</w:t>
+        <w:br/>
+        <w:t xml:space="preserve">                padding: '0.45rem 0.85rem',</w:t>
+        <w:br/>
+        <w:t xml:space="preserve">                borderRadius: '0.6rem',</w:t>
+        <w:br/>
+        <w:t xml:space="preserve">                fontSize: '0.8rem',</w:t>
+        <w:br/>
+        <w:t xml:space="preserve">                fontWeight: 700,</w:t>
+        <w:br/>
+        <w:t xml:space="preserve">                cursor: 'pointer',</w:t>
+        <w:br/>
+        <w:t xml:space="preserve">                transition: 'all 0.2s ease',</w:t>
+        <w:br/>
+        <w:t xml:space="preserve">                display: 'flex',</w:t>
+        <w:br/>
+        <w:t xml:space="preserve">                alignItems: 'center',</w:t>
+        <w:br/>
+        <w:t xml:space="preserve">                gap: '0.35rem'</w:t>
+        <w:br/>
+        <w:t xml:space="preserve">              }}</w:t>
+        <w:br/>
+        <w:t xml:space="preserve">            &gt;</w:t>
+        <w:br/>
+        <w:t xml:space="preserve">              &lt;span&gt;{s.flag}&lt;/span&gt;</w:t>
+        <w:br/>
+        <w:t xml:space="preserve">              &lt;span&gt;{s.label}&lt;/span&gt;</w:t>
+        <w:br/>
+        <w:t xml:space="preserve">            &lt;/button&gt;</w:t>
+        <w:br/>
+        <w:t xml:space="preserve">          ))}</w:t>
+        <w:br/>
+        <w:t xml:space="preserve">        &lt;/div&gt;</w:t>
+        <w:br/>
+        <w:br/>
+        <w:t xml:space="preserve">        {/* Selector de Edición / Fecha de C1 */}</w:t>
+        <w:br/>
+        <w:t xml:space="preserve">        &lt;div style={{ display: 'flex', alignItems: 'center', gap: '0.5rem' }}&gt;</w:t>
+        <w:br/>
+        <w:t xml:space="preserve">          &lt;span style={{ fontSize: '0.8rem', fontWeight: 700, color: '#9ca3af' }}&gt;EDICIÓN C1:&lt;/span&gt;</w:t>
+        <w:br/>
+        <w:t xml:space="preserve">          &lt;select</w:t>
+        <w:br/>
+        <w:t xml:space="preserve">            value={selectedEventIndex}</w:t>
+        <w:br/>
+        <w:t xml:space="preserve">            onChange={(e) =&gt; setSelectedEventIndex(Number(e.target.value))}</w:t>
+        <w:br/>
+        <w:t xml:space="preserve">            style={{</w:t>
+        <w:br/>
+        <w:t xml:space="preserve">              background: '#0a0f1c',</w:t>
+        <w:br/>
+        <w:t xml:space="preserve">              border: '1px solid rgba(0, 210, 255, 0.3)',</w:t>
+        <w:br/>
+        <w:t xml:space="preserve">              color: '#ffffff',</w:t>
+        <w:br/>
+        <w:t xml:space="preserve">              padding: '0.45rem 0.75rem',</w:t>
+        <w:br/>
+        <w:t xml:space="preserve">              borderRadius: '0.6rem',</w:t>
+        <w:br/>
+        <w:t xml:space="preserve">              fontSize: '0.85rem',</w:t>
+        <w:br/>
+        <w:t xml:space="preserve">              fontWeight: 600</w:t>
+        <w:br/>
+        <w:t xml:space="preserve">            }}</w:t>
+        <w:br/>
+        <w:t xml:space="preserve">          &gt;</w:t>
+        <w:br/>
+        <w:t xml:space="preserve">            {sedeEvents.map((ev, idx) =&gt; {</w:t>
+        <w:br/>
+        <w:t xml:space="preserve">              const d = new Date(ev.start);</w:t>
+        <w:br/>
+        <w:t xml:space="preserve">              return (</w:t>
+        <w:br/>
+        <w:t xml:space="preserve">                &lt;option key={idx} value={idx}&gt;</w:t>
+        <w:br/>
+        <w:t xml:space="preserve">                  {`Equipo #${ev.equipo || (idx + 1)} — ${d.toLocaleDateString('es-ES', { day: 'numeric', month: 'short', year: 'numeric' })} ${ev.entrenador ? `(${ev.entrenador})` : ''}`}</w:t>
+        <w:br/>
+        <w:t xml:space="preserve">                &lt;/option&gt;</w:t>
+        <w:br/>
+        <w:t xml:space="preserve">              );</w:t>
+        <w:br/>
+        <w:t xml:space="preserve">            })}</w:t>
+        <w:br/>
+        <w:t xml:space="preserve">          &lt;/select&gt;</w:t>
+        <w:br/>
+        <w:t xml:space="preserve">        &lt;/div&gt;</w:t>
+        <w:br/>
+        <w:t xml:space="preserve">      &lt;/div&gt;</w:t>
+        <w:br/>
+        <w:br/>
+        <w:t xml:space="preserve">      {/* PESTAÑAS: TODOS / TAREAS OPERATIVAS / RETOS COLECTIVOS */}</w:t>
+        <w:br/>
+        <w:t xml:space="preserve">      &lt;div style={{ display: 'flex', gap: '0.75rem', marginBottom: '1.25rem', borderBottom: '1px solid rgba(255,255,255,0.1)', paddingBottom: '0.75rem' }}&gt;</w:t>
+        <w:br/>
+        <w:t xml:space="preserve">        &lt;button</w:t>
+        <w:br/>
+        <w:t xml:space="preserve">          onClick={() =&gt; setActiveTab('ALL')}</w:t>
+        <w:br/>
+        <w:t xml:space="preserve">          style={{</w:t>
+        <w:br/>
+        <w:t xml:space="preserve">            background: activeTab === 'ALL' ? 'rgba(0, 210, 255, 0.2)' : 'transparent',</w:t>
+        <w:br/>
+        <w:t xml:space="preserve">            border: activeTab === 'ALL' ? '1px solid #00d2ff' : '1px solid transparent',</w:t>
+        <w:br/>
+        <w:t xml:space="preserve">            color: activeTab === 'ALL' ? '#00d2ff' : '#9ca3af',</w:t>
+        <w:br/>
+        <w:t xml:space="preserve">            padding: '0.5rem 1rem',</w:t>
+        <w:br/>
+        <w:t xml:space="preserve">            borderRadius: '0.5rem',</w:t>
+        <w:br/>
+        <w:t xml:space="preserve">            fontWeight: 800,</w:t>
+        <w:br/>
+        <w:t xml:space="preserve">            fontSize: '0.85rem',</w:t>
+        <w:br/>
+        <w:t xml:space="preserve">            cursor: 'pointer'</w:t>
+        <w:br/>
+        <w:t xml:space="preserve">          }}</w:t>
+        <w:br/>
+        <w:t xml:space="preserve">        &gt;</w:t>
+        <w:br/>
+        <w:t xml:space="preserve">          📋 TODAS ({computedItems.length})</w:t>
+        <w:br/>
+        <w:t xml:space="preserve">        &lt;/button&gt;</w:t>
+        <w:br/>
+        <w:t xml:space="preserve">        &lt;button</w:t>
+        <w:br/>
+        <w:t xml:space="preserve">          onClick={() =&gt; setActiveTab('RETOS')}</w:t>
+        <w:br/>
+        <w:t xml:space="preserve">          style={{</w:t>
+        <w:br/>
+        <w:t xml:space="preserve">            background: activeTab === 'RETOS' ? 'rgba(255, 183, 3, 0.2)' : 'transparent',</w:t>
+        <w:br/>
+        <w:t xml:space="preserve">            border: activeTab === 'RETOS' ? '1px solid #ffb703' : '1px solid transparent',</w:t>
+        <w:br/>
+        <w:t xml:space="preserve">            color: activeTab === 'RETOS' ? '#ffb703' : '#9ca3af',</w:t>
+        <w:br/>
+        <w:t xml:space="preserve">            padding: '0.5rem 1rem',</w:t>
+        <w:br/>
+        <w:t xml:space="preserve">            borderRadius: '0.5rem',</w:t>
+        <w:br/>
+        <w:t xml:space="preserve">            fontWeight: 800,</w:t>
+        <w:br/>
+        <w:t xml:space="preserve">            fontSize: '0.85rem',</w:t>
+        <w:br/>
+        <w:t xml:space="preserve">            cursor: 'pointer'</w:t>
+        <w:br/>
+        <w:t xml:space="preserve">          }}</w:t>
+        <w:br/>
+        <w:t xml:space="preserve">        &gt;</w:t>
+        <w:br/>
+        <w:t xml:space="preserve">          🏆 RETOS EN CONJUNTO DEL EQUIPO ({computedItems.filter(i =&gt; i.tipo === 'RETO_EQUIPO').length})</w:t>
+        <w:br/>
+        <w:t xml:space="preserve">        &lt;/button&gt;</w:t>
+        <w:br/>
+        <w:t xml:space="preserve">        &lt;button</w:t>
+        <w:br/>
+        <w:t xml:space="preserve">          onClick={() =&gt; setActiveTab('TAREAS')}</w:t>
+        <w:br/>
+        <w:t xml:space="preserve">          style={{</w:t>
+        <w:br/>
+        <w:t xml:space="preserve">            background: activeTab === 'TAREAS' ? 'rgba(0, 210, 255, 0.2)' : 'transparent',</w:t>
+        <w:br/>
+        <w:t xml:space="preserve">            border: activeTab === 'TAREAS' ? '1px solid #00d2ff' : '1px solid transparent',</w:t>
+        <w:br/>
+        <w:t xml:space="preserve">            color: activeTab === 'TAREAS' ? '#00d2ff' : '#9ca3af',</w:t>
+        <w:br/>
+        <w:t xml:space="preserve">            padding: '0.5rem 1rem',</w:t>
+        <w:br/>
+        <w:t xml:space="preserve">            borderRadius: '0.5rem',</w:t>
+        <w:br/>
+        <w:t xml:space="preserve">            fontWeight: 800,</w:t>
+        <w:br/>
+        <w:t xml:space="preserve">            fontSize: '0.85rem',</w:t>
+        <w:br/>
+        <w:t xml:space="preserve">            cursor: 'pointer'</w:t>
+        <w:br/>
+        <w:t xml:space="preserve">          }}</w:t>
+        <w:br/>
+        <w:t xml:space="preserve">        &gt;</w:t>
+        <w:br/>
+        <w:t xml:space="preserve">          ⚙️ TAREAS DE SALA ({computedItems.filter(i =&gt; i.tipo === 'TAREA').length})</w:t>
+        <w:br/>
+        <w:t xml:space="preserve">        &lt;/button&gt;</w:t>
+        <w:br/>
+        <w:t xml:space="preserve">      &lt;/div&gt;</w:t>
+        <w:br/>
+        <w:br/>
+        <w:t xml:space="preserve">      {/* BARRA DE PROGRESO GLOBAL */}</w:t>
+        <w:br/>
+        <w:t xml:space="preserve">      &lt;div className="glass-panel" style={{ padding: '1rem 1.5rem', borderRadius: '1rem', marginBottom: '1.5rem' }}&gt;</w:t>
+        <w:br/>
+        <w:t xml:space="preserve">        &lt;div style={{ display: 'flex', justifyContent: 'space-between', alignItems: 'center', marginBottom: '0.5rem' }}&gt;</w:t>
+        <w:br/>
+        <w:t xml:space="preserve">          &lt;span style={{ fontSize: '0.85rem', fontWeight: 800, textTransform: 'uppercase', letterSpacing: '1px', color: '#e5e7eb' }}&gt;</w:t>
+        <w:br/>
+        <w:t xml:space="preserve">            Progreso del Equipo: &lt;span style={{ color: '#00d2ff' }}&gt;{completedCount} de {totalCount} completadas&lt;/span&gt;</w:t>
+        <w:br/>
+        <w:t xml:space="preserve">          &lt;/span&gt;</w:t>
+        <w:br/>
+        <w:t xml:space="preserve">          &lt;span style={{ fontSize: '1rem', fontWeight: 900, color: progressPct === 100 ? '#4ade80' : 'var(--crear-gold, #ffb703)' }}&gt;</w:t>
+        <w:br/>
+        <w:t xml:space="preserve">            {progressPct}%</w:t>
+        <w:br/>
+        <w:t xml:space="preserve">          &lt;/span&gt;</w:t>
+        <w:br/>
+        <w:t xml:space="preserve">        &lt;/div&gt;</w:t>
+        <w:br/>
+        <w:t xml:space="preserve">        &lt;div style={{ width: '100%', height: '8px', background: 'rgba(255,255,255,0.08)', borderRadius: '9999px', overflow: 'hidden' }}&gt;</w:t>
+        <w:br/>
+        <w:t xml:space="preserve">          &lt;div style={{ width: `${progressPct}%`, height: '100%', background: 'linear-gradient(90deg, #1a75bc, #00d2ff, #ffb703)', transition: 'width 0.4s ease' }}&gt;&lt;/div&gt;</w:t>
+        <w:br/>
+        <w:t xml:space="preserve">        &lt;/div&gt;</w:t>
+        <w:br/>
+        <w:t xml:space="preserve">      &lt;/div&gt;</w:t>
+        <w:br/>
+        <w:br/>
+        <w:t xml:space="preserve">      {/* FILTROS DE FASE */}</w:t>
+        <w:br/>
+        <w:t xml:space="preserve">      &lt;div style={{ display: 'flex', flexWrap: 'wrap', gap: '0.5rem', marginBottom: '1.5rem' }}&gt;</w:t>
+        <w:br/>
+        <w:t xml:space="preserve">        {['TODAS', 'ANTES', 'DURANTE', 'DESPUÉS'].map(f =&gt; (</w:t>
+        <w:br/>
+        <w:t xml:space="preserve">          &lt;button</w:t>
+        <w:br/>
+        <w:t xml:space="preserve">            key={f}</w:t>
+        <w:br/>
+        <w:t xml:space="preserve">            onClick={() =&gt; setFilterFase(f)}</w:t>
+        <w:br/>
+        <w:t xml:space="preserve">            style={{</w:t>
+        <w:br/>
+        <w:t xml:space="preserve">              background: filterFase === f ? '#00d2ff' : 'rgba(255,255,255,0.06)',</w:t>
+        <w:br/>
+        <w:t xml:space="preserve">              color: filterFase === f ? '#030712' : '#d1d5db',</w:t>
+        <w:br/>
+        <w:t xml:space="preserve">              border: 'none',</w:t>
+        <w:br/>
+        <w:t xml:space="preserve">              padding: '0.35rem 0.75rem',</w:t>
+        <w:br/>
+        <w:t xml:space="preserve">              borderRadius: '0.5rem',</w:t>
+        <w:br/>
+        <w:t xml:space="preserve">              fontSize: '0.75rem',</w:t>
+        <w:br/>
+        <w:t xml:space="preserve">              fontWeight: 800,</w:t>
+        <w:br/>
+        <w:t xml:space="preserve">              cursor: 'pointer'</w:t>
+        <w:br/>
+        <w:t xml:space="preserve">            }}</w:t>
+        <w:br/>
+        <w:t xml:space="preserve">          &gt;</w:t>
+        <w:br/>
+        <w:t xml:space="preserve">            {f === 'TODAS' ? 'TODAS LAS FASES' : f === 'ANTES' ? '🔵 PRE-C1' : f === 'DURANTE' ? '⚡ DURANTE C1' : '🟢 POST-C1'}</w:t>
+        <w:br/>
+        <w:t xml:space="preserve">          &lt;/button&gt;</w:t>
+        <w:br/>
+        <w:t xml:space="preserve">        ))}</w:t>
+        <w:br/>
+        <w:t xml:space="preserve">      &lt;/div&gt;</w:t>
+        <w:br/>
+        <w:br/>
+        <w:t xml:space="preserve">      {/* LISTA DINÁMICA DE TAREAS Y RETOS */}</w:t>
+        <w:br/>
+        <w:t xml:space="preserve">      &lt;div style={{ display: 'grid', gap: '1rem' }}&gt;</w:t>
+        <w:br/>
+        <w:t xml:space="preserve">        {filteredItems.map((item) =&gt; {</w:t>
+        <w:br/>
+        <w:t xml:space="preserve">          const isReto = item.tipo === 'RETO_EQUIPO';</w:t>
+        <w:br/>
+        <w:t xml:space="preserve">          return (</w:t>
+        <w:br/>
+        <w:t xml:space="preserve">            &lt;div</w:t>
+        <w:br/>
+        <w:t xml:space="preserve">              key={item.id}</w:t>
+        <w:br/>
+        <w:t xml:space="preserve">              onClick={() =&gt; toggleTask(item.id)}</w:t>
+        <w:br/>
+        <w:t xml:space="preserve">              className="glass-panel"</w:t>
+        <w:br/>
+        <w:t xml:space="preserve">              style={{</w:t>
+        <w:br/>
+        <w:t xml:space="preserve">                padding: '1.25rem 1.5rem',</w:t>
+        <w:br/>
+        <w:t xml:space="preserve">                borderRadius: '1rem',</w:t>
+        <w:br/>
+        <w:t xml:space="preserve">                border: item.isCompleted</w:t>
+        <w:br/>
+        <w:t xml:space="preserve">                  ? '1px solid rgba(74, 222, 128, 0.4)'</w:t>
+        <w:br/>
+        <w:t xml:space="preserve">                  : isReto</w:t>
+        <w:br/>
+        <w:t xml:space="preserve">                  ? '1px solid rgba(255, 183, 3, 0.45)'</w:t>
+        <w:br/>
+        <w:t xml:space="preserve">                  : item.status === 'OVERDUE'</w:t>
+        <w:br/>
+        <w:t xml:space="preserve">                  ? '1px solid rgba(239, 68, 68, 0.45)'</w:t>
+        <w:br/>
+        <w:t xml:space="preserve">                  : item.status === 'TODAY'</w:t>
+        <w:br/>
+        <w:t xml:space="preserve">                  ? '1px solid rgba(255, 183, 3, 0.55)'</w:t>
+        <w:br/>
+        <w:t xml:space="preserve">                  : '1px solid rgba(255, 255, 255, 0.1)',</w:t>
+        <w:br/>
+        <w:t xml:space="preserve">                background: item.isCompleted</w:t>
+        <w:br/>
+        <w:t xml:space="preserve">                  ? 'rgba(74, 222, 128, 0.04)'</w:t>
+        <w:br/>
+        <w:t xml:space="preserve">                  : isReto</w:t>
+        <w:br/>
+        <w:t xml:space="preserve">                  ? 'rgba(255, 183, 3, 0.04)'</w:t>
+        <w:br/>
+        <w:t xml:space="preserve">                  : 'rgba(11, 19, 41, 0.65)',</w:t>
+        <w:br/>
+        <w:t xml:space="preserve">                cursor: 'pointer',</w:t>
+        <w:br/>
+        <w:t xml:space="preserve">                transition: 'all 0.2s ease',</w:t>
+        <w:br/>
+        <w:t xml:space="preserve">                display: 'flex',</w:t>
+        <w:br/>
+        <w:t xml:space="preserve">                gap: '1.25rem',</w:t>
+        <w:br/>
+        <w:t xml:space="preserve">                alignItems: 'flex-start'</w:t>
+        <w:br/>
+        <w:t xml:space="preserve">              }}</w:t>
+        <w:br/>
+        <w:t xml:space="preserve">            &gt;</w:t>
+        <w:br/>
+        <w:t xml:space="preserve">              &lt;div style={{ paddingTop: '0.2rem' }}&gt;</w:t>
+        <w:br/>
+        <w:t xml:space="preserve">                &lt;input</w:t>
+        <w:br/>
+        <w:t xml:space="preserve">                  type="checkbox"</w:t>
+        <w:br/>
+        <w:t xml:space="preserve">                  checked={item.isCompleted}</w:t>
+        <w:br/>
+        <w:t xml:space="preserve">                  onChange={() =&gt; {}}</w:t>
+        <w:br/>
+        <w:t xml:space="preserve">                  style={{ width: '20px', height: '20px', accentColor: '#00d2ff', cursor: 'pointer' }}</w:t>
+        <w:br/>
+        <w:t xml:space="preserve">                /&gt;</w:t>
+        <w:br/>
+        <w:t xml:space="preserve">              &lt;/div&gt;</w:t>
+        <w:br/>
+        <w:br/>
+        <w:t xml:space="preserve">              &lt;div style={{ flex: 1 }}&gt;</w:t>
+        <w:br/>
+        <w:t xml:space="preserve">                &lt;div style={{ display: 'flex', flexWrap: 'wrap', justifyContent: 'space-between', alignItems: 'center', gap: '0.5rem', marginBottom: '0.4rem' }}&gt;</w:t>
+        <w:br/>
+        <w:t xml:space="preserve">                  &lt;div style={{ display: 'flex', alignItems: 'center', gap: '0.6rem', flexWrap: 'wrap' }}&gt;</w:t>
+        <w:br/>
+        <w:t xml:space="preserve">                    &lt;span</w:t>
+        <w:br/>
+        <w:t xml:space="preserve">                      style={{</w:t>
+        <w:br/>
+        <w:t xml:space="preserve">                        fontSize: '0.65rem',</w:t>
+        <w:br/>
+        <w:t xml:space="preserve">                        fontWeight: 800,</w:t>
+        <w:br/>
+        <w:t xml:space="preserve">                        padding: '0.2rem 0.5rem',</w:t>
+        <w:br/>
+        <w:t xml:space="preserve">                        borderRadius: '0.35rem',</w:t>
+        <w:br/>
+        <w:t xml:space="preserve">                        textTransform: 'uppercase',</w:t>
+        <w:br/>
+        <w:t xml:space="preserve">                        background: isReto ? 'rgba(255, 183, 3, 0.2)' : 'rgba(0, 210, 255, 0.15)',</w:t>
+        <w:br/>
+        <w:t xml:space="preserve">                        color: isReto ? '#ffb703' : '#00d2ff',</w:t>
+        <w:br/>
+        <w:t xml:space="preserve">                        border: isReto ? '1px solid rgba(255,183,3,0.4)' : '1px solid rgba(0,210,255,0.3)'</w:t>
+        <w:br/>
+        <w:t xml:space="preserve">                      }}</w:t>
+        <w:br/>
+        <w:t xml:space="preserve">                    &gt;</w:t>
+        <w:br/>
+        <w:t xml:space="preserve">                      {isReto ? '🏆 RETO COLECTIVO' : item.fase}</w:t>
+        <w:br/>
+        <w:t xml:space="preserve">                    &lt;/span&gt;</w:t>
+        <w:br/>
+        <w:t xml:space="preserve">                    &lt;h3 style={{</w:t>
+        <w:br/>
+        <w:t xml:space="preserve">                      fontSize: '1rem',</w:t>
+        <w:br/>
+        <w:t xml:space="preserve">                      fontWeight: 800,</w:t>
+        <w:br/>
+        <w:t xml:space="preserve">                      margin: 0,</w:t>
+        <w:br/>
+        <w:t xml:space="preserve">                      color: item.isCompleted ? '#9ca3af' : '#ffffff',</w:t>
+        <w:br/>
+        <w:t xml:space="preserve">                      textDecoration: item.isCompleted ? 'line-through' : 'none'</w:t>
+        <w:br/>
+        <w:t xml:space="preserve">                    }}&gt;</w:t>
+        <w:br/>
+        <w:t xml:space="preserve">                      {item.titulo}</w:t>
+        <w:br/>
+        <w:t xml:space="preserve">                    &lt;/h3&gt;</w:t>
+        <w:br/>
+        <w:t xml:space="preserve">                  &lt;/div&gt;</w:t>
+        <w:br/>
+        <w:br/>
+        <w:t xml:space="preserve">                  &lt;div style={{ display: 'flex', alignItems: 'center', gap: '0.5rem' }}&gt;</w:t>
+        <w:br/>
+        <w:t xml:space="preserve">                    &lt;span style={{</w:t>
+        <w:br/>
+        <w:t xml:space="preserve">                      fontSize: '0.7rem',</w:t>
+        <w:br/>
+        <w:t xml:space="preserve">                      fontWeight: 800,</w:t>
+        <w:br/>
+        <w:t xml:space="preserve">                      padding: '0.2rem 0.6rem',</w:t>
+        <w:br/>
+        <w:t xml:space="preserve">                      borderRadius: '9999px',</w:t>
+        <w:br/>
+        <w:t xml:space="preserve">                      background: item.isCompleted ? 'rgba(74, 222, 128, 0.15)' : item.status === 'OVERDUE' ? 'rgba(239, 68, 68, 0.2)' : 'rgba(255, 255, 255, 0.08)',</w:t>
+        <w:br/>
+        <w:t xml:space="preserve">                      color: item.isCompleted ? '#4ade80' : item.status === 'OVERDUE' ? '#f87171' : '#9ca3af'</w:t>
+        <w:br/>
+        <w:t xml:space="preserve">                    }}&gt;</w:t>
+        <w:br/>
+        <w:t xml:space="preserve">                      {item.isCompleted ? '✓ COMPLETADO' : item.status === 'OVERDUE' ? '⚠️ VENCIDO' : 'PRÓXIMO'}</w:t>
+        <w:br/>
+        <w:t xml:space="preserve">                    &lt;/span&gt;</w:t>
+        <w:br/>
+        <w:t xml:space="preserve">                    &lt;span style={{ fontSize: '0.75rem', fontWeight: 700, color: '#00d2ff', fontFamily: 'monospace' }}&gt;</w:t>
+        <w:br/>
+        <w:t xml:space="preserve">                      🕒 {formatFechaLarga(item.deadlineDate)}</w:t>
+        <w:br/>
+        <w:t xml:space="preserve">                    &lt;/span&gt;</w:t>
+        <w:br/>
+        <w:t xml:space="preserve">                  &lt;/div&gt;</w:t>
+        <w:br/>
+        <w:t xml:space="preserve">                &lt;/div&gt;</w:t>
+        <w:br/>
+        <w:br/>
+        <w:t xml:space="preserve">                &lt;p style={{ fontSize: '0.85rem', color: '#cbd5e1', margin: '0.3rem 0 0.6rem', lineHeight: '1.5' }}&gt;</w:t>
+        <w:br/>
+        <w:t xml:space="preserve">                  {item.descripcion}</w:t>
+        <w:br/>
+        <w:t xml:space="preserve">                &lt;/p&gt;</w:t>
+        <w:br/>
+        <w:br/>
+        <w:t xml:space="preserve">                &lt;div style={{ display: 'flex', flexWrap: 'wrap', gap: '0.5rem', fontSize: '0.75rem', color: '#9ca3af' }}&gt;</w:t>
+        <w:br/>
+        <w:t xml:space="preserve">                  {item.metaColectiva &amp;&amp; (</w:t>
+        <w:br/>
+        <w:t xml:space="preserve">                    &lt;span style={{ background: 'rgba(255, 183, 3, 0.1)', color: '#ffb703', padding: '0.15rem 0.5rem', borderRadius: '0.3rem', border: '1px solid rgba(255, 183, 3, 0.25)' }}&gt;</w:t>
+        <w:br/>
+        <w:t xml:space="preserve">                      🎯 &lt;strong&gt;Meta de Equipo:&lt;/strong&gt; {item.metaColectiva}</w:t>
+        <w:br/>
+        <w:t xml:space="preserve">                    &lt;/span&gt;</w:t>
+        <w:br/>
+        <w:t xml:space="preserve">                  )}</w:t>
+        <w:br/>
+        <w:t xml:space="preserve">                  {item.puntosXP &amp;&amp; (</w:t>
+        <w:br/>
+        <w:t xml:space="preserve">                    &lt;span style={{ background: 'rgba(74, 222, 128, 0.1)', color: '#4ade80', padding: '0.15rem 0.5rem', borderRadius: '0.3rem' }}&gt;</w:t>
+        <w:br/>
+        <w:t xml:space="preserve">                      ⚡ {item.puntosXP}</w:t>
+        <w:br/>
+        <w:t xml:space="preserve">                    &lt;/span&gt;</w:t>
+        <w:br/>
+        <w:t xml:space="preserve">                  )}</w:t>
+        <w:br/>
+        <w:t xml:space="preserve">                  {item.rol &amp;&amp; (</w:t>
+        <w:br/>
+        <w:t xml:space="preserve">                    &lt;span style={{ background: 'rgba(255,255,255,0.05)', padding: '0.15rem 0.5rem', borderRadius: '0.3rem' }}&gt;</w:t>
+        <w:br/>
+        <w:t xml:space="preserve">                      👤 {item.rol}</w:t>
+        <w:br/>
+        <w:t xml:space="preserve">                    &lt;/span&gt;</w:t>
+        <w:br/>
+        <w:t xml:space="preserve">                  )}</w:t>
+        <w:br/>
+        <w:t xml:space="preserve">                &lt;/div&gt;</w:t>
+        <w:br/>
+        <w:t xml:space="preserve">              &lt;/div&gt;</w:t>
+        <w:br/>
+        <w:t xml:space="preserve">            &lt;/div&gt;</w:t>
+        <w:br/>
+        <w:t xml:space="preserve">          );</w:t>
+        <w:br/>
+        <w:t xml:space="preserve">        })}</w:t>
+        <w:br/>
+        <w:t xml:space="preserve">      &lt;/div&gt;</w:t>
+        <w:br/>
+        <w:br/>
+        <w:t xml:space="preserve">      {/* MODAL PARA CREAR NUEVA TAREA / RETO DE EQUIPO */}</w:t>
+        <w:br/>
+        <w:t xml:space="preserve">      {showNewTaskModal &amp;&amp; (</w:t>
+        <w:br/>
+        <w:t xml:space="preserve">        &lt;div style={{ position: 'fixed', inset: 0, background: 'rgba(0,0,0,0.85)', backdropFilter: 'blur(8px)', zIndex: 9999, display: 'flex', alignItems: 'center', justifyContent: 'center', padding: '1rem' }}&gt;</w:t>
+        <w:br/>
+        <w:t xml:space="preserve">          &lt;div className="glass-panel" style={{ maxWidth: '550px', width: '100%', padding: '2rem', borderRadius: '1.5rem', border: '1px solid #00d2ff' }}&gt;</w:t>
+        <w:br/>
+        <w:t xml:space="preserve">            &lt;div style={{ display: 'flex', justifyContent: 'space-between', alignItems: 'center', marginBottom: '1.5rem' }}&gt;</w:t>
+        <w:br/>
+        <w:t xml:space="preserve">              &lt;h2 style={{ fontSize: '1.3rem', fontWeight: 900, margin: 0, color: '#ffffff' }}&gt;</w:t>
+        <w:br/>
+        <w:t xml:space="preserve">                🚀 Crear Tarea o Reto de Equipo</w:t>
+        <w:br/>
+        <w:t xml:space="preserve">              &lt;/h2&gt;</w:t>
+        <w:br/>
+        <w:t xml:space="preserve">              &lt;button onClick={() =&gt; setShowNewTaskModal(false)} style={{ background: 'none', border: 'none', color: '#9ca3af', fontSize: '1.5rem', cursor: 'pointer' }}&gt;✕&lt;/button&gt;</w:t>
+        <w:br/>
+        <w:t xml:space="preserve">            &lt;/div&gt;</w:t>
+        <w:br/>
+        <w:br/>
+        <w:t xml:space="preserve">            &lt;form onSubmit={handleCreateNewItem} style={{ display: 'flex', flexDirection: 'column', gap: '1rem' }}&gt;</w:t>
+        <w:br/>
+        <w:t xml:space="preserve">              &lt;div&gt;</w:t>
+        <w:br/>
+        <w:t xml:space="preserve">                &lt;label style={{ display: 'block', fontSize: '0.75rem', fontWeight: 800, color: '#9ca3af', marginBottom: '0.3rem' }}&gt;TIPO:&lt;/label&gt;</w:t>
+        <w:br/>
+        <w:t xml:space="preserve">                &lt;div style={{ display: 'flex', gap: '0.5rem' }}&gt;</w:t>
+        <w:br/>
+        <w:t xml:space="preserve">                  &lt;button</w:t>
+        <w:br/>
+        <w:t xml:space="preserve">                    type="button"</w:t>
+        <w:br/>
+        <w:t xml:space="preserve">                    onClick={() =&gt; setNewItemForm({ ...newItemForm, tipo: 'RETO_EQUIPO' })}</w:t>
+        <w:br/>
+        <w:t xml:space="preserve">                    style={{ flex: 1, padding: '0.5rem', borderRadius: '0.5rem', background: newItemForm.tipo === 'RETO_EQUIPO' ? '#ffb703' : 'rgba(255,255,255,0.05)', color: newItemForm.tipo === 'RETO_EQUIPO' ? '#000' : '#fff', fontWeight: 800, border: 'none', cursor: 'pointer' }}</w:t>
+        <w:br/>
+        <w:t xml:space="preserve">                  &gt;</w:t>
+        <w:br/>
+        <w:t xml:space="preserve">                    🏆 RETO COLECTIVO</w:t>
+        <w:br/>
+        <w:t xml:space="preserve">                  &lt;/button&gt;</w:t>
+        <w:br/>
+        <w:t xml:space="preserve">                  &lt;button</w:t>
+        <w:br/>
+        <w:t xml:space="preserve">                    type="button"</w:t>
+        <w:br/>
+        <w:t xml:space="preserve">                    onClick={() =&gt; setNewItemForm({ ...newItemForm, tipo: 'TAREA' })}</w:t>
+        <w:br/>
+        <w:t xml:space="preserve">                    style={{ flex: 1, padding: '0.5rem', borderRadius: '0.5rem', background: newItemForm.tipo === 'TAREA' ? '#00d2ff' : 'rgba(255,255,255,0.05)', color: newItemForm.tipo === 'TAREA' ? '#000' : '#fff', fontWeight: 800, border: 'none', cursor: 'pointer' }}</w:t>
+        <w:br/>
+        <w:t xml:space="preserve">                  &gt;</w:t>
+        <w:br/>
+        <w:t xml:space="preserve">                    ⚙️ TAREA OPERATIVA</w:t>
+        <w:br/>
+        <w:t xml:space="preserve">                  &lt;/button&gt;</w:t>
+        <w:br/>
+        <w:t xml:space="preserve">                &lt;/div&gt;</w:t>
+        <w:br/>
+        <w:t xml:space="preserve">              &lt;/div&gt;</w:t>
+        <w:br/>
+        <w:br/>
+        <w:t xml:space="preserve">              &lt;div&gt;</w:t>
+        <w:br/>
+        <w:t xml:space="preserve">                &lt;label style={{ display: 'block', fontSize: '0.75rem', fontWeight: 800, color: '#9ca3af', marginBottom: '0.3rem' }}&gt;TÍTULO DE LA META O TAREA:&lt;/label&gt;</w:t>
+        <w:br/>
+        <w:t xml:space="preserve">                &lt;input</w:t>
+        <w:br/>
+        <w:t xml:space="preserve">                  type="text"</w:t>
+        <w:br/>
+        <w:t xml:space="preserve">                  required</w:t>
+        <w:br/>
+        <w:t xml:space="preserve">                  placeholder="Ej: Reto de Confirmación de Asistencia al 100%"</w:t>
+        <w:br/>
+        <w:t xml:space="preserve">                  value={newItemForm.titulo}</w:t>
+        <w:br/>
+        <w:t xml:space="preserve">                  onChange={e =&gt; setNewItemForm({ ...newItemForm, titulo: e.target.value })}</w:t>
+        <w:br/>
+        <w:t xml:space="preserve">                  style={{ width: '100%', padding: '0.75rem', borderRadius: '0.6rem', background: '#0a0f1c', border: '1px solid rgba(255,255,255,0.15)', color: '#fff' }}</w:t>
+        <w:br/>
+        <w:t xml:space="preserve">                /&gt;</w:t>
+        <w:br/>
+        <w:t xml:space="preserve">              &lt;/div&gt;</w:t>
+        <w:br/>
+        <w:br/>
+        <w:t xml:space="preserve">              &lt;div&gt;</w:t>
+        <w:br/>
+        <w:t xml:space="preserve">                &lt;label style={{ display: 'block', fontSize: '0.75rem', fontWeight: 800, color: '#9ca3af', marginBottom: '0.3rem' }}&gt;DESCRIPCIÓN / PROPÓSITO:&lt;/label&gt;</w:t>
+        <w:br/>
+        <w:t xml:space="preserve">                &lt;textarea</w:t>
+        <w:br/>
+        <w:t xml:space="preserve">                  rows="2"</w:t>
+        <w:br/>
+        <w:t xml:space="preserve">                  placeholder="Explica el acuerdo o la meta que debe cumplir el equipo..."</w:t>
+        <w:br/>
+        <w:t xml:space="preserve">                  value={newItemForm.descripcion}</w:t>
+        <w:br/>
+        <w:t xml:space="preserve">                  onChange={e =&gt; setNewItemForm({ ...newItemForm, descripcion: e.target.value })}</w:t>
+        <w:br/>
+        <w:t xml:space="preserve">                  style={{ width: '100%', padding: '0.75rem', borderRadius: '0.6rem', background: '#0a0f1c', border: '1px solid rgba(255,255,255,0.15)', color: '#fff', resize: 'none' }}</w:t>
+        <w:br/>
+        <w:t xml:space="preserve">                /&gt;</w:t>
+        <w:br/>
+        <w:t xml:space="preserve">              &lt;/div&gt;</w:t>
+        <w:br/>
+        <w:br/>
+        <w:t xml:space="preserve">              &lt;div style={{ display: 'grid', gridTemplateColumns: '1fr 1fr', gap: '0.75rem' }}&gt;</w:t>
+        <w:br/>
+        <w:t xml:space="preserve">                &lt;div&gt;</w:t>
+        <w:br/>
+        <w:t xml:space="preserve">                  &lt;label style={{ display: 'block', fontSize: '0.75rem', fontWeight: 800, color: '#9ca3af', marginBottom: '0.3rem' }}&gt;MOMENTO / FASE:&lt;/label&gt;</w:t>
+        <w:br/>
+        <w:t xml:space="preserve">                  &lt;select</w:t>
+        <w:br/>
+        <w:t xml:space="preserve">                    value={newItemForm.fase}</w:t>
+        <w:br/>
+        <w:t xml:space="preserve">                    onChange={e =&gt; {</w:t>
+        <w:br/>
+        <w:t xml:space="preserve">                      const f = e.target.value;</w:t>
+        <w:br/>
+        <w:t xml:space="preserve">                      setNewItemForm({ ...newItemForm, fase: f, offsetDays: f === 'ANTES' ? -1 : f === 'DURANTE' ? 0 : 3 });</w:t>
+        <w:br/>
+        <w:t xml:space="preserve">                    }}</w:t>
+        <w:br/>
+        <w:t xml:space="preserve">                    style={{ width: '100%', padding: '0.75rem', borderRadius: '0.6rem', background: '#0a0f1c', border: '1px solid rgba(255,255,255,0.15)', color: '#fff' }}</w:t>
+        <w:br/>
+        <w:t xml:space="preserve">                  &gt;</w:t>
+        <w:br/>
+        <w:t xml:space="preserve">                    &lt;option value="ANTES"&gt;Pre-C1 (Antes del Viernes)&lt;/option&gt;</w:t>
+        <w:br/>
+        <w:t xml:space="preserve">                    &lt;option value="DURANTE"&gt;Durante C1 (Viernes/Sábado/Domingo)&lt;/option&gt;</w:t>
+        <w:br/>
+        <w:t xml:space="preserve">                    &lt;option value="DESPUÉS"&gt;Post-C1 (Reencuentro / Cierre)&lt;/option&gt;</w:t>
+        <w:br/>
+        <w:t xml:space="preserve">                  &lt;/select&gt;</w:t>
+        <w:br/>
+        <w:t xml:space="preserve">                &lt;/div&gt;</w:t>
+        <w:br/>
+        <w:br/>
+        <w:t xml:space="preserve">                &lt;div&gt;</w:t>
+        <w:br/>
+        <w:t xml:space="preserve">                  &lt;label style={{ display: 'block', fontSize: '0.75rem', fontWeight: 800, color: '#9ca3af', marginBottom: '0.3rem' }}&gt;HORA DEADLINE:&lt;/label&gt;</w:t>
+        <w:br/>
+        <w:t xml:space="preserve">                  &lt;input</w:t>
+        <w:br/>
+        <w:t xml:space="preserve">                    type="time"</w:t>
+        <w:br/>
+        <w:t xml:space="preserve">                    value={newItemForm.time}</w:t>
+        <w:br/>
+        <w:t xml:space="preserve">                    onChange={e =&gt; setNewItemForm({ ...newItemForm, time: e.target.value })}</w:t>
+        <w:br/>
+        <w:t xml:space="preserve">                    style={{ width: '100%', padding: '0.75rem', borderRadius: '0.6rem', background: '#0a0f1c', border: '1px solid rgba(255,255,255,0.15)', color: '#fff' }}</w:t>
+        <w:br/>
+        <w:t xml:space="preserve">                  /&gt;</w:t>
+        <w:br/>
+        <w:t xml:space="preserve">                &lt;/div&gt;</w:t>
+        <w:br/>
+        <w:t xml:space="preserve">              &lt;/div&gt;</w:t>
+        <w:br/>
+        <w:br/>
+        <w:t xml:space="preserve">              {newItemForm.tipo === 'RETO_EQUIPO' ? (</w:t>
+        <w:br/>
+        <w:t xml:space="preserve">                &lt;div&gt;</w:t>
+        <w:br/>
+        <w:t xml:space="preserve">                  &lt;label style={{ display: 'block', fontSize: '0.75rem', fontWeight: 800, color: '#ffb703', marginBottom: '0.3rem' }}&gt;META CUANTIFICABLE DE EQUIPO:&lt;/label&gt;</w:t>
+        <w:br/>
+        <w:t xml:space="preserve">                  &lt;input</w:t>
+        <w:br/>
+        <w:t xml:space="preserve">                    type="text"</w:t>
+        <w:br/>
+        <w:t xml:space="preserve">                    placeholder="Ej: 100% de llamadas realizadas"</w:t>
+        <w:br/>
+        <w:t xml:space="preserve">                    value={newItemForm.metaColectiva}</w:t>
+        <w:br/>
+        <w:t xml:space="preserve">                    onChange={e =&gt; setNewItemForm({ ...newItemForm, metaColectiva: e.target.value })}</w:t>
+        <w:br/>
+        <w:t xml:space="preserve">                    style={{ width: '100%', padding: '0.75rem', borderRadius: '0.6rem', background: '#0a0f1c', border: '1px solid rgba(255,183,3,0.3)', color: '#fff' }}</w:t>
+        <w:br/>
+        <w:t xml:space="preserve">                  /&gt;</w:t>
+        <w:br/>
+        <w:t xml:space="preserve">                &lt;/div&gt;</w:t>
+        <w:br/>
+        <w:t xml:space="preserve">              ) : (</w:t>
+        <w:br/>
+        <w:t xml:space="preserve">                &lt;div&gt;</w:t>
+        <w:br/>
+        <w:t xml:space="preserve">                  &lt;label style={{ display: 'block', fontSize: '0.75rem', fontWeight: 800, color: '#00d2ff', marginBottom: '0.3rem' }}&gt;ENTREGABLE / RESULTADO:&lt;/label&gt;</w:t>
+        <w:br/>
+        <w:t xml:space="preserve">                  &lt;input</w:t>
+        <w:br/>
+        <w:t xml:space="preserve">                    type="text"</w:t>
+        <w:br/>
+        <w:t xml:space="preserve">                    placeholder="Ej: Acta de sala firmada"</w:t>
+        <w:br/>
+        <w:t xml:space="preserve">                    value={newItemForm.entregable}</w:t>
+        <w:br/>
+        <w:t xml:space="preserve">                    onChange={e =&gt; setNewItemForm({ ...newItemForm, entregable: e.target.value })}</w:t>
+        <w:br/>
+        <w:t xml:space="preserve">                    style={{ width: '100%', padding: '0.75rem', borderRadius: '0.6rem', background: '#0a0f1c', border: '1px solid rgba(0,210,255,0.3)', color: '#fff' }}</w:t>
+        <w:br/>
+        <w:t xml:space="preserve">                  /&gt;</w:t>
+        <w:br/>
+        <w:t xml:space="preserve">                &lt;/div&gt;</w:t>
+        <w:br/>
+        <w:t xml:space="preserve">              )}</w:t>
+        <w:br/>
+        <w:br/>
+        <w:t xml:space="preserve">              &lt;div style={{ display: 'flex', gap: '0.75rem', marginTop: '1rem' }}&gt;</w:t>
+        <w:br/>
+        <w:t xml:space="preserve">                &lt;button</w:t>
+        <w:br/>
+        <w:t xml:space="preserve">                  type="button"</w:t>
+        <w:br/>
+        <w:t xml:space="preserve">                  onClick={() =&gt; setShowNewTaskModal(false)}</w:t>
+        <w:br/>
+        <w:t xml:space="preserve">                  style={{ flex: 1, padding: '0.75rem', borderRadius: '0.6rem', background: 'rgba(255,255,255,0.1)', color: '#fff', border: 'none', cursor: 'pointer', fontWeight: 700 }}</w:t>
+        <w:br/>
+        <w:t xml:space="preserve">                &gt;</w:t>
+        <w:br/>
+        <w:t xml:space="preserve">                  Cancelar</w:t>
+        <w:br/>
+        <w:t xml:space="preserve">                &lt;/button&gt;</w:t>
+        <w:br/>
+        <w:t xml:space="preserve">                &lt;button</w:t>
+        <w:br/>
+        <w:t xml:space="preserve">                  type="submit"</w:t>
+        <w:br/>
+        <w:t xml:space="preserve">                  style={{ flex: 1, padding: '0.75rem', borderRadius: '0.6rem', background: '#00d2ff', color: '#000', border: 'none', cursor: 'pointer', fontWeight: 900 }}</w:t>
+        <w:br/>
+        <w:t xml:space="preserve">                &gt;</w:t>
+        <w:br/>
+        <w:t xml:space="preserve">                  GUARDAR META</w:t>
+        <w:br/>
+        <w:t xml:space="preserve">                &lt;/button&gt;</w:t>
+        <w:br/>
+        <w:t xml:space="preserve">              &lt;/div&gt;</w:t>
+        <w:br/>
+        <w:t xml:space="preserve">            &lt;/form&gt;</w:t>
+        <w:br/>
+        <w:t xml:space="preserve">          &lt;/div&gt;</w:t>
+        <w:br/>
+        <w:t xml:space="preserve">        &lt;/div&gt;</w:t>
+        <w:br/>
+        <w:t xml:space="preserve">      )}</w:t>
+        <w:br/>
+        <w:br/>
+        <w:t xml:space="preserve">    &lt;/div&gt;</w:t>
+        <w:br/>
+        <w:t xml:space="preserve">  );</w:t>
+        <w:br/>
+        <w:t>}</w:t>
+        <w:br/>
+      </w:r>
+    </w:p>
+    <w:p>
+      <w:r>
+        <w:br w:type="page"/>
+      </w:r>
+    </w:p>
+    <w:p>
+      <w:r>
+        <w:rPr>
+          <w:b/>
+          <w:sz w:val="28"/>
+        </w:rPr>
         <w:t>Archivo: src/services/ai.js</w:t>
       </w:r>
     </w:p>
@@ -14436,25 +16736,6 @@
         <w:t>};</w:t>
         <w:br/>
         <w:br/>
-        <w:t>export const updateTimeSpent = async (uid, additionalMinutes) =&gt; {</w:t>
-        <w:br/>
-        <w:t xml:space="preserve">  try {</w:t>
-        <w:br/>
-        <w:t xml:space="preserve">    const userRef = doc(db, 'users', uid);</w:t>
-        <w:br/>
-        <w:t xml:space="preserve">    await updateDoc(userRef, {</w:t>
-        <w:br/>
-        <w:t xml:space="preserve">      'progress.totalTimeSpent': increment(additionalMinutes)</w:t>
-        <w:br/>
-        <w:t xml:space="preserve">    });</w:t>
-        <w:br/>
-        <w:t xml:space="preserve">  } catch (error) {</w:t>
-        <w:br/>
-        <w:t xml:space="preserve">    console.warn("Firebase falló al actualizar tiempo de sesión", error);</w:t>
-        <w:br/>
-        <w:t xml:space="preserve">  }</w:t>
-        <w:br/>
-        <w:t>};</w:t>
         <w:br/>
         <w:br/>
         <w:t>// --- AUDITORÍA DE SESIONES ---</w:t>

</xml_diff>